<commit_message>
Reworded the robot repositioning radio button to improve clarity.
</commit_message>
<xml_diff>
--- a/documents/User_Guide.docx
+++ b/documents/User_Guide.docx
@@ -956,23 +956,7 @@
         <w:jc w:val="both"/>
       </w:pPr>
       <w:r>
-        <w:t xml:space="preserve">STORM-MSI also provides data processing capabilities, allowing data visualization, correction and exportation to three main formats through its interface. First, the </w:t>
-      </w:r>
-      <w:proofErr w:type="spellStart"/>
-      <w:r>
-        <w:t>mzML</w:t>
-      </w:r>
-      <w:proofErr w:type="spellEnd"/>
-      <w:r>
-        <w:t xml:space="preserve"> conversion acts as a gateway to the </w:t>
-      </w:r>
-      <w:proofErr w:type="spellStart"/>
-      <w:r>
-        <w:t>imZML</w:t>
-      </w:r>
-      <w:proofErr w:type="spellEnd"/>
-      <w:r>
-        <w:t xml:space="preserve"> format, which is commonly used in usual MSI data processing software.</w:t>
+        <w:t>STORM-MSI also provides data processing capabilities, allowing data visualization, correction and exportation to three main formats through its interface. First, the mzML conversion acts as a gateway to the imZML format, which is commonly used in usual MSI data processing software.</w:t>
       </w:r>
       <w:r>
         <w:t xml:space="preserve"> Data can also be exported as a </w:t>
@@ -1040,29 +1024,13 @@
         <w:jc w:val="both"/>
       </w:pPr>
       <w:r>
-        <w:t xml:space="preserve">STORM-MSI is distributed as both a compiled executable and a </w:t>
-      </w:r>
-      <w:proofErr w:type="spellStart"/>
-      <w:r>
-        <w:t>MatLab</w:t>
-      </w:r>
-      <w:proofErr w:type="spellEnd"/>
-      <w:r>
-        <w:t xml:space="preserve"> project. </w:t>
+        <w:t xml:space="preserve">STORM-MSI is distributed as both a compiled executable and a MatLab project. </w:t>
       </w:r>
       <w:r>
         <w:t xml:space="preserve">The executable can be run on any Windows 10 or newer machine, but has only been tested on x64 architectures. </w:t>
       </w:r>
       <w:r>
-        <w:t xml:space="preserve">STORM-MSI should also work on Linux theoretically since Linux is supported by </w:t>
-      </w:r>
-      <w:proofErr w:type="spellStart"/>
-      <w:r>
-        <w:t>MatLab</w:t>
-      </w:r>
-      <w:proofErr w:type="spellEnd"/>
-      <w:r>
-        <w:t xml:space="preserve">, however this has not been tested as of late. </w:t>
+        <w:t xml:space="preserve">STORM-MSI should also work on Linux theoretically since Linux is supported by MatLab, however this has not been tested as of late. </w:t>
       </w:r>
     </w:p>
     <w:p>
@@ -1096,15 +1064,7 @@
         <w:jc w:val="both"/>
       </w:pPr>
       <w:r>
-        <w:t xml:space="preserve">Since the executable cannot run scripts that have not been included at compilation, the addition of modules requires a </w:t>
-      </w:r>
-      <w:proofErr w:type="spellStart"/>
-      <w:r>
-        <w:t>MatLab</w:t>
-      </w:r>
-      <w:proofErr w:type="spellEnd"/>
-      <w:r>
-        <w:t xml:space="preserve"> license (Version </w:t>
+        <w:t xml:space="preserve">Since the executable cannot run scripts that have not been included at compilation, the addition of modules requires a MatLab license (Version </w:t>
       </w:r>
       <w:r>
         <w:rPr>
@@ -1126,15 +1086,7 @@
         <w:t xml:space="preserve"> </w:t>
       </w:r>
       <w:r>
-        <w:t xml:space="preserve">Here is the list of required </w:t>
-      </w:r>
-      <w:proofErr w:type="spellStart"/>
-      <w:r>
-        <w:t>MatLab</w:t>
-      </w:r>
-      <w:proofErr w:type="spellEnd"/>
-      <w:r>
-        <w:t xml:space="preserve"> modules: </w:t>
+        <w:t xml:space="preserve">Here is the list of required MatLab modules: </w:t>
       </w:r>
     </w:p>
     <w:p>
@@ -1384,7 +1336,100 @@
         <w:t>ata acquisition is a mos</w:t>
       </w:r>
       <w:r>
-        <w:t xml:space="preserve">tly linear and straightforward process. Below is an explanation of every setting in each panel of this part of the interface. </w:t>
+        <w:t>tly linear and straightforward process. Below is</w:t>
+      </w:r>
+      <w:r>
+        <w:t xml:space="preserve"> a det</w:t>
+      </w:r>
+      <w:r>
+        <w:t>a</w:t>
+      </w:r>
+      <w:r>
+        <w:t>iled</w:t>
+      </w:r>
+      <w:r>
+        <w:t xml:space="preserve"> explanation of every setting in each panel of this part of the interface. </w:t>
+      </w:r>
+      <w:r>
+        <w:t>It is recommended that the contents of each panel are sequentially reviewed before imaging.</w:t>
+      </w:r>
+    </w:p>
+    <w:p>
+      <w:pPr>
+        <w:pStyle w:val="ListParagraph"/>
+        <w:numPr>
+          <w:ilvl w:val="0"/>
+          <w:numId w:val="3"/>
+        </w:numPr>
+        <w:jc w:val="both"/>
+      </w:pPr>
+      <w:r>
+        <w:t>Mapping Mode panel</w:t>
+      </w:r>
+    </w:p>
+    <w:p>
+      <w:pPr>
+        <w:ind w:left="720"/>
+        <w:jc w:val="both"/>
+      </w:pPr>
+      <w:r>
+        <w:t>This panel allows you to chose between three imaging modes:</w:t>
+      </w:r>
+    </w:p>
+    <w:p>
+      <w:pPr>
+        <w:pStyle w:val="ListParagraph"/>
+        <w:numPr>
+          <w:ilvl w:val="0"/>
+          <w:numId w:val="2"/>
+        </w:numPr>
+        <w:jc w:val="both"/>
+      </w:pPr>
+      <w:r>
+        <w:t>Topography Only: Only records topographical information. The source and mass spectrometer are not required in this mode, but the depth sensor is compulsory to gather this information.</w:t>
+      </w:r>
+    </w:p>
+    <w:p>
+      <w:pPr>
+        <w:pStyle w:val="ListParagraph"/>
+        <w:numPr>
+          <w:ilvl w:val="0"/>
+          <w:numId w:val="2"/>
+        </w:numPr>
+        <w:jc w:val="both"/>
+      </w:pPr>
+      <w:r>
+        <w:t xml:space="preserve">2D-MSI: Conventional Mass Spectrometry Imaging analysis. Does not require a depth sensor to be connected. </w:t>
+      </w:r>
+    </w:p>
+    <w:p>
+      <w:pPr>
+        <w:pStyle w:val="ListParagraph"/>
+        <w:numPr>
+          <w:ilvl w:val="0"/>
+          <w:numId w:val="2"/>
+        </w:numPr>
+        <w:jc w:val="both"/>
+      </w:pPr>
+      <w:r>
+        <w:t xml:space="preserve">3D-MSI: </w:t>
+      </w:r>
+      <w:r>
+        <w:t xml:space="preserve">Mass Spectrometry Imaging analysis of topographically complex samples. Requires all four modular hardware components to be properly configured in the following steps. </w:t>
+      </w:r>
+    </w:p>
+    <w:p>
+      <w:pPr>
+        <w:jc w:val="both"/>
+      </w:pPr>
+      <w:r>
+        <w:t xml:space="preserve">For topography and 3D-MSI, the bottom radio button allows topographical corrections to be applied during imaging (“With repositioning”) or foregoes this step </w:t>
+      </w:r>
+      <w:r>
+        <w:t>to gain time during the analysis (“Fast Mapping”)</w:t>
+      </w:r>
+      <w:r>
+        <w:t>.</w:t>
       </w:r>
     </w:p>
     <w:p>
@@ -1539,6 +1584,95 @@
     </w:lvl>
   </w:abstractNum>
   <w:abstractNum w:abstractNumId="1" w15:restartNumberingAfterBreak="0">
+    <w:nsid w:val="4BDB49DB"/>
+    <w:multiLevelType w:val="hybridMultilevel"/>
+    <w:tmpl w:val="7A160A20"/>
+    <w:lvl w:ilvl="0" w:tplc="F854578E">
+      <w:start w:val="1"/>
+      <w:numFmt w:val="decimal"/>
+      <w:lvlText w:val="%1)"/>
+      <w:lvlJc w:val="left"/>
+      <w:pPr>
+        <w:ind w:left="1800" w:hanging="360"/>
+      </w:pPr>
+      <w:rPr>
+        <w:rFonts w:hint="default"/>
+      </w:rPr>
+    </w:lvl>
+    <w:lvl w:ilvl="1" w:tplc="04090019" w:tentative="1">
+      <w:start w:val="1"/>
+      <w:numFmt w:val="lowerLetter"/>
+      <w:lvlText w:val="%2."/>
+      <w:lvlJc w:val="left"/>
+      <w:pPr>
+        <w:ind w:left="2520" w:hanging="360"/>
+      </w:pPr>
+    </w:lvl>
+    <w:lvl w:ilvl="2" w:tplc="0409001B" w:tentative="1">
+      <w:start w:val="1"/>
+      <w:numFmt w:val="lowerRoman"/>
+      <w:lvlText w:val="%3."/>
+      <w:lvlJc w:val="right"/>
+      <w:pPr>
+        <w:ind w:left="3240" w:hanging="180"/>
+      </w:pPr>
+    </w:lvl>
+    <w:lvl w:ilvl="3" w:tplc="0409000F" w:tentative="1">
+      <w:start w:val="1"/>
+      <w:numFmt w:val="decimal"/>
+      <w:lvlText w:val="%4."/>
+      <w:lvlJc w:val="left"/>
+      <w:pPr>
+        <w:ind w:left="3960" w:hanging="360"/>
+      </w:pPr>
+    </w:lvl>
+    <w:lvl w:ilvl="4" w:tplc="04090019" w:tentative="1">
+      <w:start w:val="1"/>
+      <w:numFmt w:val="lowerLetter"/>
+      <w:lvlText w:val="%5."/>
+      <w:lvlJc w:val="left"/>
+      <w:pPr>
+        <w:ind w:left="4680" w:hanging="360"/>
+      </w:pPr>
+    </w:lvl>
+    <w:lvl w:ilvl="5" w:tplc="0409001B" w:tentative="1">
+      <w:start w:val="1"/>
+      <w:numFmt w:val="lowerRoman"/>
+      <w:lvlText w:val="%6."/>
+      <w:lvlJc w:val="right"/>
+      <w:pPr>
+        <w:ind w:left="5400" w:hanging="180"/>
+      </w:pPr>
+    </w:lvl>
+    <w:lvl w:ilvl="6" w:tplc="0409000F" w:tentative="1">
+      <w:start w:val="1"/>
+      <w:numFmt w:val="decimal"/>
+      <w:lvlText w:val="%7."/>
+      <w:lvlJc w:val="left"/>
+      <w:pPr>
+        <w:ind w:left="6120" w:hanging="360"/>
+      </w:pPr>
+    </w:lvl>
+    <w:lvl w:ilvl="7" w:tplc="04090019" w:tentative="1">
+      <w:start w:val="1"/>
+      <w:numFmt w:val="lowerLetter"/>
+      <w:lvlText w:val="%8."/>
+      <w:lvlJc w:val="left"/>
+      <w:pPr>
+        <w:ind w:left="6840" w:hanging="360"/>
+      </w:pPr>
+    </w:lvl>
+    <w:lvl w:ilvl="8" w:tplc="0409001B" w:tentative="1">
+      <w:start w:val="1"/>
+      <w:numFmt w:val="lowerRoman"/>
+      <w:lvlText w:val="%9."/>
+      <w:lvlJc w:val="right"/>
+      <w:pPr>
+        <w:ind w:left="7560" w:hanging="180"/>
+      </w:pPr>
+    </w:lvl>
+  </w:abstractNum>
+  <w:abstractNum w:abstractNumId="2" w15:restartNumberingAfterBreak="0">
     <w:nsid w:val="77C505ED"/>
     <w:multiLevelType w:val="hybridMultilevel"/>
     <w:tmpl w:val="9D847BBC"/>
@@ -1654,6 +1788,9 @@
     <w:abstractNumId w:val="0"/>
   </w:num>
   <w:num w:numId="2" w16cid:durableId="1077285924">
+    <w:abstractNumId w:val="2"/>
+  </w:num>
+  <w:num w:numId="3" w16cid:durableId="756291988">
     <w:abstractNumId w:val="1"/>
   </w:num>
 </w:numbering>

</xml_diff>

<commit_message>
Added an interaction between mode selection and topographical correction
</commit_message>
<xml_diff>
--- a/documents/User_Guide.docx
+++ b/documents/User_Guide.docx
@@ -1420,16 +1420,38 @@
     </w:p>
     <w:p>
       <w:pPr>
-        <w:jc w:val="both"/>
-      </w:pPr>
-      <w:r>
-        <w:t xml:space="preserve">For topography and 3D-MSI, the bottom radio button allows topographical corrections to be applied during imaging (“With repositioning”) or foregoes this step </w:t>
-      </w:r>
-      <w:r>
-        <w:t>to gain time during the analysis (“Fast Mapping”)</w:t>
+        <w:ind w:firstLine="360"/>
+        <w:jc w:val="both"/>
+      </w:pPr>
+      <w:r>
+        <w:t xml:space="preserve">For topography and 3D-MSI, </w:t>
+      </w:r>
+      <w:r>
+        <w:t>lower menu</w:t>
+      </w:r>
+      <w:r>
+        <w:t xml:space="preserve"> topographical corrections to be applied during imaging (“</w:t>
+      </w:r>
+      <w:r>
+        <w:t>Enabled</w:t>
+      </w:r>
+      <w:r>
+        <w:t xml:space="preserve">”) or foregoes this step </w:t>
+      </w:r>
+      <w:r>
+        <w:t>to gain time during the analysis (“</w:t>
+      </w:r>
+      <w:r>
+        <w:t>Disabled</w:t>
+      </w:r>
+      <w:r>
+        <w:t>”)</w:t>
       </w:r>
       <w:r>
         <w:t>.</w:t>
+      </w:r>
+      <w:r>
+        <w:t xml:space="preserve"> This menu does not impact anything for 2D-MSI</w:t>
       </w:r>
     </w:p>
     <w:p>

</xml_diff>

<commit_message>
A few more terminology changes to make hardware notions more universal. The documentation is still being worked on
</commit_message>
<xml_diff>
--- a/documents/User_Guide.docx
+++ b/documents/User_Guide.docx
@@ -956,7 +956,23 @@
         <w:jc w:val="both"/>
       </w:pPr>
       <w:r>
-        <w:t>STORM-MSI also provides data processing capabilities, allowing data visualization, correction and exportation to three main formats through its interface. First, the mzML conversion acts as a gateway to the imZML format, which is commonly used in usual MSI data processing software.</w:t>
+        <w:t xml:space="preserve">STORM-MSI also provides data processing capabilities, allowing data visualization, correction and exportation to three main formats through its interface. First, the </w:t>
+      </w:r>
+      <w:proofErr w:type="spellStart"/>
+      <w:r>
+        <w:t>mzML</w:t>
+      </w:r>
+      <w:proofErr w:type="spellEnd"/>
+      <w:r>
+        <w:t xml:space="preserve"> conversion acts as a gateway to the </w:t>
+      </w:r>
+      <w:proofErr w:type="spellStart"/>
+      <w:r>
+        <w:t>imZML</w:t>
+      </w:r>
+      <w:proofErr w:type="spellEnd"/>
+      <w:r>
+        <w:t xml:space="preserve"> format, which is commonly used in usual MSI data processing software.</w:t>
       </w:r>
       <w:r>
         <w:t xml:space="preserve"> Data can also be exported as a </w:t>
@@ -1024,13 +1040,29 @@
         <w:jc w:val="both"/>
       </w:pPr>
       <w:r>
-        <w:t xml:space="preserve">STORM-MSI is distributed as both a compiled executable and a MatLab project. </w:t>
+        <w:t xml:space="preserve">STORM-MSI is distributed as both a compiled executable and a </w:t>
+      </w:r>
+      <w:proofErr w:type="spellStart"/>
+      <w:r>
+        <w:t>MatLab</w:t>
+      </w:r>
+      <w:proofErr w:type="spellEnd"/>
+      <w:r>
+        <w:t xml:space="preserve"> project. </w:t>
       </w:r>
       <w:r>
         <w:t xml:space="preserve">The executable can be run on any Windows 10 or newer machine, but has only been tested on x64 architectures. </w:t>
       </w:r>
       <w:r>
-        <w:t xml:space="preserve">STORM-MSI should also work on Linux theoretically since Linux is supported by MatLab, however this has not been tested as of late. </w:t>
+        <w:t xml:space="preserve">STORM-MSI should also work on Linux theoretically since Linux is supported by </w:t>
+      </w:r>
+      <w:proofErr w:type="spellStart"/>
+      <w:r>
+        <w:t>MatLab</w:t>
+      </w:r>
+      <w:proofErr w:type="spellEnd"/>
+      <w:r>
+        <w:t xml:space="preserve">, however this has not been tested as of late. </w:t>
       </w:r>
     </w:p>
     <w:p>
@@ -1064,7 +1096,15 @@
         <w:jc w:val="both"/>
       </w:pPr>
       <w:r>
-        <w:t xml:space="preserve">Since the executable cannot run scripts that have not been included at compilation, the addition of modules requires a MatLab license (Version </w:t>
+        <w:t xml:space="preserve">Since the executable cannot run scripts that have not been included at compilation, the addition of modules requires a </w:t>
+      </w:r>
+      <w:proofErr w:type="spellStart"/>
+      <w:r>
+        <w:t>MatLab</w:t>
+      </w:r>
+      <w:proofErr w:type="spellEnd"/>
+      <w:r>
+        <w:t xml:space="preserve"> license (Version </w:t>
       </w:r>
       <w:r>
         <w:rPr>
@@ -1086,7 +1126,15 @@
         <w:t xml:space="preserve"> </w:t>
       </w:r>
       <w:r>
-        <w:t xml:space="preserve">Here is the list of required MatLab modules: </w:t>
+        <w:t xml:space="preserve">Here is the list of required </w:t>
+      </w:r>
+      <w:proofErr w:type="spellStart"/>
+      <w:r>
+        <w:t>MatLab</w:t>
+      </w:r>
+      <w:proofErr w:type="spellEnd"/>
+      <w:r>
+        <w:t xml:space="preserve"> modules: </w:t>
       </w:r>
     </w:p>
     <w:p>
@@ -1453,6 +1501,447 @@
       <w:r>
         <w:t xml:space="preserve"> This menu does not impact anything for 2D-MSI</w:t>
       </w:r>
+      <w:r>
+        <w:t xml:space="preserve"> and is thus greyed-out when this mode is selected.</w:t>
+      </w:r>
+    </w:p>
+    <w:p>
+      <w:pPr>
+        <w:pStyle w:val="ListParagraph"/>
+        <w:numPr>
+          <w:ilvl w:val="0"/>
+          <w:numId w:val="3"/>
+        </w:numPr>
+        <w:jc w:val="both"/>
+      </w:pPr>
+      <w:r>
+        <w:t>Properties</w:t>
+      </w:r>
+      <w:r>
+        <w:t xml:space="preserve"> panel</w:t>
+      </w:r>
+    </w:p>
+    <w:p>
+      <w:pPr>
+        <w:ind w:firstLine="720"/>
+        <w:jc w:val="both"/>
+      </w:pPr>
+      <w:r>
+        <w:t>This panel contains most general properties of the acquisition that do not depend of specific hardware components.</w:t>
+      </w:r>
+      <w:r>
+        <w:t xml:space="preserve"> Here is an explanation of those components</w:t>
+      </w:r>
+      <w:r>
+        <w:t>:</w:t>
+      </w:r>
+    </w:p>
+    <w:p>
+      <w:pPr>
+        <w:pStyle w:val="ListParagraph"/>
+        <w:numPr>
+          <w:ilvl w:val="0"/>
+          <w:numId w:val="2"/>
+        </w:numPr>
+        <w:jc w:val="both"/>
+      </w:pPr>
+      <w:r>
+        <w:t xml:space="preserve">Generated Map File: Name of the map file generated by STORM-MSI after the acquisition. It is advised to keep this name identical to the one containing molecular information, generated by the mass spectrometer. </w:t>
+      </w:r>
+    </w:p>
+    <w:p>
+      <w:pPr>
+        <w:pStyle w:val="ListParagraph"/>
+        <w:numPr>
+          <w:ilvl w:val="0"/>
+          <w:numId w:val="2"/>
+        </w:numPr>
+        <w:jc w:val="both"/>
+      </w:pPr>
+      <w:r>
+        <w:t>Resolution: Spatial resolution of the acquisition.</w:t>
+      </w:r>
+    </w:p>
+    <w:p>
+      <w:pPr>
+        <w:pStyle w:val="ListParagraph"/>
+        <w:numPr>
+          <w:ilvl w:val="0"/>
+          <w:numId w:val="2"/>
+        </w:numPr>
+        <w:jc w:val="both"/>
+      </w:pPr>
+      <w:r>
+        <w:t xml:space="preserve">Dimensions: Width and height of the sampling area in millimeters </w:t>
+      </w:r>
+    </w:p>
+    <w:p>
+      <w:pPr>
+        <w:pStyle w:val="ListParagraph"/>
+        <w:numPr>
+          <w:ilvl w:val="0"/>
+          <w:numId w:val="2"/>
+        </w:numPr>
+        <w:jc w:val="both"/>
+      </w:pPr>
+      <w:r>
+        <w:t>Surface Offset: Distance from the sampling surface to the workspace</w:t>
+      </w:r>
+    </w:p>
+    <w:p>
+      <w:pPr>
+        <w:pStyle w:val="ListParagraph"/>
+        <w:numPr>
+          <w:ilvl w:val="0"/>
+          <w:numId w:val="2"/>
+        </w:numPr>
+        <w:jc w:val="both"/>
+      </w:pPr>
+      <w:r>
+        <w:t>Sample Maximum Height: Total thickness of the sample at its highest point. Every measurement by the sensor that would indicate a point above this threshold will be clamped to this value.</w:t>
+      </w:r>
+    </w:p>
+    <w:p>
+      <w:pPr>
+        <w:pStyle w:val="ListParagraph"/>
+        <w:numPr>
+          <w:ilvl w:val="0"/>
+          <w:numId w:val="2"/>
+        </w:numPr>
+        <w:jc w:val="both"/>
+      </w:pPr>
+      <w:r>
+        <w:t>First Mapping Point: Initial coordinates of sampling in the robot’s referential. Will vary based on the setup used.</w:t>
+      </w:r>
+    </w:p>
+    <w:p>
+      <w:pPr>
+        <w:pStyle w:val="ListParagraph"/>
+        <w:jc w:val="both"/>
+      </w:pPr>
+    </w:p>
+    <w:p>
+      <w:pPr>
+        <w:pStyle w:val="ListParagraph"/>
+        <w:numPr>
+          <w:ilvl w:val="0"/>
+          <w:numId w:val="3"/>
+        </w:numPr>
+        <w:jc w:val="both"/>
+      </w:pPr>
+      <w:r>
+        <w:t>Robot</w:t>
+      </w:r>
+      <w:r>
+        <w:t xml:space="preserve"> </w:t>
+      </w:r>
+      <w:r>
+        <w:t xml:space="preserve">panel </w:t>
+      </w:r>
+    </w:p>
+    <w:p>
+      <w:pPr>
+        <w:ind w:firstLine="720"/>
+        <w:jc w:val="both"/>
+      </w:pPr>
+      <w:r>
+        <w:t xml:space="preserve">This panel is responsible for the connection of the robot responsible for moving either the analytical beam (e.g. with an arm which the beam source is fixed to) or the sample under a fixed beam (e.g. with a motorized plate). </w:t>
+      </w:r>
+      <w:r>
+        <w:t xml:space="preserve"> The robot type must be selected in a drop-down menu. Options are automatically added when new control scripts are added in </w:t>
+      </w:r>
+      <w:r>
+        <w:rPr>
+          <w:i/>
+          <w:iCs/>
+        </w:rPr>
+        <w:t>/code/hardware/robot/</w:t>
+      </w:r>
+      <w:r>
+        <w:rPr>
+          <w:i/>
+          <w:iCs/>
+        </w:rPr>
+        <w:t xml:space="preserve"> </w:t>
+      </w:r>
+      <w:r>
+        <w:t xml:space="preserve">after running the </w:t>
+      </w:r>
+      <w:proofErr w:type="spellStart"/>
+      <w:r>
+        <w:rPr>
+          <w:b/>
+          <w:bCs/>
+          <w:i/>
+          <w:iCs/>
+        </w:rPr>
+        <w:t>update_hardware.m</w:t>
+      </w:r>
+      <w:proofErr w:type="spellEnd"/>
+      <w:r>
+        <w:t xml:space="preserve"> script in the root directory</w:t>
+      </w:r>
+      <w:r>
+        <w:t>.</w:t>
+      </w:r>
+    </w:p>
+    <w:p>
+      <w:pPr>
+        <w:pStyle w:val="ListParagraph"/>
+        <w:numPr>
+          <w:ilvl w:val="0"/>
+          <w:numId w:val="3"/>
+        </w:numPr>
+        <w:jc w:val="both"/>
+      </w:pPr>
+      <w:r>
+        <w:lastRenderedPageBreak/>
+        <w:t>Sensor panel</w:t>
+      </w:r>
+    </w:p>
+    <w:p>
+      <w:pPr>
+        <w:ind w:firstLine="720"/>
+        <w:jc w:val="both"/>
+      </w:pPr>
+      <w:r>
+        <w:t>Similarly to the robot panel, the sensor panel handles the connection of the sensor to STORM-MSI, with a drop-down menu that contains every supported sensor model. There are two main categories of sensors: numerical and analog sensors. The latter require a calibration, which can only be performed once the robot arm is connected. The calibration output should be linear in the measuring region of interest.</w:t>
+      </w:r>
+    </w:p>
+    <w:p>
+      <w:pPr>
+        <w:pStyle w:val="ListParagraph"/>
+        <w:numPr>
+          <w:ilvl w:val="0"/>
+          <w:numId w:val="3"/>
+        </w:numPr>
+        <w:jc w:val="both"/>
+      </w:pPr>
+      <w:r>
+        <w:t xml:space="preserve">Source panel </w:t>
+      </w:r>
+    </w:p>
+    <w:p>
+      <w:pPr>
+        <w:ind w:firstLine="360"/>
+        <w:jc w:val="both"/>
+      </w:pPr>
+      <w:r>
+        <w:t>Source connection is a bit more involved than the two previous steps, as the behaviour of sources tends to be more complex.</w:t>
+      </w:r>
+      <w:r>
+        <w:t xml:space="preserve"> By default, the source is operated in burst mode: bursts of one or more </w:t>
+      </w:r>
+      <w:r>
+        <w:t xml:space="preserve">source </w:t>
+      </w:r>
+      <w:r>
+        <w:t>pulses are separated by a pause.</w:t>
+      </w:r>
+      <w:r>
+        <w:t xml:space="preserve"> Both the number of pulses and the pause length are set in the interface.</w:t>
+      </w:r>
+      <w:r>
+        <w:t xml:space="preserve"> Here is an explanation of every button:</w:t>
+      </w:r>
+    </w:p>
+    <w:p>
+      <w:pPr>
+        <w:pStyle w:val="ListParagraph"/>
+        <w:numPr>
+          <w:ilvl w:val="0"/>
+          <w:numId w:val="2"/>
+        </w:numPr>
+        <w:jc w:val="both"/>
+      </w:pPr>
+      <w:r>
+        <w:t>Connect / Disconnect Source: Initialize / Disables the source’s connection to STORM-MSI</w:t>
+      </w:r>
+    </w:p>
+    <w:p>
+      <w:pPr>
+        <w:pStyle w:val="ListParagraph"/>
+        <w:numPr>
+          <w:ilvl w:val="0"/>
+          <w:numId w:val="2"/>
+        </w:numPr>
+        <w:jc w:val="both"/>
+      </w:pPr>
+      <w:r>
+        <w:t>Temperature</w:t>
+      </w:r>
+      <w:r>
+        <w:t xml:space="preserve">: Queries </w:t>
+      </w:r>
+      <w:r>
+        <w:t xml:space="preserve">the temperature sensor in the source, if available. In our setup, we use this value to know whether the laser pump is warm </w:t>
+      </w:r>
+      <w:r>
+        <w:t>enough to use</w:t>
+      </w:r>
+    </w:p>
+    <w:p>
+      <w:pPr>
+        <w:pStyle w:val="ListParagraph"/>
+        <w:numPr>
+          <w:ilvl w:val="0"/>
+          <w:numId w:val="2"/>
+        </w:numPr>
+        <w:jc w:val="both"/>
+      </w:pPr>
+      <w:r>
+        <w:t xml:space="preserve">Turn Lamp On/Off: </w:t>
+      </w:r>
+      <w:r>
+        <w:t xml:space="preserve">Turns the laser’s lamp on or off. Could also be used to open/close a sprayer’s valve for instance. </w:t>
+      </w:r>
+    </w:p>
+    <w:p>
+      <w:pPr>
+        <w:pStyle w:val="ListParagraph"/>
+        <w:numPr>
+          <w:ilvl w:val="0"/>
+          <w:numId w:val="2"/>
+        </w:numPr>
+        <w:jc w:val="both"/>
+      </w:pPr>
+      <w:r>
+        <w:t xml:space="preserve">Get State: </w:t>
+      </w:r>
+      <w:r>
+        <w:t>Retrieves the source’s state, if the hardware is verbose</w:t>
+      </w:r>
+    </w:p>
+    <w:p>
+      <w:pPr>
+        <w:pStyle w:val="ListParagraph"/>
+        <w:numPr>
+          <w:ilvl w:val="0"/>
+          <w:numId w:val="2"/>
+        </w:numPr>
+        <w:jc w:val="both"/>
+      </w:pPr>
+      <w:r>
+        <w:t xml:space="preserve">Focal Distance: Determines the standoff distance between the source and the sampling point. </w:t>
+      </w:r>
+    </w:p>
+    <w:p>
+      <w:pPr>
+        <w:pStyle w:val="ListParagraph"/>
+        <w:numPr>
+          <w:ilvl w:val="0"/>
+          <w:numId w:val="2"/>
+        </w:numPr>
+        <w:jc w:val="both"/>
+      </w:pPr>
+      <w:r>
+        <w:t>Energy Level: For lasers, determines the energy of a given pulse</w:t>
+      </w:r>
+    </w:p>
+    <w:p>
+      <w:pPr>
+        <w:pStyle w:val="ListParagraph"/>
+        <w:numPr>
+          <w:ilvl w:val="0"/>
+          <w:numId w:val="2"/>
+        </w:numPr>
+        <w:jc w:val="both"/>
+      </w:pPr>
+      <w:r>
+        <w:t xml:space="preserve">Time between </w:t>
+      </w:r>
+      <w:r>
+        <w:t>beam</w:t>
+      </w:r>
+      <w:r>
+        <w:t xml:space="preserve"> bursts</w:t>
+      </w:r>
+      <w:r>
+        <w:t xml:space="preserve">: </w:t>
+      </w:r>
+      <w:r>
+        <w:t>Length of the pause between source bursts</w:t>
+      </w:r>
+    </w:p>
+    <w:p>
+      <w:pPr>
+        <w:pStyle w:val="ListParagraph"/>
+        <w:numPr>
+          <w:ilvl w:val="0"/>
+          <w:numId w:val="2"/>
+        </w:numPr>
+        <w:jc w:val="both"/>
+      </w:pPr>
+      <w:r>
+        <w:t>Pulses per burst: Number of pulses in a given source burst</w:t>
+      </w:r>
+    </w:p>
+    <w:p>
+      <w:pPr>
+        <w:pStyle w:val="ListParagraph"/>
+        <w:numPr>
+          <w:ilvl w:val="0"/>
+          <w:numId w:val="2"/>
+        </w:numPr>
+        <w:jc w:val="both"/>
+      </w:pPr>
+      <w:r>
+        <w:t xml:space="preserve">Continuous acquisition: Checkbox that overrides the burst behaviour, instead allowing the source to operate continuously during analysis. Note that with this mode the source is still opened at the acquisition’s beginning and closed as the acquisition ends. </w:t>
+      </w:r>
+    </w:p>
+    <w:p>
+      <w:pPr>
+        <w:pStyle w:val="ListParagraph"/>
+        <w:jc w:val="both"/>
+      </w:pPr>
+    </w:p>
+    <w:p>
+      <w:pPr>
+        <w:pStyle w:val="ListParagraph"/>
+        <w:numPr>
+          <w:ilvl w:val="0"/>
+          <w:numId w:val="3"/>
+        </w:numPr>
+        <w:jc w:val="both"/>
+      </w:pPr>
+      <w:r>
+        <w:t>Mass Spectrometer</w:t>
+      </w:r>
+      <w:r>
+        <w:t xml:space="preserve"> panel</w:t>
+      </w:r>
+    </w:p>
+    <w:p>
+      <w:pPr>
+        <w:ind w:firstLine="720"/>
+        <w:jc w:val="both"/>
+      </w:pPr>
+      <w:r>
+        <w:t xml:space="preserve">This panel currently only </w:t>
+      </w:r>
+      <w:r>
+        <w:t>controls the method for triggering the acquisition start on the mass spectrometer, synchronizing it with other hardware components. However, should material constraints such as vendor-specific communication lockdowns be lifted, other parameters such as the ion mode and scan time could be controlled by means of this panel.</w:t>
+      </w:r>
+    </w:p>
+    <w:p>
+      <w:pPr>
+        <w:pStyle w:val="ListParagraph"/>
+        <w:numPr>
+          <w:ilvl w:val="0"/>
+          <w:numId w:val="3"/>
+        </w:numPr>
+        <w:jc w:val="both"/>
+      </w:pPr>
+      <w:r>
+        <w:t>Start panel</w:t>
+      </w:r>
+    </w:p>
+    <w:p>
+      <w:pPr>
+        <w:pStyle w:val="ListParagraph"/>
+        <w:ind w:left="1800"/>
+        <w:jc w:val="both"/>
+      </w:pPr>
     </w:p>
     <w:p>
       <w:pPr>
@@ -1492,6 +1981,7 @@
         <w:jc w:val="both"/>
       </w:pPr>
       <w:r>
+        <w:lastRenderedPageBreak/>
         <w:t xml:space="preserve">STORM-MSI is distributed as an Open-Source software on GitHub page of the PRISM laboratory. </w:t>
       </w:r>
       <w:r>

</xml_diff>

<commit_message>
More renaming and tweaking to make the GUI more approachable
</commit_message>
<xml_diff>
--- a/documents/User_Guide.docx
+++ b/documents/User_Guide.docx
@@ -844,9 +844,10 @@
       <w:pPr>
         <w:pStyle w:val="ListParagraph"/>
         <w:numPr>
-          <w:ilvl w:val="1"/>
-          <w:numId w:val="1"/>
-        </w:numPr>
+          <w:ilvl w:val="0"/>
+          <w:numId w:val="4"/>
+        </w:numPr>
+        <w:outlineLvl w:val="1"/>
       </w:pPr>
       <w:r>
         <w:t>Data Acquisition</w:t>
@@ -942,9 +943,10 @@
       <w:pPr>
         <w:pStyle w:val="ListParagraph"/>
         <w:numPr>
-          <w:ilvl w:val="1"/>
-          <w:numId w:val="1"/>
-        </w:numPr>
+          <w:ilvl w:val="0"/>
+          <w:numId w:val="4"/>
+        </w:numPr>
+        <w:outlineLvl w:val="1"/>
       </w:pPr>
       <w:r>
         <w:t>Data Processing</w:t>
@@ -1026,9 +1028,10 @@
       <w:pPr>
         <w:pStyle w:val="ListParagraph"/>
         <w:numPr>
-          <w:ilvl w:val="1"/>
-          <w:numId w:val="1"/>
-        </w:numPr>
+          <w:ilvl w:val="0"/>
+          <w:numId w:val="5"/>
+        </w:numPr>
+        <w:outlineLvl w:val="1"/>
       </w:pPr>
       <w:r>
         <w:t>Prerequisites</w:t>
@@ -1362,10 +1365,11 @@
       <w:pPr>
         <w:pStyle w:val="ListParagraph"/>
         <w:numPr>
-          <w:ilvl w:val="1"/>
-          <w:numId w:val="1"/>
-        </w:numPr>
-        <w:jc w:val="both"/>
+          <w:ilvl w:val="0"/>
+          <w:numId w:val="5"/>
+        </w:numPr>
+        <w:jc w:val="both"/>
+        <w:outlineLvl w:val="1"/>
       </w:pPr>
       <w:r>
         <w:t>Data Acquisition</w:t>
@@ -1410,6 +1414,7 @@
           <w:numId w:val="3"/>
         </w:numPr>
         <w:jc w:val="both"/>
+        <w:outlineLvl w:val="2"/>
       </w:pPr>
       <w:r>
         <w:t>Mapping Mode panel</w:t>
@@ -1434,7 +1439,14 @@
         <w:jc w:val="both"/>
       </w:pPr>
       <w:r>
-        <w:t>Topography Only: Only records topographical information. The source and mass spectrometer are not required in this mode, but the depth sensor is compulsory to gather this information.</w:t>
+        <w:rPr>
+          <w:b/>
+          <w:bCs/>
+        </w:rPr>
+        <w:t>Topography Only:</w:t>
+      </w:r>
+      <w:r>
+        <w:t xml:space="preserve"> Only records topographical information. The source and mass spectrometer are not required in this mode, but the depth sensor is compulsory to gather this information.</w:t>
       </w:r>
     </w:p>
     <w:p>
@@ -1447,7 +1459,14 @@
         <w:jc w:val="both"/>
       </w:pPr>
       <w:r>
-        <w:t xml:space="preserve">2D-MSI: Conventional Mass Spectrometry Imaging analysis. Does not require a depth sensor to be connected. </w:t>
+        <w:rPr>
+          <w:b/>
+          <w:bCs/>
+        </w:rPr>
+        <w:t>2D-MSI:</w:t>
+      </w:r>
+      <w:r>
+        <w:t xml:space="preserve"> Conventional Mass Spectrometry Imaging analysis. Does not require a depth sensor to be connected. </w:t>
       </w:r>
     </w:p>
     <w:p>
@@ -1460,7 +1479,14 @@
         <w:jc w:val="both"/>
       </w:pPr>
       <w:r>
-        <w:t xml:space="preserve">3D-MSI: </w:t>
+        <w:rPr>
+          <w:b/>
+          <w:bCs/>
+        </w:rPr>
+        <w:t>3D-MSI:</w:t>
+      </w:r>
+      <w:r>
+        <w:t xml:space="preserve"> </w:t>
       </w:r>
       <w:r>
         <w:t xml:space="preserve">Mass Spectrometry Imaging analysis of topographically complex samples. Requires all four modular hardware components to be properly configured in the following steps. </w:t>
@@ -1513,6 +1539,7 @@
           <w:numId w:val="3"/>
         </w:numPr>
         <w:jc w:val="both"/>
+        <w:outlineLvl w:val="2"/>
       </w:pPr>
       <w:r>
         <w:t>Properties</w:t>
@@ -1546,7 +1573,14 @@
         <w:jc w:val="both"/>
       </w:pPr>
       <w:r>
-        <w:t xml:space="preserve">Generated Map File: Name of the map file generated by STORM-MSI after the acquisition. It is advised to keep this name identical to the one containing molecular information, generated by the mass spectrometer. </w:t>
+        <w:rPr>
+          <w:b/>
+          <w:bCs/>
+        </w:rPr>
+        <w:t>Generated Map File:</w:t>
+      </w:r>
+      <w:r>
+        <w:t xml:space="preserve"> Name of the map file generated by STORM-MSI after the acquisition. It is advised to keep this name identical to the one containing molecular information, generated by the mass spectrometer. </w:t>
       </w:r>
     </w:p>
     <w:p>
@@ -1559,7 +1593,14 @@
         <w:jc w:val="both"/>
       </w:pPr>
       <w:r>
-        <w:t>Resolution: Spatial resolution of the acquisition.</w:t>
+        <w:rPr>
+          <w:b/>
+          <w:bCs/>
+        </w:rPr>
+        <w:t>Resolution:</w:t>
+      </w:r>
+      <w:r>
+        <w:t xml:space="preserve"> Spatial resolution of the acquisition.</w:t>
       </w:r>
     </w:p>
     <w:p>
@@ -1572,7 +1613,14 @@
         <w:jc w:val="both"/>
       </w:pPr>
       <w:r>
-        <w:t xml:space="preserve">Dimensions: Width and height of the sampling area in millimeters </w:t>
+        <w:rPr>
+          <w:b/>
+          <w:bCs/>
+        </w:rPr>
+        <w:t>Dimensions:</w:t>
+      </w:r>
+      <w:r>
+        <w:t xml:space="preserve"> Width and height of the sampling area in millimeters </w:t>
       </w:r>
     </w:p>
     <w:p>
@@ -1585,7 +1633,14 @@
         <w:jc w:val="both"/>
       </w:pPr>
       <w:r>
-        <w:t>Surface Offset: Distance from the sampling surface to the workspace</w:t>
+        <w:rPr>
+          <w:b/>
+          <w:bCs/>
+        </w:rPr>
+        <w:t>Surface Offset:</w:t>
+      </w:r>
+      <w:r>
+        <w:t xml:space="preserve"> Distance from the sampling surface to the workspace</w:t>
       </w:r>
     </w:p>
     <w:p>
@@ -1598,7 +1653,14 @@
         <w:jc w:val="both"/>
       </w:pPr>
       <w:r>
-        <w:t>Sample Maximum Height: Total thickness of the sample at its highest point. Every measurement by the sensor that would indicate a point above this threshold will be clamped to this value.</w:t>
+        <w:rPr>
+          <w:b/>
+          <w:bCs/>
+        </w:rPr>
+        <w:t>Sample Maximum Height:</w:t>
+      </w:r>
+      <w:r>
+        <w:t xml:space="preserve"> Total thickness of the sample at its highest point. Every measurement by the sensor that would indicate a point above this threshold will be clamped to this value.</w:t>
       </w:r>
     </w:p>
     <w:p>
@@ -1611,7 +1673,14 @@
         <w:jc w:val="both"/>
       </w:pPr>
       <w:r>
-        <w:t>First Mapping Point: Initial coordinates of sampling in the robot’s referential. Will vary based on the setup used.</w:t>
+        <w:rPr>
+          <w:b/>
+          <w:bCs/>
+        </w:rPr>
+        <w:t>First Mapping Point:</w:t>
+      </w:r>
+      <w:r>
+        <w:t xml:space="preserve"> Initial coordinates of sampling in the robot’s referential. Will vary based on the setup used.</w:t>
       </w:r>
     </w:p>
     <w:p>
@@ -1628,6 +1697,7 @@
           <w:numId w:val="3"/>
         </w:numPr>
         <w:jc w:val="both"/>
+        <w:outlineLvl w:val="2"/>
       </w:pPr>
       <w:r>
         <w:t>Robot</w:t>
@@ -1693,6 +1763,7 @@
           <w:numId w:val="3"/>
         </w:numPr>
         <w:jc w:val="both"/>
+        <w:outlineLvl w:val="2"/>
       </w:pPr>
       <w:r>
         <w:lastRenderedPageBreak/>
@@ -1716,6 +1787,7 @@
           <w:numId w:val="3"/>
         </w:numPr>
         <w:jc w:val="both"/>
+        <w:outlineLvl w:val="2"/>
       </w:pPr>
       <w:r>
         <w:t xml:space="preserve">Source panel </w:t>
@@ -1730,13 +1802,30 @@
         <w:t>Source connection is a bit more involved than the two previous steps, as the behaviour of sources tends to be more complex.</w:t>
       </w:r>
       <w:r>
-        <w:t xml:space="preserve"> By default, the source is operated in burst mode: bursts of one or more </w:t>
+        <w:t xml:space="preserve"> By default, the source is operated in burst mode: </w:t>
+      </w:r>
+      <w:r>
+        <w:rPr>
+          <w:b/>
+          <w:bCs/>
+        </w:rPr>
+        <w:t>bursts</w:t>
+      </w:r>
+      <w:r>
+        <w:t xml:space="preserve"> of one or more </w:t>
       </w:r>
       <w:r>
         <w:t xml:space="preserve">source </w:t>
       </w:r>
       <w:r>
-        <w:t>pulses are separated by a pause.</w:t>
+        <w:rPr>
+          <w:b/>
+          <w:bCs/>
+        </w:rPr>
+        <w:t>pulses</w:t>
+      </w:r>
+      <w:r>
+        <w:t xml:space="preserve"> are separated by a pause.</w:t>
       </w:r>
       <w:r>
         <w:t xml:space="preserve"> Both the number of pulses and the pause length are set in the interface.</w:t>
@@ -1755,7 +1844,14 @@
         <w:jc w:val="both"/>
       </w:pPr>
       <w:r>
-        <w:t>Connect / Disconnect Source: Initialize / Disables the source’s connection to STORM-MSI</w:t>
+        <w:rPr>
+          <w:b/>
+          <w:bCs/>
+        </w:rPr>
+        <w:t>Connect / Disconnect Source:</w:t>
+      </w:r>
+      <w:r>
+        <w:t xml:space="preserve"> Initialize / Disables the source’s connection to STORM-MSI</w:t>
       </w:r>
     </w:p>
     <w:p>
@@ -1768,10 +1864,21 @@
         <w:jc w:val="both"/>
       </w:pPr>
       <w:r>
+        <w:rPr>
+          <w:b/>
+          <w:bCs/>
+        </w:rPr>
         <w:t>Temperature</w:t>
       </w:r>
       <w:r>
-        <w:t xml:space="preserve">: Queries </w:t>
+        <w:rPr>
+          <w:b/>
+          <w:bCs/>
+        </w:rPr>
+        <w:t>:</w:t>
+      </w:r>
+      <w:r>
+        <w:t xml:space="preserve"> Queries </w:t>
       </w:r>
       <w:r>
         <w:t xml:space="preserve">the temperature sensor in the source, if available. In our setup, we use this value to know whether the laser pump is warm </w:t>
@@ -1790,7 +1897,14 @@
         <w:jc w:val="both"/>
       </w:pPr>
       <w:r>
-        <w:t xml:space="preserve">Turn Lamp On/Off: </w:t>
+        <w:rPr>
+          <w:b/>
+          <w:bCs/>
+        </w:rPr>
+        <w:t>Turn Lamp On/Off:</w:t>
+      </w:r>
+      <w:r>
+        <w:t xml:space="preserve"> </w:t>
       </w:r>
       <w:r>
         <w:t xml:space="preserve">Turns the laser’s lamp on or off. Could also be used to open/close a sprayer’s valve for instance. </w:t>
@@ -1806,7 +1920,14 @@
         <w:jc w:val="both"/>
       </w:pPr>
       <w:r>
-        <w:t xml:space="preserve">Get State: </w:t>
+        <w:rPr>
+          <w:b/>
+          <w:bCs/>
+        </w:rPr>
+        <w:t>Get State:</w:t>
+      </w:r>
+      <w:r>
+        <w:t xml:space="preserve"> </w:t>
       </w:r>
       <w:r>
         <w:t>Retrieves the source’s state, if the hardware is verbose</w:t>
@@ -1822,7 +1943,14 @@
         <w:jc w:val="both"/>
       </w:pPr>
       <w:r>
-        <w:t xml:space="preserve">Focal Distance: Determines the standoff distance between the source and the sampling point. </w:t>
+        <w:rPr>
+          <w:b/>
+          <w:bCs/>
+        </w:rPr>
+        <w:t>Focal Distance:</w:t>
+      </w:r>
+      <w:r>
+        <w:t xml:space="preserve"> Determines the standoff distance between the source and the sampling point. </w:t>
       </w:r>
     </w:p>
     <w:p>
@@ -1835,7 +1963,14 @@
         <w:jc w:val="both"/>
       </w:pPr>
       <w:r>
-        <w:t>Energy Level: For lasers, determines the energy of a given pulse</w:t>
+        <w:rPr>
+          <w:b/>
+          <w:bCs/>
+        </w:rPr>
+        <w:t>Energy Level:</w:t>
+      </w:r>
+      <w:r>
+        <w:t xml:space="preserve"> For lasers, determines the energy of a given pulse</w:t>
       </w:r>
     </w:p>
     <w:p>
@@ -1848,16 +1983,35 @@
         <w:jc w:val="both"/>
       </w:pPr>
       <w:r>
+        <w:rPr>
+          <w:b/>
+          <w:bCs/>
+        </w:rPr>
         <w:t xml:space="preserve">Time between </w:t>
       </w:r>
       <w:r>
+        <w:rPr>
+          <w:b/>
+          <w:bCs/>
+        </w:rPr>
         <w:t>beam</w:t>
       </w:r>
       <w:r>
+        <w:rPr>
+          <w:b/>
+          <w:bCs/>
+        </w:rPr>
         <w:t xml:space="preserve"> bursts</w:t>
       </w:r>
       <w:r>
-        <w:t xml:space="preserve">: </w:t>
+        <w:rPr>
+          <w:b/>
+          <w:bCs/>
+        </w:rPr>
+        <w:t>:</w:t>
+      </w:r>
+      <w:r>
+        <w:t xml:space="preserve"> </w:t>
       </w:r>
       <w:r>
         <w:t>Length of the pause between source bursts</w:t>
@@ -1873,7 +2027,14 @@
         <w:jc w:val="both"/>
       </w:pPr>
       <w:r>
-        <w:t>Pulses per burst: Number of pulses in a given source burst</w:t>
+        <w:rPr>
+          <w:b/>
+          <w:bCs/>
+        </w:rPr>
+        <w:t>Pulses per burst:</w:t>
+      </w:r>
+      <w:r>
+        <w:t xml:space="preserve"> Number of pulses in a given source burst</w:t>
       </w:r>
     </w:p>
     <w:p>
@@ -1886,7 +2047,14 @@
         <w:jc w:val="both"/>
       </w:pPr>
       <w:r>
-        <w:t xml:space="preserve">Continuous acquisition: Checkbox that overrides the burst behaviour, instead allowing the source to operate continuously during analysis. Note that with this mode the source is still opened at the acquisition’s beginning and closed as the acquisition ends. </w:t>
+        <w:rPr>
+          <w:b/>
+          <w:bCs/>
+        </w:rPr>
+        <w:t>Continuous acquisition:</w:t>
+      </w:r>
+      <w:r>
+        <w:t xml:space="preserve"> Checkbox that overrides the burst behaviour, instead allowing the source to operate continuously during analysis. Note that with this mode the source is still opened at the acquisition’s beginning and closed as the acquisition ends. </w:t>
       </w:r>
     </w:p>
     <w:p>
@@ -1903,6 +2071,7 @@
           <w:numId w:val="3"/>
         </w:numPr>
         <w:jc w:val="both"/>
+        <w:outlineLvl w:val="2"/>
       </w:pPr>
       <w:r>
         <w:t>Mass Spectrometer</w:t>
@@ -1922,6 +2091,35 @@
       <w:r>
         <w:t>controls the method for triggering the acquisition start on the mass spectrometer, synchronizing it with other hardware components. However, should material constraints such as vendor-specific communication lockdowns be lifted, other parameters such as the ion mode and scan time could be controlled by means of this panel.</w:t>
       </w:r>
+      <w:r>
+        <w:t xml:space="preserve"> Note that </w:t>
+      </w:r>
+      <w:r>
+        <w:rPr>
+          <w:b/>
+          <w:bCs/>
+        </w:rPr>
+        <w:t>in order for triggering to work, the mass spectrometer and its acquisition software must be configured to accept external acquisition triggering sources</w:t>
+      </w:r>
+      <w:r>
+        <w:t xml:space="preserve">. </w:t>
+      </w:r>
+      <w:r>
+        <w:t xml:space="preserve">Also note that </w:t>
+      </w:r>
+      <w:r>
+        <w:rPr>
+          <w:b/>
+          <w:bCs/>
+        </w:rPr>
+        <w:t>STORM-MSI does not support automatically ending an acquisition on the mass spectrometer’s software yet</w:t>
+      </w:r>
+      <w:r>
+        <w:t>, and this operation must thus be performed manually</w:t>
+      </w:r>
+      <w:r>
+        <w:t>.</w:t>
+      </w:r>
     </w:p>
     <w:p>
       <w:pPr>
@@ -1938,6 +2136,167 @@
     </w:p>
     <w:p>
       <w:pPr>
+        <w:ind w:firstLine="720"/>
+        <w:jc w:val="both"/>
+      </w:pPr>
+      <w:r>
+        <w:lastRenderedPageBreak/>
+        <w:t xml:space="preserve">The top half of the start panel displays essential acquisition settings that were set in previous panels, while the bottom half lists a few </w:t>
+      </w:r>
+      <w:r>
+        <w:t>quality-of-life</w:t>
+      </w:r>
+      <w:r>
+        <w:t xml:space="preserve"> options as well as the command to initiate analysis.</w:t>
+      </w:r>
+    </w:p>
+    <w:p>
+      <w:pPr>
+        <w:pStyle w:val="ListParagraph"/>
+        <w:numPr>
+          <w:ilvl w:val="0"/>
+          <w:numId w:val="2"/>
+        </w:numPr>
+        <w:jc w:val="both"/>
+      </w:pPr>
+      <w:r>
+        <w:rPr>
+          <w:b/>
+          <w:bCs/>
+        </w:rPr>
+        <w:t>Move Robot:</w:t>
+      </w:r>
+      <w:r>
+        <w:t xml:space="preserve"> Moves the robot to the XYZ coordinates specified in the corresponding edit fields. </w:t>
+      </w:r>
+      <w:r>
+        <w:t>This can be used for general purpose control from the interface</w:t>
+      </w:r>
+      <w:r>
+        <w:t>, and this position will be overwritten at the start of an analysis.</w:t>
+      </w:r>
+    </w:p>
+    <w:p>
+      <w:pPr>
+        <w:pStyle w:val="ListParagraph"/>
+        <w:numPr>
+          <w:ilvl w:val="0"/>
+          <w:numId w:val="2"/>
+        </w:numPr>
+        <w:jc w:val="both"/>
+      </w:pPr>
+      <w:r>
+        <w:rPr>
+          <w:b/>
+          <w:bCs/>
+        </w:rPr>
+        <w:t>Emergency Stop</w:t>
+      </w:r>
+      <w:r>
+        <w:rPr>
+          <w:b/>
+          <w:bCs/>
+        </w:rPr>
+        <w:t>:</w:t>
+      </w:r>
+      <w:r>
+        <w:t xml:space="preserve"> Fully stops the laser and robot if pressed, over</w:t>
+      </w:r>
+      <w:r>
+        <w:t>riding any ongoing task</w:t>
+      </w:r>
+    </w:p>
+    <w:p>
+      <w:pPr>
+        <w:pStyle w:val="ListParagraph"/>
+        <w:numPr>
+          <w:ilvl w:val="0"/>
+          <w:numId w:val="2"/>
+        </w:numPr>
+        <w:jc w:val="both"/>
+      </w:pPr>
+      <w:r>
+        <w:rPr>
+          <w:b/>
+          <w:bCs/>
+        </w:rPr>
+        <w:t>Go to Mapping Position:</w:t>
+      </w:r>
+      <w:r>
+        <w:t xml:space="preserve"> Puts the robot in its starting position</w:t>
+      </w:r>
+    </w:p>
+    <w:p>
+      <w:pPr>
+        <w:pStyle w:val="ListParagraph"/>
+        <w:numPr>
+          <w:ilvl w:val="0"/>
+          <w:numId w:val="2"/>
+        </w:numPr>
+        <w:jc w:val="both"/>
+      </w:pPr>
+      <w:r>
+        <w:rPr>
+          <w:b/>
+          <w:bCs/>
+        </w:rPr>
+        <w:t>Launch Mapping:</w:t>
+      </w:r>
+      <w:r>
+        <w:t xml:space="preserve"> Starts the acquisition if all prerequisites </w:t>
+      </w:r>
+      <w:r>
+        <w:t xml:space="preserve">for the selected acquisition mode are </w:t>
+      </w:r>
+      <w:r>
+        <w:t>met</w:t>
+      </w:r>
+      <w:r>
+        <w:t xml:space="preserve"> </w:t>
+      </w:r>
+    </w:p>
+    <w:p>
+      <w:pPr>
+        <w:pStyle w:val="ListParagraph"/>
+        <w:numPr>
+          <w:ilvl w:val="0"/>
+          <w:numId w:val="2"/>
+        </w:numPr>
+        <w:jc w:val="both"/>
+      </w:pPr>
+      <w:r>
+        <w:rPr>
+          <w:b/>
+          <w:bCs/>
+        </w:rPr>
+        <w:t>Status:</w:t>
+      </w:r>
+      <w:r>
+        <w:t xml:space="preserve"> Gives general information regarding STORM-MSI’s status</w:t>
+      </w:r>
+    </w:p>
+    <w:p>
+      <w:pPr>
+        <w:pStyle w:val="ListParagraph"/>
+        <w:numPr>
+          <w:ilvl w:val="0"/>
+          <w:numId w:val="2"/>
+        </w:numPr>
+        <w:jc w:val="both"/>
+      </w:pPr>
+      <w:r>
+        <w:rPr>
+          <w:b/>
+          <w:bCs/>
+        </w:rPr>
+        <w:t>Quit to menu:</w:t>
+      </w:r>
+      <w:r>
+        <w:t xml:space="preserve"> Exits to the initial interface mode selection menu</w:t>
+      </w:r>
+    </w:p>
+    <w:p>
+      <w:pPr>
         <w:pStyle w:val="ListParagraph"/>
         <w:ind w:left="1800"/>
         <w:jc w:val="both"/>
@@ -1947,41 +2306,269 @@
       <w:pPr>
         <w:pStyle w:val="ListParagraph"/>
         <w:numPr>
-          <w:ilvl w:val="1"/>
+          <w:ilvl w:val="0"/>
+          <w:numId w:val="5"/>
+        </w:numPr>
+        <w:jc w:val="both"/>
+      </w:pPr>
+      <w:r>
+        <w:t xml:space="preserve">Data Processing </w:t>
+      </w:r>
+    </w:p>
+    <w:p>
+      <w:pPr>
+        <w:ind w:firstLine="360"/>
+        <w:jc w:val="both"/>
+        <w:rPr>
+          <w:b/>
+          <w:bCs/>
+        </w:rPr>
+      </w:pPr>
+      <w:r>
+        <w:t>Once the acq</w:t>
+      </w:r>
+      <w:r>
+        <w:t xml:space="preserve">uisition is finished, </w:t>
+      </w:r>
+      <w:r>
+        <w:t xml:space="preserve">two </w:t>
+      </w:r>
+      <w:r>
+        <w:t>f</w:t>
+      </w:r>
+      <w:r>
+        <w:t xml:space="preserve">iles are generated: a </w:t>
+      </w:r>
+      <w:r>
+        <w:rPr>
+          <w:b/>
+          <w:bCs/>
+        </w:rPr>
+        <w:t>Map</w:t>
+      </w:r>
+      <w:r>
+        <w:t xml:space="preserve"> file containing the spatial information, created by STORM-MSI, and a </w:t>
+      </w:r>
+      <w:r>
+        <w:rPr>
+          <w:b/>
+          <w:bCs/>
+        </w:rPr>
+        <w:t xml:space="preserve">Molecular Data </w:t>
+      </w:r>
+      <w:r>
+        <w:t>file</w:t>
+      </w:r>
+      <w:r>
+        <w:t xml:space="preserve"> </w:t>
+      </w:r>
+      <w:r>
+        <w:t>wh</w:t>
+      </w:r>
+      <w:r>
+        <w:t>ose format will vary depending on the type of mass spectrometer that it was generated from.</w:t>
+      </w:r>
+      <w:r>
+        <w:t xml:space="preserve"> </w:t>
+      </w:r>
+      <w:r>
+        <w:t xml:space="preserve">This molecular data must be converted externally to the open </w:t>
+      </w:r>
+      <w:proofErr w:type="spellStart"/>
+      <w:r>
+        <w:rPr>
+          <w:b/>
+          <w:bCs/>
+        </w:rPr>
+        <w:t>mzXML</w:t>
+      </w:r>
+      <w:proofErr w:type="spellEnd"/>
+      <w:r>
+        <w:t xml:space="preserve"> format to be ingested by STORM-MSI</w:t>
+      </w:r>
+      <w:r>
+        <w:t xml:space="preserve">, and eventually converted into a </w:t>
+      </w:r>
+      <w:r>
+        <w:rPr>
+          <w:b/>
+          <w:bCs/>
+        </w:rPr>
+        <w:t>Mat</w:t>
+      </w:r>
+      <w:r>
+        <w:t xml:space="preserve"> file</w:t>
+      </w:r>
+      <w:r>
+        <w:t>.</w:t>
+      </w:r>
+      <w:r>
+        <w:t xml:space="preserve"> </w:t>
+      </w:r>
+      <w:r>
+        <w:rPr>
+          <w:b/>
+          <w:bCs/>
+        </w:rPr>
+        <w:t>Both a Map and Mat file must be loaded into STORM-MSI to fully use the processing interface.</w:t>
+      </w:r>
+    </w:p>
+    <w:p>
+      <w:pPr>
+        <w:ind w:left="1800"/>
+        <w:jc w:val="both"/>
+      </w:pPr>
+      <w:r>
+        <w:t xml:space="preserve">1. </w:t>
+      </w:r>
+      <w:r>
+        <w:t>Generating a Mat file</w:t>
+      </w:r>
+    </w:p>
+    <w:p>
+      <w:pPr>
+        <w:ind w:firstLine="360"/>
+        <w:jc w:val="both"/>
+      </w:pPr>
+      <w:r>
+        <w:t xml:space="preserve">Generating a Mat file is done by first clicking the </w:t>
+      </w:r>
+      <w:r>
+        <w:rPr>
+          <w:b/>
+          <w:bCs/>
+        </w:rPr>
+        <w:t>Ne</w:t>
+      </w:r>
+      <w:r>
+        <w:rPr>
+          <w:b/>
+          <w:bCs/>
+        </w:rPr>
+        <w:t>w</w:t>
+      </w:r>
+      <w:r>
+        <w:rPr>
+          <w:b/>
+          <w:bCs/>
+        </w:rPr>
+        <w:t xml:space="preserve"> Mat File</w:t>
+      </w:r>
+      <w:r>
+        <w:t xml:space="preserve"> button on top of the general data processing interface. This opens a sub-menu that contains everything needed for </w:t>
+      </w:r>
+      <w:r>
+        <w:rPr>
+          <w:b/>
+          <w:bCs/>
+        </w:rPr>
+        <w:t>scan selection</w:t>
+      </w:r>
+      <w:r>
+        <w:t xml:space="preserve">, a process that assigns scans from an </w:t>
+      </w:r>
+      <w:proofErr w:type="spellStart"/>
+      <w:r>
+        <w:t>mzXML</w:t>
+      </w:r>
+      <w:proofErr w:type="spellEnd"/>
+      <w:r>
+        <w:t xml:space="preserve"> file to their corresponding point in the map file, storing them in the Mat file that will be used for all ulterior processing. </w:t>
+      </w:r>
+    </w:p>
+    <w:p>
+      <w:pPr>
+        <w:ind w:firstLine="360"/>
+        <w:jc w:val="both"/>
+      </w:pPr>
+      <w:r>
+        <w:t>Once in the sub-menu, the process can be divided in three main steps:</w:t>
+      </w:r>
+    </w:p>
+    <w:p>
+      <w:pPr>
+        <w:pStyle w:val="ListParagraph"/>
+        <w:numPr>
+          <w:ilvl w:val="0"/>
+          <w:numId w:val="2"/>
+        </w:numPr>
+        <w:jc w:val="both"/>
+      </w:pPr>
+      <w:r>
+        <w:t xml:space="preserve">Loading the </w:t>
+      </w:r>
+      <w:proofErr w:type="spellStart"/>
+      <w:r>
+        <w:t>mzXML</w:t>
+      </w:r>
+      <w:proofErr w:type="spellEnd"/>
+      <w:r>
+        <w:t xml:space="preserve"> file and its corresponding map file</w:t>
+      </w:r>
+    </w:p>
+    <w:p>
+      <w:pPr>
+        <w:pStyle w:val="ListParagraph"/>
+        <w:numPr>
+          <w:ilvl w:val="0"/>
+          <w:numId w:val="2"/>
+        </w:numPr>
+        <w:jc w:val="both"/>
+      </w:pPr>
+      <w:r>
+        <w:t>Performing scan selection</w:t>
+      </w:r>
+    </w:p>
+    <w:p>
+      <w:pPr>
+        <w:pStyle w:val="ListParagraph"/>
+        <w:numPr>
+          <w:ilvl w:val="0"/>
+          <w:numId w:val="2"/>
+        </w:numPr>
+        <w:jc w:val="both"/>
+      </w:pPr>
+      <w:r>
+        <w:t xml:space="preserve">Generating the Mat file from the assignments done during scan selection </w:t>
+      </w:r>
+    </w:p>
+    <w:p>
+      <w:pPr>
+        <w:ind w:firstLine="360"/>
+        <w:jc w:val="both"/>
+      </w:pPr>
+      <w:r>
+        <w:tab/>
+      </w:r>
+      <w:r>
+        <w:tab/>
+      </w:r>
+      <w:r>
+        <w:tab/>
+      </w:r>
+      <w:r>
+        <w:tab/>
+      </w:r>
+    </w:p>
+    <w:p>
+      <w:pPr>
+        <w:pStyle w:val="ListParagraph"/>
+        <w:numPr>
+          <w:ilvl w:val="0"/>
           <w:numId w:val="1"/>
         </w:numPr>
         <w:jc w:val="both"/>
       </w:pPr>
       <w:r>
-        <w:t xml:space="preserve">Data Processing </w:t>
-      </w:r>
-    </w:p>
-    <w:p>
-      <w:pPr>
-        <w:pStyle w:val="ListParagraph"/>
-        <w:ind w:left="1440"/>
-        <w:jc w:val="both"/>
-      </w:pPr>
-    </w:p>
-    <w:p>
-      <w:pPr>
-        <w:pStyle w:val="ListParagraph"/>
-        <w:numPr>
-          <w:ilvl w:val="0"/>
-          <w:numId w:val="1"/>
-        </w:numPr>
-        <w:jc w:val="both"/>
-      </w:pPr>
-      <w:r>
         <w:t>Contributions</w:t>
       </w:r>
     </w:p>
     <w:p>
       <w:pPr>
-        <w:jc w:val="both"/>
-      </w:pPr>
-      <w:r>
-        <w:lastRenderedPageBreak/>
+        <w:ind w:firstLine="360"/>
+        <w:jc w:val="both"/>
+      </w:pPr>
+      <w:r>
         <w:t xml:space="preserve">STORM-MSI is distributed as an Open-Source software on GitHub page of the PRISM laboratory. </w:t>
       </w:r>
       <w:r>
@@ -2009,7 +2596,7 @@
   <w:abstractNum w:abstractNumId="0" w15:restartNumberingAfterBreak="0">
     <w:nsid w:val="2389681D"/>
     <w:multiLevelType w:val="hybridMultilevel"/>
-    <w:tmpl w:val="48BA62B8"/>
+    <w:tmpl w:val="6A107952"/>
     <w:lvl w:ilvl="0" w:tplc="A212F428">
       <w:start w:val="1"/>
       <w:numFmt w:val="upperRoman"/>
@@ -2031,13 +2618,105 @@
         <w:ind w:left="1440" w:hanging="360"/>
       </w:pPr>
     </w:lvl>
-    <w:lvl w:ilvl="2" w:tplc="0409001B" w:tentative="1">
+    <w:lvl w:ilvl="2" w:tplc="AD16910E">
+      <w:start w:val="1"/>
+      <w:numFmt w:val="decimal"/>
+      <w:lvlText w:val="%3)"/>
+      <w:lvlJc w:val="left"/>
+      <w:pPr>
+        <w:ind w:left="2340" w:hanging="360"/>
+      </w:pPr>
+      <w:rPr>
+        <w:rFonts w:hint="default"/>
+      </w:rPr>
+    </w:lvl>
+    <w:lvl w:ilvl="3" w:tplc="0409000F" w:tentative="1">
+      <w:start w:val="1"/>
+      <w:numFmt w:val="decimal"/>
+      <w:lvlText w:val="%4."/>
+      <w:lvlJc w:val="left"/>
+      <w:pPr>
+        <w:ind w:left="2880" w:hanging="360"/>
+      </w:pPr>
+    </w:lvl>
+    <w:lvl w:ilvl="4" w:tplc="04090019" w:tentative="1">
+      <w:start w:val="1"/>
+      <w:numFmt w:val="lowerLetter"/>
+      <w:lvlText w:val="%5."/>
+      <w:lvlJc w:val="left"/>
+      <w:pPr>
+        <w:ind w:left="3600" w:hanging="360"/>
+      </w:pPr>
+    </w:lvl>
+    <w:lvl w:ilvl="5" w:tplc="0409001B" w:tentative="1">
+      <w:start w:val="1"/>
+      <w:numFmt w:val="lowerRoman"/>
+      <w:lvlText w:val="%6."/>
+      <w:lvlJc w:val="right"/>
+      <w:pPr>
+        <w:ind w:left="4320" w:hanging="180"/>
+      </w:pPr>
+    </w:lvl>
+    <w:lvl w:ilvl="6" w:tplc="0409000F" w:tentative="1">
+      <w:start w:val="1"/>
+      <w:numFmt w:val="decimal"/>
+      <w:lvlText w:val="%7."/>
+      <w:lvlJc w:val="left"/>
+      <w:pPr>
+        <w:ind w:left="5040" w:hanging="360"/>
+      </w:pPr>
+    </w:lvl>
+    <w:lvl w:ilvl="7" w:tplc="04090019" w:tentative="1">
+      <w:start w:val="1"/>
+      <w:numFmt w:val="lowerLetter"/>
+      <w:lvlText w:val="%8."/>
+      <w:lvlJc w:val="left"/>
+      <w:pPr>
+        <w:ind w:left="5760" w:hanging="360"/>
+      </w:pPr>
+    </w:lvl>
+    <w:lvl w:ilvl="8" w:tplc="0409001B" w:tentative="1">
+      <w:start w:val="1"/>
+      <w:numFmt w:val="lowerRoman"/>
+      <w:lvlText w:val="%9."/>
+      <w:lvlJc w:val="right"/>
+      <w:pPr>
+        <w:ind w:left="6480" w:hanging="180"/>
+      </w:pPr>
+    </w:lvl>
+  </w:abstractNum>
+  <w:abstractNum w:abstractNumId="1" w15:restartNumberingAfterBreak="0">
+    <w:nsid w:val="23AF3485"/>
+    <w:multiLevelType w:val="hybridMultilevel"/>
+    <w:tmpl w:val="B31A9BA2"/>
+    <w:lvl w:ilvl="0" w:tplc="F6B03E56">
+      <w:start w:val="1"/>
+      <w:numFmt w:val="upperLetter"/>
+      <w:lvlText w:val="%1."/>
+      <w:lvlJc w:val="left"/>
+      <w:pPr>
+        <w:ind w:left="1440" w:hanging="360"/>
+      </w:pPr>
+      <w:rPr>
+        <w:rFonts w:hint="default"/>
+      </w:rPr>
+    </w:lvl>
+    <w:lvl w:ilvl="1" w:tplc="04090019">
+      <w:start w:val="1"/>
+      <w:numFmt w:val="lowerLetter"/>
+      <w:lvlText w:val="%2."/>
+      <w:lvlJc w:val="left"/>
+      <w:pPr>
+        <w:ind w:left="2160" w:hanging="360"/>
+      </w:pPr>
+    </w:lvl>
+    <w:lvl w:ilvl="2" w:tplc="0409001B">
       <w:start w:val="1"/>
       <w:numFmt w:val="lowerRoman"/>
       <w:lvlText w:val="%3."/>
       <w:lvlJc w:val="right"/>
       <w:pPr>
-        <w:ind w:left="2160" w:hanging="180"/>
+        <w:ind w:left="2880" w:hanging="180"/>
       </w:pPr>
     </w:lvl>
     <w:lvl w:ilvl="3" w:tplc="0409000F" w:tentative="1">
@@ -2046,7 +2725,7 @@
       <w:lvlText w:val="%4."/>
       <w:lvlJc w:val="left"/>
       <w:pPr>
-        <w:ind w:left="2880" w:hanging="360"/>
+        <w:ind w:left="3600" w:hanging="360"/>
       </w:pPr>
     </w:lvl>
     <w:lvl w:ilvl="4" w:tplc="04090019" w:tentative="1">
@@ -2055,7 +2734,7 @@
       <w:lvlText w:val="%5."/>
       <w:lvlJc w:val="left"/>
       <w:pPr>
-        <w:ind w:left="3600" w:hanging="360"/>
+        <w:ind w:left="4320" w:hanging="360"/>
       </w:pPr>
     </w:lvl>
     <w:lvl w:ilvl="5" w:tplc="0409001B" w:tentative="1">
@@ -2064,7 +2743,7 @@
       <w:lvlText w:val="%6."/>
       <w:lvlJc w:val="right"/>
       <w:pPr>
-        <w:ind w:left="4320" w:hanging="180"/>
+        <w:ind w:left="5040" w:hanging="180"/>
       </w:pPr>
     </w:lvl>
     <w:lvl w:ilvl="6" w:tplc="0409000F" w:tentative="1">
@@ -2073,7 +2752,7 @@
       <w:lvlText w:val="%7."/>
       <w:lvlJc w:val="left"/>
       <w:pPr>
-        <w:ind w:left="5040" w:hanging="360"/>
+        <w:ind w:left="5760" w:hanging="360"/>
       </w:pPr>
     </w:lvl>
     <w:lvl w:ilvl="7" w:tplc="04090019" w:tentative="1">
@@ -2082,7 +2761,7 @@
       <w:lvlText w:val="%8."/>
       <w:lvlJc w:val="left"/>
       <w:pPr>
-        <w:ind w:left="5760" w:hanging="360"/>
+        <w:ind w:left="6480" w:hanging="360"/>
       </w:pPr>
     </w:lvl>
     <w:lvl w:ilvl="8" w:tplc="0409001B" w:tentative="1">
@@ -2091,11 +2770,100 @@
       <w:lvlText w:val="%9."/>
       <w:lvlJc w:val="right"/>
       <w:pPr>
-        <w:ind w:left="6480" w:hanging="180"/>
+        <w:ind w:left="7200" w:hanging="180"/>
       </w:pPr>
     </w:lvl>
   </w:abstractNum>
-  <w:abstractNum w:abstractNumId="1" w15:restartNumberingAfterBreak="0">
+  <w:abstractNum w:abstractNumId="2" w15:restartNumberingAfterBreak="0">
+    <w:nsid w:val="36FA606A"/>
+    <w:multiLevelType w:val="hybridMultilevel"/>
+    <w:tmpl w:val="36E0B5FE"/>
+    <w:lvl w:ilvl="0" w:tplc="8E4C6A8E">
+      <w:start w:val="1"/>
+      <w:numFmt w:val="lowerLetter"/>
+      <w:lvlText w:val="%1)"/>
+      <w:lvlJc w:val="left"/>
+      <w:pPr>
+        <w:ind w:left="2520" w:hanging="360"/>
+      </w:pPr>
+      <w:rPr>
+        <w:rFonts w:hint="default"/>
+      </w:rPr>
+    </w:lvl>
+    <w:lvl w:ilvl="1" w:tplc="04090019" w:tentative="1">
+      <w:start w:val="1"/>
+      <w:numFmt w:val="lowerLetter"/>
+      <w:lvlText w:val="%2."/>
+      <w:lvlJc w:val="left"/>
+      <w:pPr>
+        <w:ind w:left="3240" w:hanging="360"/>
+      </w:pPr>
+    </w:lvl>
+    <w:lvl w:ilvl="2" w:tplc="0409001B" w:tentative="1">
+      <w:start w:val="1"/>
+      <w:numFmt w:val="lowerRoman"/>
+      <w:lvlText w:val="%3."/>
+      <w:lvlJc w:val="right"/>
+      <w:pPr>
+        <w:ind w:left="3960" w:hanging="180"/>
+      </w:pPr>
+    </w:lvl>
+    <w:lvl w:ilvl="3" w:tplc="0409000F" w:tentative="1">
+      <w:start w:val="1"/>
+      <w:numFmt w:val="decimal"/>
+      <w:lvlText w:val="%4."/>
+      <w:lvlJc w:val="left"/>
+      <w:pPr>
+        <w:ind w:left="4680" w:hanging="360"/>
+      </w:pPr>
+    </w:lvl>
+    <w:lvl w:ilvl="4" w:tplc="04090019" w:tentative="1">
+      <w:start w:val="1"/>
+      <w:numFmt w:val="lowerLetter"/>
+      <w:lvlText w:val="%5."/>
+      <w:lvlJc w:val="left"/>
+      <w:pPr>
+        <w:ind w:left="5400" w:hanging="360"/>
+      </w:pPr>
+    </w:lvl>
+    <w:lvl w:ilvl="5" w:tplc="0409001B" w:tentative="1">
+      <w:start w:val="1"/>
+      <w:numFmt w:val="lowerRoman"/>
+      <w:lvlText w:val="%6."/>
+      <w:lvlJc w:val="right"/>
+      <w:pPr>
+        <w:ind w:left="6120" w:hanging="180"/>
+      </w:pPr>
+    </w:lvl>
+    <w:lvl w:ilvl="6" w:tplc="0409000F" w:tentative="1">
+      <w:start w:val="1"/>
+      <w:numFmt w:val="decimal"/>
+      <w:lvlText w:val="%7."/>
+      <w:lvlJc w:val="left"/>
+      <w:pPr>
+        <w:ind w:left="6840" w:hanging="360"/>
+      </w:pPr>
+    </w:lvl>
+    <w:lvl w:ilvl="7" w:tplc="04090019" w:tentative="1">
+      <w:start w:val="1"/>
+      <w:numFmt w:val="lowerLetter"/>
+      <w:lvlText w:val="%8."/>
+      <w:lvlJc w:val="left"/>
+      <w:pPr>
+        <w:ind w:left="7560" w:hanging="360"/>
+      </w:pPr>
+    </w:lvl>
+    <w:lvl w:ilvl="8" w:tplc="0409001B" w:tentative="1">
+      <w:start w:val="1"/>
+      <w:numFmt w:val="lowerRoman"/>
+      <w:lvlText w:val="%9."/>
+      <w:lvlJc w:val="right"/>
+      <w:pPr>
+        <w:ind w:left="8280" w:hanging="180"/>
+      </w:pPr>
+    </w:lvl>
+  </w:abstractNum>
+  <w:abstractNum w:abstractNumId="3" w15:restartNumberingAfterBreak="0">
     <w:nsid w:val="4BDB49DB"/>
     <w:multiLevelType w:val="hybridMultilevel"/>
     <w:tmpl w:val="7A160A20"/>
@@ -2184,7 +2952,96 @@
       </w:pPr>
     </w:lvl>
   </w:abstractNum>
-  <w:abstractNum w:abstractNumId="2" w15:restartNumberingAfterBreak="0">
+  <w:abstractNum w:abstractNumId="4" w15:restartNumberingAfterBreak="0">
+    <w:nsid w:val="7654400F"/>
+    <w:multiLevelType w:val="hybridMultilevel"/>
+    <w:tmpl w:val="4748F1C0"/>
+    <w:lvl w:ilvl="0" w:tplc="761EC962">
+      <w:start w:val="1"/>
+      <w:numFmt w:val="upperLetter"/>
+      <w:lvlText w:val="%1."/>
+      <w:lvlJc w:val="left"/>
+      <w:pPr>
+        <w:ind w:left="1440" w:hanging="360"/>
+      </w:pPr>
+      <w:rPr>
+        <w:rFonts w:hint="default"/>
+      </w:rPr>
+    </w:lvl>
+    <w:lvl w:ilvl="1" w:tplc="04090019">
+      <w:start w:val="1"/>
+      <w:numFmt w:val="lowerLetter"/>
+      <w:lvlText w:val="%2."/>
+      <w:lvlJc w:val="left"/>
+      <w:pPr>
+        <w:ind w:left="2160" w:hanging="360"/>
+      </w:pPr>
+    </w:lvl>
+    <w:lvl w:ilvl="2" w:tplc="0409001B">
+      <w:start w:val="1"/>
+      <w:numFmt w:val="lowerRoman"/>
+      <w:lvlText w:val="%3."/>
+      <w:lvlJc w:val="right"/>
+      <w:pPr>
+        <w:ind w:left="2880" w:hanging="180"/>
+      </w:pPr>
+    </w:lvl>
+    <w:lvl w:ilvl="3" w:tplc="0409000F" w:tentative="1">
+      <w:start w:val="1"/>
+      <w:numFmt w:val="decimal"/>
+      <w:lvlText w:val="%4."/>
+      <w:lvlJc w:val="left"/>
+      <w:pPr>
+        <w:ind w:left="3600" w:hanging="360"/>
+      </w:pPr>
+    </w:lvl>
+    <w:lvl w:ilvl="4" w:tplc="04090019" w:tentative="1">
+      <w:start w:val="1"/>
+      <w:numFmt w:val="lowerLetter"/>
+      <w:lvlText w:val="%5."/>
+      <w:lvlJc w:val="left"/>
+      <w:pPr>
+        <w:ind w:left="4320" w:hanging="360"/>
+      </w:pPr>
+    </w:lvl>
+    <w:lvl w:ilvl="5" w:tplc="0409001B" w:tentative="1">
+      <w:start w:val="1"/>
+      <w:numFmt w:val="lowerRoman"/>
+      <w:lvlText w:val="%6."/>
+      <w:lvlJc w:val="right"/>
+      <w:pPr>
+        <w:ind w:left="5040" w:hanging="180"/>
+      </w:pPr>
+    </w:lvl>
+    <w:lvl w:ilvl="6" w:tplc="0409000F" w:tentative="1">
+      <w:start w:val="1"/>
+      <w:numFmt w:val="decimal"/>
+      <w:lvlText w:val="%7."/>
+      <w:lvlJc w:val="left"/>
+      <w:pPr>
+        <w:ind w:left="5760" w:hanging="360"/>
+      </w:pPr>
+    </w:lvl>
+    <w:lvl w:ilvl="7" w:tplc="04090019" w:tentative="1">
+      <w:start w:val="1"/>
+      <w:numFmt w:val="lowerLetter"/>
+      <w:lvlText w:val="%8."/>
+      <w:lvlJc w:val="left"/>
+      <w:pPr>
+        <w:ind w:left="6480" w:hanging="360"/>
+      </w:pPr>
+    </w:lvl>
+    <w:lvl w:ilvl="8" w:tplc="0409001B" w:tentative="1">
+      <w:start w:val="1"/>
+      <w:numFmt w:val="lowerRoman"/>
+      <w:lvlText w:val="%9."/>
+      <w:lvlJc w:val="right"/>
+      <w:pPr>
+        <w:ind w:left="7200" w:hanging="180"/>
+      </w:pPr>
+    </w:lvl>
+  </w:abstractNum>
+  <w:abstractNum w:abstractNumId="5" w15:restartNumberingAfterBreak="0">
     <w:nsid w:val="77C505ED"/>
     <w:multiLevelType w:val="hybridMultilevel"/>
     <w:tmpl w:val="9D847BBC"/>
@@ -2300,10 +3157,19 @@
     <w:abstractNumId w:val="0"/>
   </w:num>
   <w:num w:numId="2" w16cid:durableId="1077285924">
-    <w:abstractNumId w:val="2"/>
+    <w:abstractNumId w:val="5"/>
   </w:num>
   <w:num w:numId="3" w16cid:durableId="756291988">
+    <w:abstractNumId w:val="3"/>
+  </w:num>
+  <w:num w:numId="4" w16cid:durableId="1821463091">
+    <w:abstractNumId w:val="4"/>
+  </w:num>
+  <w:num w:numId="5" w16cid:durableId="959337977">
     <w:abstractNumId w:val="1"/>
+  </w:num>
+  <w:num w:numId="6" w16cid:durableId="2035501572">
+    <w:abstractNumId w:val="2"/>
   </w:num>
 </w:numbering>
 </file>

</xml_diff>

<commit_message>
Smoothed out some UI animations, improved the layout and terminology used throughout the interface, added some more documentation.
</commit_message>
<xml_diff>
--- a/documents/User_Guide.docx
+++ b/documents/User_Guide.docx
@@ -10,7 +10,7 @@
         <mc:AlternateContent>
           <mc:Choice Requires="wps">
             <w:drawing>
-              <wp:anchor distT="45720" distB="45720" distL="114300" distR="114300" simplePos="0" relativeHeight="251664384" behindDoc="0" locked="0" layoutInCell="1" allowOverlap="1" wp14:anchorId="6E5BDD0A" wp14:editId="0906096C">
+              <wp:anchor distT="45720" distB="45720" distL="114300" distR="114300" simplePos="0" relativeHeight="251663360" behindDoc="0" locked="0" layoutInCell="1" allowOverlap="1" wp14:anchorId="6E5BDD0A" wp14:editId="7DFF633A">
                 <wp:simplePos x="0" y="0"/>
                 <wp:positionH relativeFrom="margin">
                   <wp:align>right</wp:align>
@@ -94,7 +94,7 @@
                 <v:stroke joinstyle="miter"/>
                 <v:path gradientshapeok="t" o:connecttype="rect"/>
               </v:shapetype>
-              <v:shape id="Text Box 2" o:spid="_x0000_s1026" type="#_x0000_t202" style="position:absolute;margin-left:66.85pt;margin-top:650.1pt;width:118.05pt;height:110.6pt;z-index:251664384;visibility:visible;mso-wrap-style:square;mso-width-percent:0;mso-height-percent:200;mso-wrap-distance-left:9pt;mso-wrap-distance-top:3.6pt;mso-wrap-distance-right:9pt;mso-wrap-distance-bottom:3.6pt;mso-position-horizontal:right;mso-position-horizontal-relative:margin;mso-position-vertical:absolute;mso-position-vertical-relative:text;mso-width-percent:0;mso-height-percent:200;mso-width-relative:margin;mso-height-relative:margin;v-text-anchor:middle" o:gfxdata="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" stroked="f">
+              <v:shape id="Text Box 2" o:spid="_x0000_s1026" type="#_x0000_t202" style="position:absolute;margin-left:66.85pt;margin-top:650.1pt;width:118.05pt;height:110.6pt;z-index:251663360;visibility:visible;mso-wrap-style:square;mso-width-percent:0;mso-height-percent:200;mso-wrap-distance-left:9pt;mso-wrap-distance-top:3.6pt;mso-wrap-distance-right:9pt;mso-wrap-distance-bottom:3.6pt;mso-position-horizontal:right;mso-position-horizontal-relative:margin;mso-position-vertical:absolute;mso-position-vertical-relative:text;mso-width-percent:0;mso-height-percent:200;mso-width-relative:margin;mso-height-relative:margin;v-text-anchor:middle" o:gfxdata="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" stroked="f">
                 <v:textbox style="mso-fit-shape-to-text:t">
                   <w:txbxContent>
                     <w:p>
@@ -132,7 +132,7 @@
         <mc:AlternateContent>
           <mc:Choice Requires="wps">
             <w:drawing>
-              <wp:anchor distT="45720" distB="45720" distL="114300" distR="114300" simplePos="0" relativeHeight="251662336" behindDoc="0" locked="0" layoutInCell="1" allowOverlap="1" wp14:anchorId="446158E6" wp14:editId="0A67BC29">
+              <wp:anchor distT="45720" distB="45720" distL="114300" distR="114300" simplePos="0" relativeHeight="251661312" behindDoc="0" locked="0" layoutInCell="1" allowOverlap="1" wp14:anchorId="446158E6" wp14:editId="4DCE4A26">
                 <wp:simplePos x="0" y="0"/>
                 <wp:positionH relativeFrom="margin">
                   <wp:align>center</wp:align>
@@ -216,7 +216,7 @@
           </mc:Choice>
           <mc:Fallback>
             <w:pict>
-              <v:shape w14:anchorId="446158E6" id="_x0000_s1027" type="#_x0000_t202" style="position:absolute;margin-left:0;margin-top:518.1pt;width:300.95pt;height:110.6pt;z-index:251662336;visibility:visible;mso-wrap-style:square;mso-width-percent:0;mso-height-percent:200;mso-wrap-distance-left:9pt;mso-wrap-distance-top:3.6pt;mso-wrap-distance-right:9pt;mso-wrap-distance-bottom:3.6pt;mso-position-horizontal:center;mso-position-horizontal-relative:margin;mso-position-vertical:absolute;mso-position-vertical-relative:text;mso-width-percent:0;mso-height-percent:200;mso-width-relative:margin;mso-height-relative:margin;v-text-anchor:top" o:gfxdata="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" stroked="f">
+              <v:shape w14:anchorId="446158E6" id="_x0000_s1027" type="#_x0000_t202" style="position:absolute;margin-left:0;margin-top:518.1pt;width:300.95pt;height:110.6pt;z-index:251661312;visibility:visible;mso-wrap-style:square;mso-width-percent:0;mso-height-percent:200;mso-wrap-distance-left:9pt;mso-wrap-distance-top:3.6pt;mso-wrap-distance-right:9pt;mso-wrap-distance-bottom:3.6pt;mso-position-horizontal:center;mso-position-horizontal-relative:margin;mso-position-vertical:absolute;mso-position-vertical-relative:text;mso-width-percent:0;mso-height-percent:200;mso-width-relative:margin;mso-height-relative:margin;v-text-anchor:top" o:gfxdata="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" stroked="f">
                 <v:textbox style="mso-fit-shape-to-text:t">
                   <w:txbxContent>
                     <w:p>
@@ -258,7 +258,7 @@
         <mc:AlternateContent>
           <mc:Choice Requires="wps">
             <w:drawing>
-              <wp:anchor distT="45720" distB="45720" distL="114300" distR="114300" simplePos="0" relativeHeight="251660288" behindDoc="0" locked="0" layoutInCell="1" allowOverlap="1" wp14:anchorId="5D0A6D6B" wp14:editId="6AC7E17E">
+              <wp:anchor distT="45720" distB="45720" distL="114300" distR="114300" simplePos="0" relativeHeight="251659264" behindDoc="0" locked="0" layoutInCell="1" allowOverlap="1" wp14:anchorId="5D0A6D6B" wp14:editId="4499729A">
                 <wp:simplePos x="0" y="0"/>
                 <wp:positionH relativeFrom="column">
                   <wp:posOffset>2296245</wp:posOffset>
@@ -356,7 +356,7 @@
           </mc:Choice>
           <mc:Fallback>
             <w:pict>
-              <v:shape w14:anchorId="5D0A6D6B" id="_x0000_s1028" type="#_x0000_t202" style="position:absolute;margin-left:180.8pt;margin-top:278.1pt;width:300.95pt;height:110.6pt;z-index:251660288;visibility:visible;mso-wrap-style:square;mso-width-percent:0;mso-height-percent:200;mso-wrap-distance-left:9pt;mso-wrap-distance-top:3.6pt;mso-wrap-distance-right:9pt;mso-wrap-distance-bottom:3.6pt;mso-position-horizontal:absolute;mso-position-horizontal-relative:text;mso-position-vertical:absolute;mso-position-vertical-relative:text;mso-width-percent:0;mso-height-percent:200;mso-width-relative:margin;mso-height-relative:margin;v-text-anchor:top" o:gfxdata="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" stroked="f">
+              <v:shape w14:anchorId="5D0A6D6B" id="_x0000_s1028" type="#_x0000_t202" style="position:absolute;margin-left:180.8pt;margin-top:278.1pt;width:300.95pt;height:110.6pt;z-index:251659264;visibility:visible;mso-wrap-style:square;mso-width-percent:0;mso-height-percent:200;mso-wrap-distance-left:9pt;mso-wrap-distance-top:3.6pt;mso-wrap-distance-right:9pt;mso-wrap-distance-bottom:3.6pt;mso-position-horizontal:absolute;mso-position-horizontal-relative:text;mso-position-vertical:absolute;mso-position-vertical-relative:text;mso-width-percent:0;mso-height-percent:200;mso-width-relative:margin;mso-height-relative:margin;v-text-anchor:top" o:gfxdata="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" stroked="f">
                 <v:textbox style="mso-fit-shape-to-text:t">
                   <w:txbxContent>
                     <w:p>
@@ -410,7 +410,7 @@
           <w:noProof/>
         </w:rPr>
         <w:drawing>
-          <wp:anchor distT="0" distB="0" distL="114300" distR="114300" simplePos="0" relativeHeight="251658240" behindDoc="0" locked="0" layoutInCell="1" allowOverlap="1" wp14:anchorId="504BF5B5" wp14:editId="7F58EC08">
+          <wp:anchor distT="0" distB="0" distL="114300" distR="114300" simplePos="0" relativeHeight="251657216" behindDoc="0" locked="0" layoutInCell="1" allowOverlap="1" wp14:anchorId="504BF5B5" wp14:editId="18DBD57A">
             <wp:simplePos x="0" y="0"/>
             <wp:positionH relativeFrom="margin">
               <wp:posOffset>-230659</wp:posOffset>
@@ -516,6 +516,7 @@
               <w:tab w:val="right" w:leader="dot" w:pos="9062"/>
             </w:tabs>
             <w:rPr>
+              <w:rFonts w:eastAsiaTheme="minorEastAsia"/>
               <w:noProof/>
             </w:rPr>
           </w:pPr>
@@ -528,7 +529,7 @@
           <w:r>
             <w:fldChar w:fldCharType="separate"/>
           </w:r>
-          <w:hyperlink w:anchor="_Toc207369607" w:history="1">
+          <w:hyperlink w:anchor="_Toc209097671" w:history="1">
             <w:r>
               <w:rPr>
                 <w:rStyle w:val="Hyperlink"/>
@@ -539,6 +540,7 @@
             </w:r>
             <w:r>
               <w:rPr>
+                <w:rFonts w:eastAsiaTheme="minorEastAsia"/>
                 <w:noProof/>
               </w:rPr>
               <w:tab/>
@@ -570,7 +572,7 @@
                 <w:noProof/>
                 <w:webHidden/>
               </w:rPr>
-              <w:instrText xml:space="preserve"> PAGEREF _Toc207369607 \h </w:instrText>
+              <w:instrText xml:space="preserve"> PAGEREF _Toc209097671 \h </w:instrText>
             </w:r>
             <w:r>
               <w:rPr>
@@ -590,7 +592,7 @@
                 <w:noProof/>
                 <w:webHidden/>
               </w:rPr>
-              <w:t>2</w:t>
+              <w:t>3</w:t>
             </w:r>
             <w:r>
               <w:rPr>
@@ -609,10 +611,11 @@
               <w:tab w:val="right" w:leader="dot" w:pos="9062"/>
             </w:tabs>
             <w:rPr>
+              <w:rFonts w:eastAsiaTheme="minorEastAsia"/>
               <w:noProof/>
             </w:rPr>
           </w:pPr>
-          <w:hyperlink w:anchor="_Toc207369608" w:history="1">
+          <w:hyperlink w:anchor="_Toc209097672" w:history="1">
             <w:r>
               <w:rPr>
                 <w:rStyle w:val="Hyperlink"/>
@@ -622,6 +625,7 @@
             </w:r>
             <w:r>
               <w:rPr>
+                <w:rFonts w:eastAsiaTheme="minorEastAsia"/>
                 <w:noProof/>
               </w:rPr>
               <w:tab/>
@@ -652,7 +656,7 @@
                 <w:noProof/>
                 <w:webHidden/>
               </w:rPr>
-              <w:instrText xml:space="preserve"> PAGEREF _Toc207369608 \h </w:instrText>
+              <w:instrText xml:space="preserve"> PAGEREF _Toc209097672 \h </w:instrText>
             </w:r>
             <w:r>
               <w:rPr>
@@ -672,7 +676,171 @@
                 <w:noProof/>
                 <w:webHidden/>
               </w:rPr>
-              <w:t>2</w:t>
+              <w:t>3</w:t>
+            </w:r>
+            <w:r>
+              <w:rPr>
+                <w:noProof/>
+                <w:webHidden/>
+              </w:rPr>
+              <w:fldChar w:fldCharType="end"/>
+            </w:r>
+          </w:hyperlink>
+        </w:p>
+        <w:p>
+          <w:pPr>
+            <w:pStyle w:val="TOC2"/>
+            <w:tabs>
+              <w:tab w:val="left" w:pos="720"/>
+              <w:tab w:val="right" w:leader="dot" w:pos="9062"/>
+            </w:tabs>
+            <w:rPr>
+              <w:noProof/>
+            </w:rPr>
+          </w:pPr>
+          <w:hyperlink w:anchor="_Toc209097673" w:history="1">
+            <w:r>
+              <w:rPr>
+                <w:rStyle w:val="Hyperlink"/>
+                <w:noProof/>
+              </w:rPr>
+              <w:t>A.</w:t>
+            </w:r>
+            <w:r>
+              <w:rPr>
+                <w:noProof/>
+              </w:rPr>
+              <w:tab/>
+            </w:r>
+            <w:r>
+              <w:rPr>
+                <w:rStyle w:val="Hyperlink"/>
+                <w:noProof/>
+              </w:rPr>
+              <w:t>Data Acquisition</w:t>
+            </w:r>
+            <w:r>
+              <w:rPr>
+                <w:noProof/>
+                <w:webHidden/>
+              </w:rPr>
+              <w:tab/>
+            </w:r>
+            <w:r>
+              <w:rPr>
+                <w:noProof/>
+                <w:webHidden/>
+              </w:rPr>
+              <w:fldChar w:fldCharType="begin"/>
+            </w:r>
+            <w:r>
+              <w:rPr>
+                <w:noProof/>
+                <w:webHidden/>
+              </w:rPr>
+              <w:instrText xml:space="preserve"> PAGEREF _Toc209097673 \h </w:instrText>
+            </w:r>
+            <w:r>
+              <w:rPr>
+                <w:noProof/>
+                <w:webHidden/>
+              </w:rPr>
+            </w:r>
+            <w:r>
+              <w:rPr>
+                <w:noProof/>
+                <w:webHidden/>
+              </w:rPr>
+              <w:fldChar w:fldCharType="separate"/>
+            </w:r>
+            <w:r>
+              <w:rPr>
+                <w:noProof/>
+                <w:webHidden/>
+              </w:rPr>
+              <w:t>3</w:t>
+            </w:r>
+            <w:r>
+              <w:rPr>
+                <w:noProof/>
+                <w:webHidden/>
+              </w:rPr>
+              <w:fldChar w:fldCharType="end"/>
+            </w:r>
+          </w:hyperlink>
+        </w:p>
+        <w:p>
+          <w:pPr>
+            <w:pStyle w:val="TOC2"/>
+            <w:tabs>
+              <w:tab w:val="left" w:pos="720"/>
+              <w:tab w:val="right" w:leader="dot" w:pos="9062"/>
+            </w:tabs>
+            <w:rPr>
+              <w:noProof/>
+            </w:rPr>
+          </w:pPr>
+          <w:hyperlink w:anchor="_Toc209097674" w:history="1">
+            <w:r>
+              <w:rPr>
+                <w:rStyle w:val="Hyperlink"/>
+                <w:noProof/>
+              </w:rPr>
+              <w:t>B.</w:t>
+            </w:r>
+            <w:r>
+              <w:rPr>
+                <w:noProof/>
+              </w:rPr>
+              <w:tab/>
+            </w:r>
+            <w:r>
+              <w:rPr>
+                <w:rStyle w:val="Hyperlink"/>
+                <w:noProof/>
+              </w:rPr>
+              <w:t>Data Processing</w:t>
+            </w:r>
+            <w:r>
+              <w:rPr>
+                <w:noProof/>
+                <w:webHidden/>
+              </w:rPr>
+              <w:tab/>
+            </w:r>
+            <w:r>
+              <w:rPr>
+                <w:noProof/>
+                <w:webHidden/>
+              </w:rPr>
+              <w:fldChar w:fldCharType="begin"/>
+            </w:r>
+            <w:r>
+              <w:rPr>
+                <w:noProof/>
+                <w:webHidden/>
+              </w:rPr>
+              <w:instrText xml:space="preserve"> PAGEREF _Toc209097674 \h </w:instrText>
+            </w:r>
+            <w:r>
+              <w:rPr>
+                <w:noProof/>
+                <w:webHidden/>
+              </w:rPr>
+            </w:r>
+            <w:r>
+              <w:rPr>
+                <w:noProof/>
+                <w:webHidden/>
+              </w:rPr>
+              <w:fldChar w:fldCharType="separate"/>
+            </w:r>
+            <w:r>
+              <w:rPr>
+                <w:noProof/>
+                <w:webHidden/>
+              </w:rPr>
+              <w:t>3</w:t>
             </w:r>
             <w:r>
               <w:rPr>
@@ -691,10 +859,11 @@
               <w:tab w:val="right" w:leader="dot" w:pos="9062"/>
             </w:tabs>
             <w:rPr>
+              <w:rFonts w:eastAsiaTheme="minorEastAsia"/>
               <w:noProof/>
             </w:rPr>
           </w:pPr>
-          <w:hyperlink w:anchor="_Toc207369609" w:history="1">
+          <w:hyperlink w:anchor="_Toc209097675" w:history="1">
             <w:r>
               <w:rPr>
                 <w:rStyle w:val="Hyperlink"/>
@@ -704,6 +873,7 @@
             </w:r>
             <w:r>
               <w:rPr>
+                <w:rFonts w:eastAsiaTheme="minorEastAsia"/>
                 <w:noProof/>
               </w:rPr>
               <w:tab/>
@@ -734,7 +904,7 @@
                 <w:noProof/>
                 <w:webHidden/>
               </w:rPr>
-              <w:instrText xml:space="preserve"> PAGEREF _Toc207369609 \h </w:instrText>
+              <w:instrText xml:space="preserve"> PAGEREF _Toc209097675 \h </w:instrText>
             </w:r>
             <w:r>
               <w:rPr>
@@ -754,7 +924,881 @@
                 <w:noProof/>
                 <w:webHidden/>
               </w:rPr>
-              <w:t>2</w:t>
+              <w:t>3</w:t>
+            </w:r>
+            <w:r>
+              <w:rPr>
+                <w:noProof/>
+                <w:webHidden/>
+              </w:rPr>
+              <w:fldChar w:fldCharType="end"/>
+            </w:r>
+          </w:hyperlink>
+        </w:p>
+        <w:p>
+          <w:pPr>
+            <w:pStyle w:val="TOC2"/>
+            <w:tabs>
+              <w:tab w:val="left" w:pos="720"/>
+              <w:tab w:val="right" w:leader="dot" w:pos="9062"/>
+            </w:tabs>
+            <w:rPr>
+              <w:noProof/>
+            </w:rPr>
+          </w:pPr>
+          <w:hyperlink w:anchor="_Toc209097676" w:history="1">
+            <w:r>
+              <w:rPr>
+                <w:rStyle w:val="Hyperlink"/>
+                <w:noProof/>
+              </w:rPr>
+              <w:t>A.</w:t>
+            </w:r>
+            <w:r>
+              <w:rPr>
+                <w:noProof/>
+              </w:rPr>
+              <w:tab/>
+            </w:r>
+            <w:r>
+              <w:rPr>
+                <w:rStyle w:val="Hyperlink"/>
+                <w:noProof/>
+              </w:rPr>
+              <w:t>Prerequisites</w:t>
+            </w:r>
+            <w:r>
+              <w:rPr>
+                <w:noProof/>
+                <w:webHidden/>
+              </w:rPr>
+              <w:tab/>
+            </w:r>
+            <w:r>
+              <w:rPr>
+                <w:noProof/>
+                <w:webHidden/>
+              </w:rPr>
+              <w:fldChar w:fldCharType="begin"/>
+            </w:r>
+            <w:r>
+              <w:rPr>
+                <w:noProof/>
+                <w:webHidden/>
+              </w:rPr>
+              <w:instrText xml:space="preserve"> PAGEREF _Toc209097676 \h </w:instrText>
+            </w:r>
+            <w:r>
+              <w:rPr>
+                <w:noProof/>
+                <w:webHidden/>
+              </w:rPr>
+            </w:r>
+            <w:r>
+              <w:rPr>
+                <w:noProof/>
+                <w:webHidden/>
+              </w:rPr>
+              <w:fldChar w:fldCharType="separate"/>
+            </w:r>
+            <w:r>
+              <w:rPr>
+                <w:noProof/>
+                <w:webHidden/>
+              </w:rPr>
+              <w:t>3</w:t>
+            </w:r>
+            <w:r>
+              <w:rPr>
+                <w:noProof/>
+                <w:webHidden/>
+              </w:rPr>
+              <w:fldChar w:fldCharType="end"/>
+            </w:r>
+          </w:hyperlink>
+        </w:p>
+        <w:p>
+          <w:pPr>
+            <w:pStyle w:val="TOC2"/>
+            <w:tabs>
+              <w:tab w:val="left" w:pos="720"/>
+              <w:tab w:val="right" w:leader="dot" w:pos="9062"/>
+            </w:tabs>
+            <w:rPr>
+              <w:noProof/>
+            </w:rPr>
+          </w:pPr>
+          <w:hyperlink w:anchor="_Toc209097677" w:history="1">
+            <w:r>
+              <w:rPr>
+                <w:rStyle w:val="Hyperlink"/>
+                <w:noProof/>
+              </w:rPr>
+              <w:t>B.</w:t>
+            </w:r>
+            <w:r>
+              <w:rPr>
+                <w:noProof/>
+              </w:rPr>
+              <w:tab/>
+            </w:r>
+            <w:r>
+              <w:rPr>
+                <w:rStyle w:val="Hyperlink"/>
+                <w:noProof/>
+              </w:rPr>
+              <w:t>Data Acquisition</w:t>
+            </w:r>
+            <w:r>
+              <w:rPr>
+                <w:noProof/>
+                <w:webHidden/>
+              </w:rPr>
+              <w:tab/>
+            </w:r>
+            <w:r>
+              <w:rPr>
+                <w:noProof/>
+                <w:webHidden/>
+              </w:rPr>
+              <w:fldChar w:fldCharType="begin"/>
+            </w:r>
+            <w:r>
+              <w:rPr>
+                <w:noProof/>
+                <w:webHidden/>
+              </w:rPr>
+              <w:instrText xml:space="preserve"> PAGEREF _Toc209097677 \h </w:instrText>
+            </w:r>
+            <w:r>
+              <w:rPr>
+                <w:noProof/>
+                <w:webHidden/>
+              </w:rPr>
+            </w:r>
+            <w:r>
+              <w:rPr>
+                <w:noProof/>
+                <w:webHidden/>
+              </w:rPr>
+              <w:fldChar w:fldCharType="separate"/>
+            </w:r>
+            <w:r>
+              <w:rPr>
+                <w:noProof/>
+                <w:webHidden/>
+              </w:rPr>
+              <w:t>4</w:t>
+            </w:r>
+            <w:r>
+              <w:rPr>
+                <w:noProof/>
+                <w:webHidden/>
+              </w:rPr>
+              <w:fldChar w:fldCharType="end"/>
+            </w:r>
+          </w:hyperlink>
+        </w:p>
+        <w:p>
+          <w:pPr>
+            <w:pStyle w:val="TOC3"/>
+            <w:tabs>
+              <w:tab w:val="left" w:pos="960"/>
+              <w:tab w:val="right" w:leader="dot" w:pos="9062"/>
+            </w:tabs>
+            <w:rPr>
+              <w:noProof/>
+            </w:rPr>
+          </w:pPr>
+          <w:hyperlink w:anchor="_Toc209097678" w:history="1">
+            <w:r>
+              <w:rPr>
+                <w:rStyle w:val="Hyperlink"/>
+                <w:noProof/>
+              </w:rPr>
+              <w:t>1)</w:t>
+            </w:r>
+            <w:r>
+              <w:rPr>
+                <w:noProof/>
+              </w:rPr>
+              <w:tab/>
+            </w:r>
+            <w:r>
+              <w:rPr>
+                <w:rStyle w:val="Hyperlink"/>
+                <w:noProof/>
+              </w:rPr>
+              <w:t>Mapping Mode panel</w:t>
+            </w:r>
+            <w:r>
+              <w:rPr>
+                <w:noProof/>
+                <w:webHidden/>
+              </w:rPr>
+              <w:tab/>
+            </w:r>
+            <w:r>
+              <w:rPr>
+                <w:noProof/>
+                <w:webHidden/>
+              </w:rPr>
+              <w:fldChar w:fldCharType="begin"/>
+            </w:r>
+            <w:r>
+              <w:rPr>
+                <w:noProof/>
+                <w:webHidden/>
+              </w:rPr>
+              <w:instrText xml:space="preserve"> PAGEREF _Toc209097678 \h </w:instrText>
+            </w:r>
+            <w:r>
+              <w:rPr>
+                <w:noProof/>
+                <w:webHidden/>
+              </w:rPr>
+            </w:r>
+            <w:r>
+              <w:rPr>
+                <w:noProof/>
+                <w:webHidden/>
+              </w:rPr>
+              <w:fldChar w:fldCharType="separate"/>
+            </w:r>
+            <w:r>
+              <w:rPr>
+                <w:noProof/>
+                <w:webHidden/>
+              </w:rPr>
+              <w:t>5</w:t>
+            </w:r>
+            <w:r>
+              <w:rPr>
+                <w:noProof/>
+                <w:webHidden/>
+              </w:rPr>
+              <w:fldChar w:fldCharType="end"/>
+            </w:r>
+          </w:hyperlink>
+        </w:p>
+        <w:p>
+          <w:pPr>
+            <w:pStyle w:val="TOC3"/>
+            <w:tabs>
+              <w:tab w:val="left" w:pos="960"/>
+              <w:tab w:val="right" w:leader="dot" w:pos="9062"/>
+            </w:tabs>
+            <w:rPr>
+              <w:noProof/>
+            </w:rPr>
+          </w:pPr>
+          <w:hyperlink w:anchor="_Toc209097679" w:history="1">
+            <w:r>
+              <w:rPr>
+                <w:rStyle w:val="Hyperlink"/>
+                <w:noProof/>
+              </w:rPr>
+              <w:t>2)</w:t>
+            </w:r>
+            <w:r>
+              <w:rPr>
+                <w:noProof/>
+              </w:rPr>
+              <w:tab/>
+            </w:r>
+            <w:r>
+              <w:rPr>
+                <w:rStyle w:val="Hyperlink"/>
+                <w:noProof/>
+              </w:rPr>
+              <w:t>Properties panel</w:t>
+            </w:r>
+            <w:r>
+              <w:rPr>
+                <w:noProof/>
+                <w:webHidden/>
+              </w:rPr>
+              <w:tab/>
+            </w:r>
+            <w:r>
+              <w:rPr>
+                <w:noProof/>
+                <w:webHidden/>
+              </w:rPr>
+              <w:fldChar w:fldCharType="begin"/>
+            </w:r>
+            <w:r>
+              <w:rPr>
+                <w:noProof/>
+                <w:webHidden/>
+              </w:rPr>
+              <w:instrText xml:space="preserve"> PAGEREF _Toc209097679 \h </w:instrText>
+            </w:r>
+            <w:r>
+              <w:rPr>
+                <w:noProof/>
+                <w:webHidden/>
+              </w:rPr>
+            </w:r>
+            <w:r>
+              <w:rPr>
+                <w:noProof/>
+                <w:webHidden/>
+              </w:rPr>
+              <w:fldChar w:fldCharType="separate"/>
+            </w:r>
+            <w:r>
+              <w:rPr>
+                <w:noProof/>
+                <w:webHidden/>
+              </w:rPr>
+              <w:t>5</w:t>
+            </w:r>
+            <w:r>
+              <w:rPr>
+                <w:noProof/>
+                <w:webHidden/>
+              </w:rPr>
+              <w:fldChar w:fldCharType="end"/>
+            </w:r>
+          </w:hyperlink>
+        </w:p>
+        <w:p>
+          <w:pPr>
+            <w:pStyle w:val="TOC3"/>
+            <w:tabs>
+              <w:tab w:val="left" w:pos="960"/>
+              <w:tab w:val="right" w:leader="dot" w:pos="9062"/>
+            </w:tabs>
+            <w:rPr>
+              <w:noProof/>
+            </w:rPr>
+          </w:pPr>
+          <w:hyperlink w:anchor="_Toc209097680" w:history="1">
+            <w:r>
+              <w:rPr>
+                <w:rStyle w:val="Hyperlink"/>
+                <w:noProof/>
+              </w:rPr>
+              <w:t>3)</w:t>
+            </w:r>
+            <w:r>
+              <w:rPr>
+                <w:noProof/>
+              </w:rPr>
+              <w:tab/>
+            </w:r>
+            <w:r>
+              <w:rPr>
+                <w:rStyle w:val="Hyperlink"/>
+                <w:noProof/>
+              </w:rPr>
+              <w:t>Robot panel</w:t>
+            </w:r>
+            <w:r>
+              <w:rPr>
+                <w:noProof/>
+                <w:webHidden/>
+              </w:rPr>
+              <w:tab/>
+            </w:r>
+            <w:r>
+              <w:rPr>
+                <w:noProof/>
+                <w:webHidden/>
+              </w:rPr>
+              <w:fldChar w:fldCharType="begin"/>
+            </w:r>
+            <w:r>
+              <w:rPr>
+                <w:noProof/>
+                <w:webHidden/>
+              </w:rPr>
+              <w:instrText xml:space="preserve"> PAGEREF _Toc209097680 \h </w:instrText>
+            </w:r>
+            <w:r>
+              <w:rPr>
+                <w:noProof/>
+                <w:webHidden/>
+              </w:rPr>
+            </w:r>
+            <w:r>
+              <w:rPr>
+                <w:noProof/>
+                <w:webHidden/>
+              </w:rPr>
+              <w:fldChar w:fldCharType="separate"/>
+            </w:r>
+            <w:r>
+              <w:rPr>
+                <w:noProof/>
+                <w:webHidden/>
+              </w:rPr>
+              <w:t>5</w:t>
+            </w:r>
+            <w:r>
+              <w:rPr>
+                <w:noProof/>
+                <w:webHidden/>
+              </w:rPr>
+              <w:fldChar w:fldCharType="end"/>
+            </w:r>
+          </w:hyperlink>
+        </w:p>
+        <w:p>
+          <w:pPr>
+            <w:pStyle w:val="TOC3"/>
+            <w:tabs>
+              <w:tab w:val="left" w:pos="960"/>
+              <w:tab w:val="right" w:leader="dot" w:pos="9062"/>
+            </w:tabs>
+            <w:rPr>
+              <w:noProof/>
+            </w:rPr>
+          </w:pPr>
+          <w:hyperlink w:anchor="_Toc209097681" w:history="1">
+            <w:r>
+              <w:rPr>
+                <w:rStyle w:val="Hyperlink"/>
+                <w:noProof/>
+              </w:rPr>
+              <w:t>4)</w:t>
+            </w:r>
+            <w:r>
+              <w:rPr>
+                <w:noProof/>
+              </w:rPr>
+              <w:tab/>
+            </w:r>
+            <w:r>
+              <w:rPr>
+                <w:rStyle w:val="Hyperlink"/>
+                <w:noProof/>
+              </w:rPr>
+              <w:t>Sensor panel</w:t>
+            </w:r>
+            <w:r>
+              <w:rPr>
+                <w:noProof/>
+                <w:webHidden/>
+              </w:rPr>
+              <w:tab/>
+            </w:r>
+            <w:r>
+              <w:rPr>
+                <w:noProof/>
+                <w:webHidden/>
+              </w:rPr>
+              <w:fldChar w:fldCharType="begin"/>
+            </w:r>
+            <w:r>
+              <w:rPr>
+                <w:noProof/>
+                <w:webHidden/>
+              </w:rPr>
+              <w:instrText xml:space="preserve"> PAGEREF _Toc209097681 \h </w:instrText>
+            </w:r>
+            <w:r>
+              <w:rPr>
+                <w:noProof/>
+                <w:webHidden/>
+              </w:rPr>
+            </w:r>
+            <w:r>
+              <w:rPr>
+                <w:noProof/>
+                <w:webHidden/>
+              </w:rPr>
+              <w:fldChar w:fldCharType="separate"/>
+            </w:r>
+            <w:r>
+              <w:rPr>
+                <w:noProof/>
+                <w:webHidden/>
+              </w:rPr>
+              <w:t>6</w:t>
+            </w:r>
+            <w:r>
+              <w:rPr>
+                <w:noProof/>
+                <w:webHidden/>
+              </w:rPr>
+              <w:fldChar w:fldCharType="end"/>
+            </w:r>
+          </w:hyperlink>
+        </w:p>
+        <w:p>
+          <w:pPr>
+            <w:pStyle w:val="TOC3"/>
+            <w:tabs>
+              <w:tab w:val="left" w:pos="960"/>
+              <w:tab w:val="right" w:leader="dot" w:pos="9062"/>
+            </w:tabs>
+            <w:rPr>
+              <w:noProof/>
+            </w:rPr>
+          </w:pPr>
+          <w:hyperlink w:anchor="_Toc209097682" w:history="1">
+            <w:r>
+              <w:rPr>
+                <w:rStyle w:val="Hyperlink"/>
+                <w:noProof/>
+              </w:rPr>
+              <w:t>5)</w:t>
+            </w:r>
+            <w:r>
+              <w:rPr>
+                <w:noProof/>
+              </w:rPr>
+              <w:tab/>
+            </w:r>
+            <w:r>
+              <w:rPr>
+                <w:rStyle w:val="Hyperlink"/>
+                <w:noProof/>
+              </w:rPr>
+              <w:t>Source panel</w:t>
+            </w:r>
+            <w:r>
+              <w:rPr>
+                <w:noProof/>
+                <w:webHidden/>
+              </w:rPr>
+              <w:tab/>
+            </w:r>
+            <w:r>
+              <w:rPr>
+                <w:noProof/>
+                <w:webHidden/>
+              </w:rPr>
+              <w:fldChar w:fldCharType="begin"/>
+            </w:r>
+            <w:r>
+              <w:rPr>
+                <w:noProof/>
+                <w:webHidden/>
+              </w:rPr>
+              <w:instrText xml:space="preserve"> PAGEREF _Toc209097682 \h </w:instrText>
+            </w:r>
+            <w:r>
+              <w:rPr>
+                <w:noProof/>
+                <w:webHidden/>
+              </w:rPr>
+            </w:r>
+            <w:r>
+              <w:rPr>
+                <w:noProof/>
+                <w:webHidden/>
+              </w:rPr>
+              <w:fldChar w:fldCharType="separate"/>
+            </w:r>
+            <w:r>
+              <w:rPr>
+                <w:noProof/>
+                <w:webHidden/>
+              </w:rPr>
+              <w:t>6</w:t>
+            </w:r>
+            <w:r>
+              <w:rPr>
+                <w:noProof/>
+                <w:webHidden/>
+              </w:rPr>
+              <w:fldChar w:fldCharType="end"/>
+            </w:r>
+          </w:hyperlink>
+        </w:p>
+        <w:p>
+          <w:pPr>
+            <w:pStyle w:val="TOC3"/>
+            <w:tabs>
+              <w:tab w:val="left" w:pos="960"/>
+              <w:tab w:val="right" w:leader="dot" w:pos="9062"/>
+            </w:tabs>
+            <w:rPr>
+              <w:noProof/>
+            </w:rPr>
+          </w:pPr>
+          <w:hyperlink w:anchor="_Toc209097683" w:history="1">
+            <w:r>
+              <w:rPr>
+                <w:rStyle w:val="Hyperlink"/>
+                <w:noProof/>
+              </w:rPr>
+              <w:t>6)</w:t>
+            </w:r>
+            <w:r>
+              <w:rPr>
+                <w:noProof/>
+              </w:rPr>
+              <w:tab/>
+            </w:r>
+            <w:r>
+              <w:rPr>
+                <w:rStyle w:val="Hyperlink"/>
+                <w:noProof/>
+              </w:rPr>
+              <w:t>Mass Spectrometer panel</w:t>
+            </w:r>
+            <w:r>
+              <w:rPr>
+                <w:noProof/>
+                <w:webHidden/>
+              </w:rPr>
+              <w:tab/>
+            </w:r>
+            <w:r>
+              <w:rPr>
+                <w:noProof/>
+                <w:webHidden/>
+              </w:rPr>
+              <w:fldChar w:fldCharType="begin"/>
+            </w:r>
+            <w:r>
+              <w:rPr>
+                <w:noProof/>
+                <w:webHidden/>
+              </w:rPr>
+              <w:instrText xml:space="preserve"> PAGEREF _Toc209097683 \h </w:instrText>
+            </w:r>
+            <w:r>
+              <w:rPr>
+                <w:noProof/>
+                <w:webHidden/>
+              </w:rPr>
+            </w:r>
+            <w:r>
+              <w:rPr>
+                <w:noProof/>
+                <w:webHidden/>
+              </w:rPr>
+              <w:fldChar w:fldCharType="separate"/>
+            </w:r>
+            <w:r>
+              <w:rPr>
+                <w:noProof/>
+                <w:webHidden/>
+              </w:rPr>
+              <w:t>6</w:t>
+            </w:r>
+            <w:r>
+              <w:rPr>
+                <w:noProof/>
+                <w:webHidden/>
+              </w:rPr>
+              <w:fldChar w:fldCharType="end"/>
+            </w:r>
+          </w:hyperlink>
+        </w:p>
+        <w:p>
+          <w:pPr>
+            <w:pStyle w:val="TOC2"/>
+            <w:tabs>
+              <w:tab w:val="left" w:pos="720"/>
+              <w:tab w:val="right" w:leader="dot" w:pos="9062"/>
+            </w:tabs>
+            <w:rPr>
+              <w:noProof/>
+            </w:rPr>
+          </w:pPr>
+          <w:hyperlink w:anchor="_Toc209097684" w:history="1">
+            <w:r>
+              <w:rPr>
+                <w:rStyle w:val="Hyperlink"/>
+                <w:noProof/>
+              </w:rPr>
+              <w:t>C.</w:t>
+            </w:r>
+            <w:r>
+              <w:rPr>
+                <w:noProof/>
+              </w:rPr>
+              <w:tab/>
+            </w:r>
+            <w:r>
+              <w:rPr>
+                <w:rStyle w:val="Hyperlink"/>
+                <w:noProof/>
+              </w:rPr>
+              <w:t>Data Processing</w:t>
+            </w:r>
+            <w:r>
+              <w:rPr>
+                <w:noProof/>
+                <w:webHidden/>
+              </w:rPr>
+              <w:tab/>
+            </w:r>
+            <w:r>
+              <w:rPr>
+                <w:noProof/>
+                <w:webHidden/>
+              </w:rPr>
+              <w:fldChar w:fldCharType="begin"/>
+            </w:r>
+            <w:r>
+              <w:rPr>
+                <w:noProof/>
+                <w:webHidden/>
+              </w:rPr>
+              <w:instrText xml:space="preserve"> PAGEREF _Toc209097684 \h </w:instrText>
+            </w:r>
+            <w:r>
+              <w:rPr>
+                <w:noProof/>
+                <w:webHidden/>
+              </w:rPr>
+            </w:r>
+            <w:r>
+              <w:rPr>
+                <w:noProof/>
+                <w:webHidden/>
+              </w:rPr>
+              <w:fldChar w:fldCharType="separate"/>
+            </w:r>
+            <w:r>
+              <w:rPr>
+                <w:noProof/>
+                <w:webHidden/>
+              </w:rPr>
+              <w:t>7</w:t>
+            </w:r>
+            <w:r>
+              <w:rPr>
+                <w:noProof/>
+                <w:webHidden/>
+              </w:rPr>
+              <w:fldChar w:fldCharType="end"/>
+            </w:r>
+          </w:hyperlink>
+        </w:p>
+        <w:p>
+          <w:pPr>
+            <w:pStyle w:val="TOC3"/>
+            <w:tabs>
+              <w:tab w:val="right" w:leader="dot" w:pos="9062"/>
+            </w:tabs>
+            <w:rPr>
+              <w:noProof/>
+            </w:rPr>
+          </w:pPr>
+          <w:hyperlink w:anchor="_Toc209097685" w:history="1">
+            <w:r>
+              <w:rPr>
+                <w:rStyle w:val="Hyperlink"/>
+                <w:noProof/>
+              </w:rPr>
+              <w:t>Project Structure</w:t>
+            </w:r>
+            <w:r>
+              <w:rPr>
+                <w:noProof/>
+                <w:webHidden/>
+              </w:rPr>
+              <w:tab/>
+            </w:r>
+            <w:r>
+              <w:rPr>
+                <w:noProof/>
+                <w:webHidden/>
+              </w:rPr>
+              <w:fldChar w:fldCharType="begin"/>
+            </w:r>
+            <w:r>
+              <w:rPr>
+                <w:noProof/>
+                <w:webHidden/>
+              </w:rPr>
+              <w:instrText xml:space="preserve"> PAGEREF _Toc209097685 \h </w:instrText>
+            </w:r>
+            <w:r>
+              <w:rPr>
+                <w:noProof/>
+                <w:webHidden/>
+              </w:rPr>
+            </w:r>
+            <w:r>
+              <w:rPr>
+                <w:noProof/>
+                <w:webHidden/>
+              </w:rPr>
+              <w:fldChar w:fldCharType="separate"/>
+            </w:r>
+            <w:r>
+              <w:rPr>
+                <w:noProof/>
+                <w:webHidden/>
+              </w:rPr>
+              <w:t>7</w:t>
+            </w:r>
+            <w:r>
+              <w:rPr>
+                <w:noProof/>
+                <w:webHidden/>
+              </w:rPr>
+              <w:fldChar w:fldCharType="end"/>
+            </w:r>
+          </w:hyperlink>
+        </w:p>
+        <w:p>
+          <w:pPr>
+            <w:pStyle w:val="TOC3"/>
+            <w:tabs>
+              <w:tab w:val="right" w:leader="dot" w:pos="9062"/>
+            </w:tabs>
+            <w:rPr>
+              <w:noProof/>
+            </w:rPr>
+          </w:pPr>
+          <w:hyperlink w:anchor="_Toc209097686" w:history="1">
+            <w:r>
+              <w:rPr>
+                <w:rStyle w:val="Hyperlink"/>
+                <w:noProof/>
+              </w:rPr>
+              <w:t>1. Generating a Mat file</w:t>
+            </w:r>
+            <w:r>
+              <w:rPr>
+                <w:noProof/>
+                <w:webHidden/>
+              </w:rPr>
+              <w:tab/>
+            </w:r>
+            <w:r>
+              <w:rPr>
+                <w:noProof/>
+                <w:webHidden/>
+              </w:rPr>
+              <w:fldChar w:fldCharType="begin"/>
+            </w:r>
+            <w:r>
+              <w:rPr>
+                <w:noProof/>
+                <w:webHidden/>
+              </w:rPr>
+              <w:instrText xml:space="preserve"> PAGEREF _Toc209097686 \h </w:instrText>
+            </w:r>
+            <w:r>
+              <w:rPr>
+                <w:noProof/>
+                <w:webHidden/>
+              </w:rPr>
+            </w:r>
+            <w:r>
+              <w:rPr>
+                <w:noProof/>
+                <w:webHidden/>
+              </w:rPr>
+              <w:fldChar w:fldCharType="separate"/>
+            </w:r>
+            <w:r>
+              <w:rPr>
+                <w:noProof/>
+                <w:webHidden/>
+              </w:rPr>
+              <w:t>7</w:t>
             </w:r>
             <w:r>
               <w:rPr>
@@ -794,7 +1838,7 @@
           <w:lang w:val="fr-FR"/>
         </w:rPr>
       </w:pPr>
-      <w:bookmarkStart w:id="0" w:name="_Toc207369607"/>
+      <w:bookmarkStart w:id="0" w:name="_Toc209097671"/>
       <w:r>
         <w:rPr>
           <w:lang w:val="fr-FR"/>
@@ -813,7 +1857,15 @@
         <w:t xml:space="preserve">STORM-MSI is </w:t>
       </w:r>
       <w:r>
-        <w:t>a mostly MatLab-based</w:t>
+        <w:t xml:space="preserve">a mostly </w:t>
+      </w:r>
+      <w:proofErr w:type="spellStart"/>
+      <w:r>
+        <w:t>MatLab</w:t>
+      </w:r>
+      <w:proofErr w:type="spellEnd"/>
+      <w:r>
+        <w:t>-based</w:t>
       </w:r>
       <w:r>
         <w:t xml:space="preserve"> open-</w:t>
@@ -834,7 +1886,7 @@
         </w:numPr>
         <w:outlineLvl w:val="0"/>
       </w:pPr>
-      <w:bookmarkStart w:id="1" w:name="_Toc207369608"/>
+      <w:bookmarkStart w:id="1" w:name="_Toc209097672"/>
       <w:r>
         <w:t>Features</w:t>
       </w:r>
@@ -849,9 +1901,11 @@
         </w:numPr>
         <w:outlineLvl w:val="1"/>
       </w:pPr>
+      <w:bookmarkStart w:id="2" w:name="_Toc209097673"/>
       <w:r>
         <w:t>Data Acquisition</w:t>
       </w:r>
+      <w:bookmarkEnd w:id="2"/>
     </w:p>
     <w:p>
       <w:pPr>
@@ -948,9 +2002,11 @@
         </w:numPr>
         <w:outlineLvl w:val="1"/>
       </w:pPr>
+      <w:bookmarkStart w:id="3" w:name="_Toc209097674"/>
       <w:r>
         <w:t>Data Processing</w:t>
       </w:r>
+      <w:bookmarkEnd w:id="3"/>
     </w:p>
     <w:p>
       <w:pPr>
@@ -958,7 +2014,23 @@
         <w:jc w:val="both"/>
       </w:pPr>
       <w:r>
-        <w:t>STORM-MSI also provides data processing capabilities, allowing data visualization, correction and exportation to three main formats through its interface. First, the mzML conversion acts as a gateway to the imZML format, which is commonly used in usual MSI data processing software.</w:t>
+        <w:t xml:space="preserve">STORM-MSI also provides data processing capabilities, allowing data visualization, correction and exportation to three main formats through its interface. First, the </w:t>
+      </w:r>
+      <w:proofErr w:type="spellStart"/>
+      <w:r>
+        <w:t>mzML</w:t>
+      </w:r>
+      <w:proofErr w:type="spellEnd"/>
+      <w:r>
+        <w:t xml:space="preserve"> conversion acts as a gateway to the </w:t>
+      </w:r>
+      <w:proofErr w:type="spellStart"/>
+      <w:r>
+        <w:t>imZML</w:t>
+      </w:r>
+      <w:proofErr w:type="spellEnd"/>
+      <w:r>
+        <w:t xml:space="preserve"> format, which is commonly used in usual MSI data processing software.</w:t>
       </w:r>
       <w:r>
         <w:t xml:space="preserve"> Data can also be exported as a </w:t>
@@ -971,7 +2043,15 @@
         <w:t>CSV</w:t>
       </w:r>
       <w:r>
-        <w:t xml:space="preserve"> file, which can be read using conventional tools such as Microsoft Excel and is what we commonly use for further data processing. </w:t>
+        <w:t xml:space="preserve"> file, which can be read using conventional tools such as Microsoft Excel and is what we commonly </w:t>
+      </w:r>
+      <w:proofErr w:type="spellStart"/>
+      <w:r>
+        <w:t>use</w:t>
+      </w:r>
+      <w:proofErr w:type="spellEnd"/>
+      <w:r>
+        <w:t xml:space="preserve"> for further data processing. </w:t>
       </w:r>
       <w:r>
         <w:t xml:space="preserve">One of those applications is the extraction of 3D MSI data as </w:t>
@@ -1002,11 +2082,11 @@
         </w:numPr>
         <w:outlineLvl w:val="0"/>
       </w:pPr>
-      <w:bookmarkStart w:id="2" w:name="_Toc207369609"/>
+      <w:bookmarkStart w:id="4" w:name="_Toc209097675"/>
       <w:r>
         <w:t>How to use</w:t>
       </w:r>
-      <w:bookmarkEnd w:id="2"/>
+      <w:bookmarkEnd w:id="4"/>
     </w:p>
     <w:p>
       <w:pPr>
@@ -1017,9 +2097,11 @@
         </w:numPr>
         <w:outlineLvl w:val="1"/>
       </w:pPr>
+      <w:bookmarkStart w:id="5" w:name="_Toc209097676"/>
       <w:r>
         <w:t>Prerequisites</w:t>
       </w:r>
+      <w:bookmarkEnd w:id="5"/>
     </w:p>
     <w:p>
       <w:pPr>
@@ -1027,13 +2109,29 @@
         <w:jc w:val="both"/>
       </w:pPr>
       <w:r>
-        <w:t xml:space="preserve">STORM-MSI is distributed as both a compiled executable and a MatLab project. </w:t>
+        <w:t xml:space="preserve">STORM-MSI is distributed as both a compiled executable and a </w:t>
+      </w:r>
+      <w:proofErr w:type="spellStart"/>
+      <w:r>
+        <w:t>MatLab</w:t>
+      </w:r>
+      <w:proofErr w:type="spellEnd"/>
+      <w:r>
+        <w:t xml:space="preserve"> project. </w:t>
       </w:r>
       <w:r>
         <w:t xml:space="preserve">The executable can be run on any Windows 10 or newer machine, but has only been tested on x64 architectures. </w:t>
       </w:r>
       <w:r>
-        <w:t xml:space="preserve">STORM-MSI should also work on Linux theoretically since Linux is supported by MatLab, however this has not been tested as of late. </w:t>
+        <w:t xml:space="preserve">STORM-MSI should also work on Linux theoretically since Linux is supported by </w:t>
+      </w:r>
+      <w:proofErr w:type="spellStart"/>
+      <w:r>
+        <w:t>MatLab</w:t>
+      </w:r>
+      <w:proofErr w:type="spellEnd"/>
+      <w:r>
+        <w:t xml:space="preserve">, however this has not been tested as of late. </w:t>
       </w:r>
     </w:p>
     <w:p>
@@ -1067,7 +2165,15 @@
         <w:jc w:val="both"/>
       </w:pPr>
       <w:r>
-        <w:t xml:space="preserve">Since the executable cannot run scripts that have not been included at compilation, the addition of modules requires a MatLab license (Version </w:t>
+        <w:t xml:space="preserve">Since the executable cannot run scripts that have not been included at compilation, the addition of modules requires a </w:t>
+      </w:r>
+      <w:proofErr w:type="spellStart"/>
+      <w:r>
+        <w:t>MatLab</w:t>
+      </w:r>
+      <w:proofErr w:type="spellEnd"/>
+      <w:r>
+        <w:t xml:space="preserve"> license (Version </w:t>
       </w:r>
       <w:r>
         <w:rPr>
@@ -1089,7 +2195,15 @@
         <w:t xml:space="preserve"> </w:t>
       </w:r>
       <w:r>
-        <w:t xml:space="preserve">Here is the list of required MatLab modules: </w:t>
+        <w:t xml:space="preserve">Here is the list of required </w:t>
+      </w:r>
+      <w:proofErr w:type="spellStart"/>
+      <w:r>
+        <w:t>MatLab</w:t>
+      </w:r>
+      <w:proofErr w:type="spellEnd"/>
+      <w:r>
+        <w:t xml:space="preserve"> modules: </w:t>
       </w:r>
     </w:p>
     <w:p>
@@ -1323,9 +2437,11 @@
         <w:jc w:val="both"/>
         <w:outlineLvl w:val="1"/>
       </w:pPr>
+      <w:bookmarkStart w:id="6" w:name="_Toc209097677"/>
       <w:r>
         <w:t>Data Acquisition</w:t>
       </w:r>
+      <w:bookmarkEnd w:id="6"/>
     </w:p>
     <w:p>
       <w:pPr>
@@ -1368,9 +2484,11 @@
         <w:jc w:val="both"/>
         <w:outlineLvl w:val="2"/>
       </w:pPr>
+      <w:bookmarkStart w:id="7" w:name="_Toc209097678"/>
       <w:r>
         <w:t>Mapping Mode panel</w:t>
       </w:r>
+      <w:bookmarkEnd w:id="7"/>
     </w:p>
     <w:p>
       <w:pPr>
@@ -1378,7 +2496,15 @@
         <w:jc w:val="both"/>
       </w:pPr>
       <w:r>
-        <w:t>This panel allows you to chose between three imaging modes:</w:t>
+        <w:t xml:space="preserve">This panel allows you to </w:t>
+      </w:r>
+      <w:proofErr w:type="spellStart"/>
+      <w:r>
+        <w:t>chose</w:t>
+      </w:r>
+      <w:proofErr w:type="spellEnd"/>
+      <w:r>
+        <w:t xml:space="preserve"> between three imaging modes:</w:t>
       </w:r>
     </w:p>
     <w:p>
@@ -1493,12 +2619,14 @@
         <w:jc w:val="both"/>
         <w:outlineLvl w:val="2"/>
       </w:pPr>
+      <w:bookmarkStart w:id="8" w:name="_Toc209097679"/>
       <w:r>
         <w:t>Properties</w:t>
       </w:r>
       <w:r>
         <w:t xml:space="preserve"> panel</w:t>
       </w:r>
+      <w:bookmarkEnd w:id="8"/>
     </w:p>
     <w:p>
       <w:pPr>
@@ -1651,6 +2779,7 @@
         <w:jc w:val="both"/>
         <w:outlineLvl w:val="2"/>
       </w:pPr>
+      <w:bookmarkStart w:id="9" w:name="_Toc209097680"/>
       <w:r>
         <w:t>Robot</w:t>
       </w:r>
@@ -1658,7 +2787,11 @@
         <w:t xml:space="preserve"> </w:t>
       </w:r>
       <w:r>
-        <w:t xml:space="preserve">panel </w:t>
+        <w:t>panel</w:t>
+      </w:r>
+      <w:bookmarkEnd w:id="9"/>
+      <w:r>
+        <w:t xml:space="preserve"> </w:t>
       </w:r>
     </w:p>
     <w:p>
@@ -1689,6 +2822,7 @@
       <w:r>
         <w:t xml:space="preserve">after running the </w:t>
       </w:r>
+      <w:proofErr w:type="spellStart"/>
       <w:r>
         <w:rPr>
           <w:b/>
@@ -1698,6 +2832,7 @@
         </w:rPr>
         <w:t>update_hardware.m</w:t>
       </w:r>
+      <w:proofErr w:type="spellEnd"/>
       <w:r>
         <w:t xml:space="preserve"> script in the root directory</w:t>
       </w:r>
@@ -1715,10 +2850,12 @@
         <w:jc w:val="both"/>
         <w:outlineLvl w:val="2"/>
       </w:pPr>
+      <w:bookmarkStart w:id="10" w:name="_Toc209097681"/>
       <w:r>
         <w:lastRenderedPageBreak/>
         <w:t>Sensor panel</w:t>
       </w:r>
+      <w:bookmarkEnd w:id="10"/>
     </w:p>
     <w:p>
       <w:pPr>
@@ -1739,8 +2876,13 @@
         <w:jc w:val="both"/>
         <w:outlineLvl w:val="2"/>
       </w:pPr>
-      <w:r>
-        <w:t xml:space="preserve">Source panel </w:t>
+      <w:bookmarkStart w:id="11" w:name="_Toc209097682"/>
+      <w:r>
+        <w:t>Source panel</w:t>
+      </w:r>
+      <w:bookmarkEnd w:id="11"/>
+      <w:r>
+        <w:t xml:space="preserve"> </w:t>
       </w:r>
     </w:p>
     <w:p>
@@ -2023,12 +3165,14 @@
         <w:jc w:val="both"/>
         <w:outlineLvl w:val="2"/>
       </w:pPr>
+      <w:bookmarkStart w:id="12" w:name="_Toc209097683"/>
       <w:r>
         <w:t>Mass Spectrometer</w:t>
       </w:r>
       <w:r>
         <w:t xml:space="preserve"> panel</w:t>
       </w:r>
+      <w:bookmarkEnd w:id="12"/>
     </w:p>
     <w:p>
       <w:pPr>
@@ -2262,8 +3406,13 @@
         <w:jc w:val="both"/>
         <w:outlineLvl w:val="1"/>
       </w:pPr>
-      <w:r>
-        <w:t xml:space="preserve">Data Processing </w:t>
+      <w:bookmarkStart w:id="13" w:name="_Toc209097684"/>
+      <w:r>
+        <w:t>Data Processing</w:t>
+      </w:r>
+      <w:bookmarkEnd w:id="13"/>
+      <w:r>
+        <w:t xml:space="preserve"> </w:t>
       </w:r>
     </w:p>
     <w:p>
@@ -2325,6 +3474,7 @@
       <w:r>
         <w:t xml:space="preserve">This molecular data must be converted externally to the open </w:t>
       </w:r>
+      <w:proofErr w:type="spellStart"/>
       <w:r>
         <w:rPr>
           <w:b/>
@@ -2332,6 +3482,7 @@
         </w:rPr>
         <w:t>mzXML</w:t>
       </w:r>
+      <w:proofErr w:type="spellEnd"/>
       <w:r>
         <w:t xml:space="preserve"> format to be ingested by STORM-MSI</w:t>
       </w:r>
@@ -2367,9 +3518,11 @@
         <w:pStyle w:val="Heading3"/>
         <w:ind w:left="720" w:firstLine="720"/>
       </w:pPr>
+      <w:bookmarkStart w:id="14" w:name="_Toc209097685"/>
       <w:r>
         <w:t>Project Structure</w:t>
       </w:r>
+      <w:bookmarkEnd w:id="14"/>
     </w:p>
     <w:p>
       <w:pPr>
@@ -2409,14 +3562,19 @@
     <w:p>
       <w:pPr>
         <w:pStyle w:val="Heading3"/>
-        <w:ind w:left="720" w:firstLine="720"/>
-      </w:pPr>
-      <w:r>
-        <w:t xml:space="preserve">1. </w:t>
+        <w:numPr>
+          <w:ilvl w:val="2"/>
+          <w:numId w:val="1"/>
+        </w:numPr>
+      </w:pPr>
+      <w:bookmarkStart w:id="15" w:name="_Toc209097686"/>
+      <w:r>
+        <w:t xml:space="preserve"> </w:t>
       </w:r>
       <w:r>
         <w:t>Generating a Mat file</w:t>
       </w:r>
+      <w:bookmarkEnd w:id="15"/>
     </w:p>
     <w:p>
       <w:pPr>
@@ -2458,7 +3616,15 @@
         <w:t>scan selection</w:t>
       </w:r>
       <w:r>
-        <w:t xml:space="preserve">, a process that assigns scans from an mzXML file to their corresponding point in the map file, storing them in the Mat file that will be used for all ulterior processing. </w:t>
+        <w:t xml:space="preserve">, a process that assigns scans from an </w:t>
+      </w:r>
+      <w:proofErr w:type="spellStart"/>
+      <w:r>
+        <w:t>mzXML</w:t>
+      </w:r>
+      <w:proofErr w:type="spellEnd"/>
+      <w:r>
+        <w:t xml:space="preserve"> file to their corresponding point in the map file, storing them in the Mat file that will be used for all ulterior processing. </w:t>
       </w:r>
     </w:p>
     <w:p>
@@ -2480,7 +3646,15 @@
         <w:jc w:val="both"/>
       </w:pPr>
       <w:r>
-        <w:t>Loading the mzXML file and its corresponding map file</w:t>
+        <w:t xml:space="preserve">Loading the </w:t>
+      </w:r>
+      <w:proofErr w:type="spellStart"/>
+      <w:r>
+        <w:t>mzXML</w:t>
+      </w:r>
+      <w:proofErr w:type="spellEnd"/>
+      <w:r>
+        <w:t xml:space="preserve"> file and its corresponding map file</w:t>
       </w:r>
     </w:p>
     <w:p>
@@ -2517,12 +3691,21 @@
       <w:r>
         <w:t xml:space="preserve">Loading is done through the </w:t>
       </w:r>
-      <w:r>
-        <w:rPr>
-          <w:b/>
-          <w:bCs/>
-        </w:rPr>
-        <w:t>mzXML File</w:t>
+      <w:proofErr w:type="spellStart"/>
+      <w:r>
+        <w:rPr>
+          <w:b/>
+          <w:bCs/>
+        </w:rPr>
+        <w:t>mzXML</w:t>
+      </w:r>
+      <w:proofErr w:type="spellEnd"/>
+      <w:r>
+        <w:rPr>
+          <w:b/>
+          <w:bCs/>
+        </w:rPr>
+        <w:t xml:space="preserve"> File</w:t>
       </w:r>
       <w:r>
         <w:t xml:space="preserve"> and </w:t>
@@ -2568,7 +3751,13 @@
         <w:t xml:space="preserve"> in mass spectrometry</w:t>
       </w:r>
       <w:r>
-        <w:t xml:space="preserve">, finds scans of interest by selecting peaks on the chromatogram. </w:t>
+        <w:t>, finds scans of interest by selecting peaks on the chromatogram</w:t>
+      </w:r>
+      <w:r>
+        <w:t xml:space="preserve"> and assigning them to the pixel that was being acquired at the same time</w:t>
+      </w:r>
+      <w:r>
+        <w:t xml:space="preserve">. </w:t>
       </w:r>
       <w:r>
         <w:t xml:space="preserve">This method is robust as long as there are distinct peaks, which means that it is best suited to </w:t>
@@ -2620,6 +3809,33 @@
       <w:pPr>
         <w:pStyle w:val="ListParagraph"/>
         <w:numPr>
+          <w:ilvl w:val="1"/>
+          <w:numId w:val="2"/>
+        </w:numPr>
+        <w:jc w:val="both"/>
+      </w:pPr>
+      <w:r>
+        <w:rPr>
+          <w:b/>
+          <w:bCs/>
+        </w:rPr>
+        <w:t>Time between bursts</w:t>
+      </w:r>
+      <w:r>
+        <w:rPr>
+          <w:b/>
+          <w:bCs/>
+        </w:rPr>
+        <w:t xml:space="preserve">: </w:t>
+      </w:r>
+      <w:r>
+        <w:t>Average waiting time between source bursts in the acquisition</w:t>
+      </w:r>
+    </w:p>
+    <w:p>
+      <w:pPr>
+        <w:pStyle w:val="ListParagraph"/>
+        <w:numPr>
           <w:ilvl w:val="0"/>
           <w:numId w:val="2"/>
         </w:numPr>
@@ -2639,8 +3855,919 @@
         <w:t xml:space="preserve">, as the TIC remains mostly constant when pauses are removed, meaning that no distinct peaks can be detected. </w:t>
       </w:r>
       <w:r>
+        <w:t xml:space="preserve">Instead of using peaks, </w:t>
+      </w:r>
+      <w:r>
+        <w:t>it only relies on temporal information</w:t>
+      </w:r>
+      <w:r>
+        <w:t xml:space="preserve"> to perform scan selection.</w:t>
+      </w:r>
+    </w:p>
+    <w:p>
+      <w:pPr>
+        <w:pStyle w:val="ListParagraph"/>
+        <w:numPr>
+          <w:ilvl w:val="1"/>
+          <w:numId w:val="2"/>
+        </w:numPr>
+        <w:jc w:val="both"/>
+      </w:pPr>
+      <w:r>
+        <w:rPr>
+          <w:b/>
+          <w:bCs/>
+        </w:rPr>
+        <w:t>Aspiration Time</w:t>
+      </w:r>
+      <w:r>
+        <w:t>:</w:t>
+      </w:r>
+      <w:r>
+        <w:t xml:space="preserve"> Fixed correction that accounts for the time needed for ions generated by the source to be detected</w:t>
+      </w:r>
+    </w:p>
+    <w:p>
+      <w:pPr>
+        <w:pStyle w:val="ListParagraph"/>
+        <w:numPr>
+          <w:ilvl w:val="1"/>
+          <w:numId w:val="2"/>
+        </w:numPr>
+        <w:jc w:val="both"/>
+      </w:pPr>
+      <w:r>
+        <w:rPr>
+          <w:b/>
+          <w:bCs/>
+        </w:rPr>
+        <w:t>Aspiration Shift</w:t>
+      </w:r>
+      <w:r>
+        <w:t>:</w:t>
+      </w:r>
+      <w:r>
+        <w:t xml:space="preserve"> Time correction that linearly increases throughout the experiment, can be needed with certain hardware configurations</w:t>
+      </w:r>
+    </w:p>
+    <w:p>
+      <w:pPr>
+        <w:pStyle w:val="ListParagraph"/>
+        <w:numPr>
+          <w:ilvl w:val="1"/>
+          <w:numId w:val="2"/>
+        </w:numPr>
+        <w:jc w:val="both"/>
+      </w:pPr>
+      <w:r>
+        <w:rPr>
+          <w:noProof/>
+        </w:rPr>
+        <mc:AlternateContent>
+          <mc:Choice Requires="wpg">
+            <w:drawing>
+              <wp:anchor distT="0" distB="0" distL="114300" distR="114300" simplePos="0" relativeHeight="251667456" behindDoc="0" locked="0" layoutInCell="1" allowOverlap="1" wp14:anchorId="3F5FAB62" wp14:editId="511876A9">
+                <wp:simplePos x="0" y="0"/>
+                <wp:positionH relativeFrom="column">
+                  <wp:posOffset>2804160</wp:posOffset>
+                </wp:positionH>
+                <wp:positionV relativeFrom="paragraph">
+                  <wp:posOffset>644867</wp:posOffset>
+                </wp:positionV>
+                <wp:extent cx="2954655" cy="3851910"/>
+                <wp:effectExtent l="0" t="0" r="0" b="0"/>
+                <wp:wrapSquare wrapText="bothSides"/>
+                <wp:docPr id="1423416158" name="Group 6"/>
+                <wp:cNvGraphicFramePr/>
+                <a:graphic xmlns:a="http://schemas.openxmlformats.org/drawingml/2006/main">
+                  <a:graphicData uri="http://schemas.microsoft.com/office/word/2010/wordprocessingGroup">
+                    <wpg:wgp>
+                      <wpg:cNvGrpSpPr/>
+                      <wpg:grpSpPr>
+                        <a:xfrm>
+                          <a:off x="0" y="0"/>
+                          <a:ext cx="2954655" cy="3851910"/>
+                          <a:chOff x="0" y="0"/>
+                          <a:chExt cx="2954655" cy="3852350"/>
+                        </a:xfrm>
+                      </wpg:grpSpPr>
+                      <pic:pic xmlns:pic="http://schemas.openxmlformats.org/drawingml/2006/picture">
+                        <pic:nvPicPr>
+                          <pic:cNvPr id="1550276133" name="Picture 5"/>
+                          <pic:cNvPicPr>
+                            <a:picLocks noChangeAspect="1"/>
+                          </pic:cNvPicPr>
+                        </pic:nvPicPr>
+                        <pic:blipFill>
+                          <a:blip r:embed="rId8" cstate="print">
+                            <a:extLst>
+                              <a:ext uri="{28A0092B-C50C-407E-A947-70E740481C1C}">
+                                <a14:useLocalDpi xmlns:a14="http://schemas.microsoft.com/office/drawing/2010/main" val="0"/>
+                              </a:ext>
+                            </a:extLst>
+                          </a:blip>
+                          <a:srcRect/>
+                          <a:stretch>
+                            <a:fillRect/>
+                          </a:stretch>
+                        </pic:blipFill>
+                        <pic:spPr bwMode="auto">
+                          <a:xfrm>
+                            <a:off x="0" y="0"/>
+                            <a:ext cx="2954655" cy="3446145"/>
+                          </a:xfrm>
+                          <a:prstGeom prst="rect">
+                            <a:avLst/>
+                          </a:prstGeom>
+                          <a:noFill/>
+                          <a:ln>
+                            <a:noFill/>
+                          </a:ln>
+                        </pic:spPr>
+                      </pic:pic>
+                      <wps:wsp>
+                        <wps:cNvPr id="2002731236" name="Text Box 1"/>
+                        <wps:cNvSpPr txBox="1"/>
+                        <wps:spPr>
+                          <a:xfrm>
+                            <a:off x="222739" y="3446585"/>
+                            <a:ext cx="2731770" cy="405765"/>
+                          </a:xfrm>
+                          <a:prstGeom prst="rect">
+                            <a:avLst/>
+                          </a:prstGeom>
+                          <a:solidFill>
+                            <a:prstClr val="white"/>
+                          </a:solidFill>
+                          <a:ln>
+                            <a:noFill/>
+                          </a:ln>
+                        </wps:spPr>
+                        <wps:txbx>
+                          <w:txbxContent>
+                            <w:p>
+                              <w:pPr>
+                                <w:pStyle w:val="Caption"/>
+                                <w:rPr>
+                                  <w:noProof/>
+                                </w:rPr>
+                              </w:pPr>
+                              <w:r>
+                                <w:t xml:space="preserve">Figure </w:t>
+                              </w:r>
+                              <w:fldSimple w:instr=" SEQ Figure \* ARABIC ">
+                                <w:r>
+                                  <w:rPr>
+                                    <w:noProof/>
+                                  </w:rPr>
+                                  <w:t>1</w:t>
+                                </w:r>
+                              </w:fldSimple>
+                              <w:r>
+                                <w:t>: Annotated Scan Selection chromatograms with Peak Picking (A) and Time-Based Selection (B)</w:t>
+                              </w:r>
+                            </w:p>
+                          </w:txbxContent>
+                        </wps:txbx>
+                        <wps:bodyPr rot="0" spcFirstLastPara="0" vertOverflow="overflow" horzOverflow="overflow" vert="horz" wrap="square" lIns="0" tIns="0" rIns="0" bIns="0" numCol="1" spcCol="0" rtlCol="0" fromWordArt="0" anchor="t" anchorCtr="0" forceAA="0" compatLnSpc="1">
+                          <a:prstTxWarp prst="textNoShape">
+                            <a:avLst/>
+                          </a:prstTxWarp>
+                          <a:spAutoFit/>
+                        </wps:bodyPr>
+                      </wps:wsp>
+                    </wpg:wgp>
+                  </a:graphicData>
+                </a:graphic>
+              </wp:anchor>
+            </w:drawing>
+          </mc:Choice>
+          <mc:Fallback>
+            <w:pict>
+              <v:group w14:anchorId="3F5FAB62" id="Group 6" o:spid="_x0000_s1029" style="position:absolute;left:0;text-align:left;margin-left:220.8pt;margin-top:50.8pt;width:232.65pt;height:303.3pt;z-index:251667456" coordsize="29546,38523" o:gfxdata="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">
+                <v:shapetype id="_x0000_t75" coordsize="21600,21600" o:spt="75" o:preferrelative="t" path="m@4@5l@4@11@9@11@9@5xe" filled="f" stroked="f">
+                  <v:stroke joinstyle="miter"/>
+                  <v:formulas>
+                    <v:f eqn="if lineDrawn pixelLineWidth 0"/>
+                    <v:f eqn="sum @0 1 0"/>
+                    <v:f eqn="sum 0 0 @1"/>
+                    <v:f eqn="prod @2 1 2"/>
+                    <v:f eqn="prod @3 21600 pixelWidth"/>
+                    <v:f eqn="prod @3 21600 pixelHeight"/>
+                    <v:f eqn="sum @0 0 1"/>
+                    <v:f eqn="prod @6 1 2"/>
+                    <v:f eqn="prod @7 21600 pixelWidth"/>
+                    <v:f eqn="sum @8 21600 0"/>
+                    <v:f eqn="prod @7 21600 pixelHeight"/>
+                    <v:f eqn="sum @10 21600 0"/>
+                  </v:formulas>
+                  <v:path o:extrusionok="f" gradientshapeok="t" o:connecttype="rect"/>
+                  <o:lock v:ext="edit" aspectratio="t"/>
+                </v:shapetype>
+                <v:shape id="Picture 5" o:spid="_x0000_s1030" type="#_x0000_t75" style="position:absolute;width:29546;height:34461;visibility:visible;mso-wrap-style:square" o:gfxdata="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">
+                  <v:imagedata r:id="rId9" o:title=""/>
+                </v:shape>
+                <v:shape id="Text Box 1" o:spid="_x0000_s1031" type="#_x0000_t202" style="position:absolute;left:2227;top:34465;width:27318;height:4058;visibility:visible;mso-wrap-style:square;v-text-anchor:top" o:gfxdata="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" stroked="f">
+                  <v:textbox style="mso-fit-shape-to-text:t" inset="0,0,0,0">
+                    <w:txbxContent>
+                      <w:p>
+                        <w:pPr>
+                          <w:pStyle w:val="Caption"/>
+                          <w:rPr>
+                            <w:noProof/>
+                          </w:rPr>
+                        </w:pPr>
+                        <w:r>
+                          <w:t xml:space="preserve">Figure </w:t>
+                        </w:r>
+                        <w:fldSimple w:instr=" SEQ Figure \* ARABIC ">
+                          <w:r>
+                            <w:rPr>
+                              <w:noProof/>
+                            </w:rPr>
+                            <w:t>1</w:t>
+                          </w:r>
+                        </w:fldSimple>
+                        <w:r>
+                          <w:t>: Annotated Scan Selection chromatograms with Peak Picking (A) and Time-Based Selection (B)</w:t>
+                        </w:r>
+                      </w:p>
+                    </w:txbxContent>
+                  </v:textbox>
+                </v:shape>
+                <w10:wrap type="square"/>
+              </v:group>
+            </w:pict>
+          </mc:Fallback>
+        </mc:AlternateContent>
+      </w:r>
+      <w:proofErr w:type="spellStart"/>
+      <w:r>
+        <w:rPr>
+          <w:b/>
+          <w:bCs/>
+        </w:rPr>
+        <w:t>Neighbouring</w:t>
+      </w:r>
+      <w:proofErr w:type="spellEnd"/>
+      <w:r>
+        <w:rPr>
+          <w:b/>
+          <w:bCs/>
+        </w:rPr>
+        <w:t xml:space="preserve"> Scans</w:t>
+      </w:r>
+      <w:r>
+        <w:t xml:space="preserve">: When a scan </w:t>
+      </w:r>
+      <w:r>
+        <w:rPr>
+          <w:i/>
+          <w:iCs/>
+        </w:rPr>
+        <w:t xml:space="preserve">n </w:t>
+      </w:r>
+      <w:r>
+        <w:t xml:space="preserve">is assigned to a given pixel, </w:t>
+      </w:r>
+      <w:r>
+        <w:t xml:space="preserve">also assigns the number of </w:t>
+      </w:r>
+      <w:proofErr w:type="spellStart"/>
+      <w:r>
+        <w:t>neighbouring</w:t>
+      </w:r>
+      <w:proofErr w:type="spellEnd"/>
+      <w:r>
+        <w:t xml:space="preserve"> scans specified by this parameter to this pixel, limiting the loss of information between selected scans</w:t>
+      </w:r>
+    </w:p>
+    <w:p>
+      <w:pPr>
+        <w:ind w:firstLine="360"/>
+        <w:jc w:val="both"/>
+      </w:pPr>
+      <w:r>
+        <w:t xml:space="preserve">Specifying whether internal triggering (i.e. triggering options made available through the interface) was used during the acquisition is also needed, and is performed by flicking the switch above the Scan Selection button. </w:t>
+      </w:r>
+      <w:r>
+        <w:t xml:space="preserve">With internal triggering, the timeline recorded by the </w:t>
+      </w:r>
+      <w:proofErr w:type="spellStart"/>
+      <w:r>
+        <w:t>mzXML</w:t>
+      </w:r>
+      <w:proofErr w:type="spellEnd"/>
+      <w:r>
+        <w:t xml:space="preserve"> file is assumed to start at the same time as the timeline recorded in the Map file. </w:t>
+      </w:r>
+      <w:r>
+        <w:t xml:space="preserve">Without triggering, the start of the experiment is the first scan that exceeds the </w:t>
+      </w:r>
+      <w:r>
+        <w:rPr>
+          <w:b/>
+          <w:bCs/>
+        </w:rPr>
+        <w:t>Start Threshold</w:t>
+      </w:r>
+      <w:r>
+        <w:t xml:space="preserve"> value.</w:t>
+      </w:r>
+    </w:p>
+    <w:p>
+      <w:pPr>
+        <w:ind w:firstLine="360"/>
+        <w:jc w:val="both"/>
+      </w:pPr>
+      <w:r>
+        <w:t xml:space="preserve">When all parameters have been set properly, pressing the </w:t>
+      </w:r>
+      <w:r>
+        <w:rPr>
+          <w:b/>
+          <w:bCs/>
+        </w:rPr>
+        <w:t xml:space="preserve">Scan Selection </w:t>
+      </w:r>
+      <w:r>
+        <w:t>button will start the process. Once scans have been selected, an annotated chromatogram is displayed, showing which scans have been selected</w:t>
+      </w:r>
+      <w:r>
+        <w:t xml:space="preserve"> and giving a general idea of the scan selection’s quality</w:t>
+      </w:r>
+      <w:r>
+        <w:t>.</w:t>
+      </w:r>
+      <w:r>
+        <w:t xml:space="preserve"> In Peak Picking, it is advised to set the noise threshold high enough to encompass the baseline signal, without causing data </w:t>
+      </w:r>
+      <w:r>
+        <w:lastRenderedPageBreak/>
+        <w:t xml:space="preserve">to be treated as noise. The delay between </w:t>
+      </w:r>
+      <w:proofErr w:type="spellStart"/>
+      <w:r>
+        <w:t>referentials</w:t>
+      </w:r>
+      <w:proofErr w:type="spellEnd"/>
+      <w:r>
+        <w:t xml:space="preserve">, depicted as horizontal bars starting from selected scans, must also be minimized. Time Based scan selection’s assessment is more empirical, and necessitates generating images to verify whether sample features are properly aligned. </w:t>
+      </w:r>
+    </w:p>
+    <w:p>
+      <w:pPr>
+        <w:ind w:firstLine="360"/>
+        <w:jc w:val="both"/>
+      </w:pPr>
+      <w:r>
+        <w:t xml:space="preserve">If the scan selection is of suitable quality, the last step is pushing the </w:t>
+      </w:r>
+      <w:r>
+        <w:rPr>
+          <w:b/>
+          <w:bCs/>
+        </w:rPr>
+        <w:t xml:space="preserve">Generate .mat File </w:t>
+      </w:r>
+      <w:r>
+        <w:t>button after specifying the size of the binning window.</w:t>
+      </w:r>
+      <w:r>
+        <w:t xml:space="preserve"> Once the file is generated, STORM-MSI automatically loads it and its corresponding Map file for processing, and </w:t>
+      </w:r>
+      <w:r>
+        <w:t>opens</w:t>
+      </w:r>
+      <w:r>
+        <w:t xml:space="preserve"> the main data processing panel.</w:t>
+      </w:r>
+    </w:p>
+    <w:p>
+      <w:pPr>
+        <w:pStyle w:val="ListParagraph"/>
+        <w:numPr>
+          <w:ilvl w:val="2"/>
+          <w:numId w:val="1"/>
+        </w:numPr>
+        <w:jc w:val="both"/>
+      </w:pPr>
+      <w:r>
+        <w:t>Processing Panel</w:t>
+      </w:r>
+    </w:p>
+    <w:p>
+      <w:pPr>
+        <w:jc w:val="both"/>
+      </w:pPr>
+      <w:r>
+        <w:t xml:space="preserve">This panel contains </w:t>
+      </w:r>
+      <w:r>
+        <w:t>several</w:t>
+      </w:r>
+      <w:r>
+        <w:t xml:space="preserve"> image reconstruction methods, from top to bottom: </w:t>
+      </w:r>
+    </w:p>
+    <w:p>
+      <w:pPr>
+        <w:pStyle w:val="ListParagraph"/>
+        <w:numPr>
+          <w:ilvl w:val="0"/>
+          <w:numId w:val="2"/>
+        </w:numPr>
+        <w:jc w:val="both"/>
+      </w:pPr>
+      <w:r>
+        <w:rPr>
+          <w:b/>
+          <w:bCs/>
+        </w:rPr>
+        <w:t>General Reconstruction</w:t>
+      </w:r>
+      <w:r>
+        <w:rPr>
+          <w:b/>
+          <w:bCs/>
+        </w:rPr>
+        <w:t>:</w:t>
+      </w:r>
+      <w:r>
+        <w:t xml:space="preserve"> Reconstructs an image between the specified m/Z limit</w:t>
+      </w:r>
+      <w:r>
+        <w:t>s</w:t>
+      </w:r>
+    </w:p>
+    <w:p>
+      <w:pPr>
+        <w:pStyle w:val="ListParagraph"/>
+        <w:numPr>
+          <w:ilvl w:val="0"/>
+          <w:numId w:val="2"/>
+        </w:numPr>
+        <w:jc w:val="both"/>
+      </w:pPr>
+      <w:r>
+        <w:rPr>
+          <w:b/>
+          <w:bCs/>
+        </w:rPr>
+        <w:t>Map From Spectra</w:t>
+      </w:r>
+      <w:r>
+        <w:rPr>
+          <w:b/>
+          <w:bCs/>
+        </w:rPr>
+        <w:t xml:space="preserve">: </w:t>
+      </w:r>
+      <w:r>
+        <w:t>Opens the average mass spectrum of the acquisition. The first m/Z clicked will be the lower bound, and the second, the higher bound.</w:t>
+      </w:r>
+    </w:p>
+    <w:p>
+      <w:pPr>
+        <w:pStyle w:val="ListParagraph"/>
+        <w:numPr>
+          <w:ilvl w:val="0"/>
+          <w:numId w:val="2"/>
+        </w:numPr>
+        <w:jc w:val="both"/>
+      </w:pPr>
+      <w:r>
+        <w:rPr>
+          <w:b/>
+          <w:bCs/>
+        </w:rPr>
+        <w:t>Display One Spectrum:</w:t>
+      </w:r>
+      <w:r>
+        <w:t xml:space="preserve"> Select one point on the image, and show its corresponding mass spectrum</w:t>
+      </w:r>
+    </w:p>
+    <w:p>
+      <w:pPr>
+        <w:pStyle w:val="ListParagraph"/>
+        <w:numPr>
+          <w:ilvl w:val="0"/>
+          <w:numId w:val="2"/>
+        </w:numPr>
+        <w:jc w:val="both"/>
+      </w:pPr>
+      <w:r>
+        <w:rPr>
+          <w:b/>
+          <w:bCs/>
+        </w:rPr>
+        <w:t xml:space="preserve">Display </w:t>
+      </w:r>
+      <w:r>
+        <w:rPr>
+          <w:b/>
+          <w:bCs/>
+        </w:rPr>
+        <w:t>Area</w:t>
+      </w:r>
+      <w:r>
+        <w:rPr>
+          <w:b/>
+          <w:bCs/>
+        </w:rPr>
         <w:t xml:space="preserve"> </w:t>
       </w:r>
+      <w:r>
+        <w:rPr>
+          <w:b/>
+          <w:bCs/>
+        </w:rPr>
+        <w:t>Spectrum</w:t>
+      </w:r>
+      <w:r>
+        <w:rPr>
+          <w:b/>
+          <w:bCs/>
+        </w:rPr>
+        <w:t>:</w:t>
+      </w:r>
+      <w:r>
+        <w:rPr>
+          <w:b/>
+          <w:bCs/>
+        </w:rPr>
+        <w:t xml:space="preserve"> </w:t>
+      </w:r>
+      <w:r>
+        <w:t>Select an area of the image, and show its average mass spectrum</w:t>
+      </w:r>
+    </w:p>
+    <w:p>
+      <w:pPr>
+        <w:pStyle w:val="ListParagraph"/>
+        <w:numPr>
+          <w:ilvl w:val="0"/>
+          <w:numId w:val="2"/>
+        </w:numPr>
+        <w:jc w:val="both"/>
+      </w:pPr>
+      <w:r>
+        <w:rPr>
+          <w:b/>
+          <w:bCs/>
+        </w:rPr>
+        <w:t>Display Average Spectrum</w:t>
+      </w:r>
+      <w:r>
+        <w:rPr>
+          <w:b/>
+          <w:bCs/>
+        </w:rPr>
+        <w:t>:</w:t>
+      </w:r>
+      <w:r>
+        <w:t xml:space="preserve"> Display the global average spectrum of the image</w:t>
+      </w:r>
+      <w:r>
+        <w:rPr>
+          <w:b/>
+          <w:bCs/>
+        </w:rPr>
+        <w:t xml:space="preserve"> </w:t>
+      </w:r>
+    </w:p>
+    <w:p>
+      <w:pPr>
+        <w:pStyle w:val="ListParagraph"/>
+        <w:numPr>
+          <w:ilvl w:val="0"/>
+          <w:numId w:val="2"/>
+        </w:numPr>
+        <w:jc w:val="both"/>
+      </w:pPr>
+      <w:r>
+        <w:rPr>
+          <w:b/>
+          <w:bCs/>
+        </w:rPr>
+        <w:t>RGB Display:</w:t>
+      </w:r>
+      <w:r>
+        <w:t xml:space="preserve"> Simultaneously displays three different mass ranges in the </w:t>
+      </w:r>
+      <w:r>
+        <w:t>red, green and blue</w:t>
+      </w:r>
+      <w:r>
+        <w:t xml:space="preserve"> channels of the image</w:t>
+      </w:r>
+    </w:p>
+    <w:p>
+      <w:pPr>
+        <w:ind w:firstLine="360"/>
+        <w:jc w:val="both"/>
+      </w:pPr>
+      <w:r>
+        <w:t xml:space="preserve">This panel </w:t>
+      </w:r>
+      <w:r>
+        <w:t xml:space="preserve">finally houses a Principal Component Analysis (PCA) tool, which will display both a PCA circle of </w:t>
+      </w:r>
+      <w:r>
+        <w:t xml:space="preserve">all bins found in the Mat file, and a PCA circle containing only the top 10 most differentiating bins in the file. This can be used as a quick way to identify peaks of potential interest without combing through the entire spectrum. </w:t>
+      </w:r>
+    </w:p>
+    <w:p>
+      <w:pPr>
+        <w:pStyle w:val="ListParagraph"/>
+        <w:numPr>
+          <w:ilvl w:val="2"/>
+          <w:numId w:val="1"/>
+        </w:numPr>
+        <w:jc w:val="both"/>
+      </w:pPr>
+      <w:r>
+        <w:t>Post-Processing Panel</w:t>
+      </w:r>
+    </w:p>
+    <w:p>
+      <w:pPr>
+        <w:ind w:firstLine="720"/>
+        <w:jc w:val="both"/>
+      </w:pPr>
+      <w:r>
+        <w:t>This panel contains all operations that aim to increa</w:t>
+      </w:r>
+      <w:r>
+        <w:t>s</w:t>
+      </w:r>
+      <w:r>
+        <w:t>e the quality of the generated topographical map</w:t>
+      </w:r>
+      <w:r>
+        <w:t>.</w:t>
+      </w:r>
+      <w:r>
+        <w:t xml:space="preserve"> </w:t>
+      </w:r>
+      <w:r>
+        <w:t xml:space="preserve"> </w:t>
+      </w:r>
+      <w:r>
+        <w:t xml:space="preserve">In order to limit the risk of conflicts with other parts of the interface, the Map file of interest must be specified with the </w:t>
+      </w:r>
+      <w:r>
+        <w:rPr>
+          <w:b/>
+          <w:bCs/>
+        </w:rPr>
+        <w:t xml:space="preserve">Map File Post-Processing </w:t>
+      </w:r>
+      <w:r>
+        <w:t xml:space="preserve">button. </w:t>
+      </w:r>
+      <w:r>
+        <w:t xml:space="preserve">Two map edition methods are then proposed: </w:t>
+      </w:r>
+    </w:p>
+    <w:p>
+      <w:pPr>
+        <w:pStyle w:val="ListParagraph"/>
+        <w:numPr>
+          <w:ilvl w:val="0"/>
+          <w:numId w:val="2"/>
+        </w:numPr>
+        <w:jc w:val="both"/>
+      </w:pPr>
+      <w:r>
+        <w:rPr>
+          <w:b/>
+          <w:bCs/>
+        </w:rPr>
+        <w:t xml:space="preserve">Topographical </w:t>
+      </w:r>
+      <w:r>
+        <w:rPr>
+          <w:b/>
+          <w:bCs/>
+        </w:rPr>
+        <w:t>C</w:t>
+      </w:r>
+      <w:r>
+        <w:rPr>
+          <w:b/>
+          <w:bCs/>
+        </w:rPr>
+        <w:t>orrection</w:t>
+      </w:r>
+      <w:r>
+        <w:rPr>
+          <w:b/>
+          <w:bCs/>
+        </w:rPr>
+        <w:t>:</w:t>
+      </w:r>
+      <w:r>
+        <w:t xml:space="preserve"> Modifies the height of points in the map to obtain a smoother topography. Can be performed automatically through the </w:t>
+      </w:r>
+      <w:r>
+        <w:rPr>
+          <w:b/>
+          <w:bCs/>
+        </w:rPr>
+        <w:t xml:space="preserve">Launch Gaussian Correction </w:t>
+      </w:r>
+      <w:r>
+        <w:t xml:space="preserve">button, or manually through the </w:t>
+      </w:r>
+      <w:r>
+        <w:rPr>
+          <w:b/>
+          <w:bCs/>
+        </w:rPr>
+        <w:t xml:space="preserve">Launch Manual Rectification </w:t>
+      </w:r>
+      <w:r>
+        <w:t xml:space="preserve">button. </w:t>
+      </w:r>
+      <w:r>
+        <w:t xml:space="preserve">In manual rectification, the position of points above and below the two height thresholds are automatically computed based the position of their neighbours. </w:t>
+      </w:r>
+      <w:r>
+        <w:t xml:space="preserve">After this step, it is possible to manually select points on the mesh, and recompute their position by pressing the </w:t>
+      </w:r>
+      <w:r>
+        <w:rPr>
+          <w:b/>
+          <w:bCs/>
+        </w:rPr>
+        <w:t>Delete</w:t>
+      </w:r>
+      <w:r>
+        <w:t xml:space="preserve"> </w:t>
+      </w:r>
+      <w:r>
+        <w:rPr>
+          <w:b/>
+          <w:bCs/>
+        </w:rPr>
+        <w:t>Key</w:t>
+      </w:r>
+      <w:r>
+        <w:t xml:space="preserve">. This step can be repeated as many times as needed to obtain </w:t>
+      </w:r>
+      <w:r>
+        <w:lastRenderedPageBreak/>
+        <w:t xml:space="preserve">a satisfactory result, and the mesh can be saved to the name set in the </w:t>
+      </w:r>
+      <w:r>
+        <w:rPr>
+          <w:b/>
+          <w:bCs/>
+        </w:rPr>
+        <w:t>Name of the corrected map</w:t>
+      </w:r>
+      <w:r>
+        <w:t xml:space="preserve"> edit field by pressing the </w:t>
+      </w:r>
+      <w:r>
+        <w:rPr>
+          <w:b/>
+          <w:bCs/>
+        </w:rPr>
+        <w:t>S Key.</w:t>
+      </w:r>
+    </w:p>
+    <w:p>
+      <w:pPr>
+        <w:pStyle w:val="ListParagraph"/>
+        <w:numPr>
+          <w:ilvl w:val="0"/>
+          <w:numId w:val="2"/>
+        </w:numPr>
+        <w:jc w:val="both"/>
+      </w:pPr>
+      <w:r>
+        <w:rPr>
+          <w:b/>
+          <w:bCs/>
+        </w:rPr>
+        <w:t>Topographical Interpolation:</w:t>
+      </w:r>
+      <w:r>
+        <w:t xml:space="preserve"> STORM-MSI supports two ways of interpolating data, one of which being the direct interpolation of the map file in the interface. The other</w:t>
+      </w:r>
+      <w:r>
+        <w:t xml:space="preserve"> is through the interf</w:t>
+      </w:r>
+      <w:r>
+        <w:t>ace that builds PLY f</w:t>
+      </w:r>
+      <w:r>
+        <w:t>iles out of the CSV output</w:t>
+      </w:r>
+      <w:r>
+        <w:t xml:space="preserve"> file</w:t>
+      </w:r>
+      <w:r>
+        <w:t xml:space="preserve">, and </w:t>
+      </w:r>
+      <w:r>
+        <w:t>will be mentioned further down</w:t>
+      </w:r>
+      <w:r>
+        <w:t>.</w:t>
+      </w:r>
+      <w:r>
+        <w:t xml:space="preserve"> For the former, just write a name for the new map in the corresponding text field, specify the </w:t>
+      </w:r>
+      <w:r>
+        <w:rPr>
+          <w:b/>
+          <w:bCs/>
+        </w:rPr>
+        <w:t>Point Multiplier</w:t>
+      </w:r>
+      <w:r>
+        <w:t xml:space="preserve">, and press the </w:t>
+      </w:r>
+      <w:r>
+        <w:rPr>
+          <w:b/>
+          <w:bCs/>
+        </w:rPr>
+        <w:t xml:space="preserve">Launch Interpolation </w:t>
+      </w:r>
+      <w:r>
+        <w:t>button.</w:t>
+      </w:r>
+    </w:p>
+    <w:p>
+      <w:pPr>
+        <w:pStyle w:val="ListParagraph"/>
+        <w:ind w:left="2340"/>
+        <w:jc w:val="both"/>
+      </w:pPr>
+    </w:p>
+    <w:p>
+      <w:pPr>
+        <w:pStyle w:val="ListParagraph"/>
+        <w:numPr>
+          <w:ilvl w:val="2"/>
+          <w:numId w:val="1"/>
+        </w:numPr>
+        <w:jc w:val="both"/>
+      </w:pPr>
+      <w:r>
+        <w:t>Display From External Data Panel</w:t>
+      </w:r>
+    </w:p>
+    <w:p>
+      <w:pPr>
+        <w:jc w:val="both"/>
+      </w:pPr>
+      <w:r>
+        <w:t xml:space="preserve">TODO: Check what format is expected for the data </w:t>
+      </w:r>
+    </w:p>
+    <w:p>
+      <w:pPr>
+        <w:pStyle w:val="ListParagraph"/>
+        <w:numPr>
+          <w:ilvl w:val="2"/>
+          <w:numId w:val="1"/>
+        </w:numPr>
+        <w:jc w:val="both"/>
+      </w:pPr>
+      <w:r>
+        <w:t>Data Extraction Panel</w:t>
+      </w:r>
+      <w:r>
+        <w:t xml:space="preserve"> </w:t>
+      </w:r>
+    </w:p>
+    <w:p>
+      <w:pPr>
+        <w:ind w:firstLine="360"/>
+        <w:jc w:val="both"/>
+      </w:pPr>
+      <w:r>
+        <w:t xml:space="preserve">The Data Extraction panel contains methods to extract the data to two main formats, namely </w:t>
+      </w:r>
+      <w:proofErr w:type="spellStart"/>
+      <w:r>
+        <w:t>imZML</w:t>
+      </w:r>
+      <w:proofErr w:type="spellEnd"/>
+      <w:r>
+        <w:t xml:space="preserve"> and CSV, as well as several tools to process CSV files. </w:t>
+      </w:r>
+    </w:p>
+    <w:p>
+      <w:pPr>
+        <w:ind w:firstLine="360"/>
+        <w:jc w:val="both"/>
+      </w:pPr>
     </w:p>
     <w:p>
       <w:pPr>
@@ -3063,6 +5190,95 @@
     </w:lvl>
   </w:abstractNum>
   <w:abstractNum w:abstractNumId="4" w15:restartNumberingAfterBreak="0">
+    <w:nsid w:val="5C503B3F"/>
+    <w:multiLevelType w:val="hybridMultilevel"/>
+    <w:tmpl w:val="140EBFD0"/>
+    <w:lvl w:ilvl="0" w:tplc="D79AB0B2">
+      <w:start w:val="1"/>
+      <w:numFmt w:val="decimal"/>
+      <w:lvlText w:val="%1-"/>
+      <w:lvlJc w:val="left"/>
+      <w:pPr>
+        <w:ind w:left="1800" w:hanging="360"/>
+      </w:pPr>
+      <w:rPr>
+        <w:rFonts w:hint="default"/>
+      </w:rPr>
+    </w:lvl>
+    <w:lvl w:ilvl="1" w:tplc="04090019" w:tentative="1">
+      <w:start w:val="1"/>
+      <w:numFmt w:val="lowerLetter"/>
+      <w:lvlText w:val="%2."/>
+      <w:lvlJc w:val="left"/>
+      <w:pPr>
+        <w:ind w:left="2520" w:hanging="360"/>
+      </w:pPr>
+    </w:lvl>
+    <w:lvl w:ilvl="2" w:tplc="0409001B" w:tentative="1">
+      <w:start w:val="1"/>
+      <w:numFmt w:val="lowerRoman"/>
+      <w:lvlText w:val="%3."/>
+      <w:lvlJc w:val="right"/>
+      <w:pPr>
+        <w:ind w:left="3240" w:hanging="180"/>
+      </w:pPr>
+    </w:lvl>
+    <w:lvl w:ilvl="3" w:tplc="0409000F" w:tentative="1">
+      <w:start w:val="1"/>
+      <w:numFmt w:val="decimal"/>
+      <w:lvlText w:val="%4."/>
+      <w:lvlJc w:val="left"/>
+      <w:pPr>
+        <w:ind w:left="3960" w:hanging="360"/>
+      </w:pPr>
+    </w:lvl>
+    <w:lvl w:ilvl="4" w:tplc="04090019" w:tentative="1">
+      <w:start w:val="1"/>
+      <w:numFmt w:val="lowerLetter"/>
+      <w:lvlText w:val="%5."/>
+      <w:lvlJc w:val="left"/>
+      <w:pPr>
+        <w:ind w:left="4680" w:hanging="360"/>
+      </w:pPr>
+    </w:lvl>
+    <w:lvl w:ilvl="5" w:tplc="0409001B" w:tentative="1">
+      <w:start w:val="1"/>
+      <w:numFmt w:val="lowerRoman"/>
+      <w:lvlText w:val="%6."/>
+      <w:lvlJc w:val="right"/>
+      <w:pPr>
+        <w:ind w:left="5400" w:hanging="180"/>
+      </w:pPr>
+    </w:lvl>
+    <w:lvl w:ilvl="6" w:tplc="0409000F" w:tentative="1">
+      <w:start w:val="1"/>
+      <w:numFmt w:val="decimal"/>
+      <w:lvlText w:val="%7."/>
+      <w:lvlJc w:val="left"/>
+      <w:pPr>
+        <w:ind w:left="6120" w:hanging="360"/>
+      </w:pPr>
+    </w:lvl>
+    <w:lvl w:ilvl="7" w:tplc="04090019" w:tentative="1">
+      <w:start w:val="1"/>
+      <w:numFmt w:val="lowerLetter"/>
+      <w:lvlText w:val="%8."/>
+      <w:lvlJc w:val="left"/>
+      <w:pPr>
+        <w:ind w:left="6840" w:hanging="360"/>
+      </w:pPr>
+    </w:lvl>
+    <w:lvl w:ilvl="8" w:tplc="0409001B" w:tentative="1">
+      <w:start w:val="1"/>
+      <w:numFmt w:val="lowerRoman"/>
+      <w:lvlText w:val="%9."/>
+      <w:lvlJc w:val="right"/>
+      <w:pPr>
+        <w:ind w:left="7560" w:hanging="180"/>
+      </w:pPr>
+    </w:lvl>
+  </w:abstractNum>
+  <w:abstractNum w:abstractNumId="5" w15:restartNumberingAfterBreak="0">
     <w:nsid w:val="7654400F"/>
     <w:multiLevelType w:val="hybridMultilevel"/>
     <w:tmpl w:val="4748F1C0"/>
@@ -3151,7 +5367,7 @@
       </w:pPr>
     </w:lvl>
   </w:abstractNum>
-  <w:abstractNum w:abstractNumId="5" w15:restartNumberingAfterBreak="0">
+  <w:abstractNum w:abstractNumId="6" w15:restartNumberingAfterBreak="0">
     <w:nsid w:val="77C505ED"/>
     <w:multiLevelType w:val="hybridMultilevel"/>
     <w:tmpl w:val="9D847BBC"/>
@@ -3267,19 +5483,22 @@
     <w:abstractNumId w:val="0"/>
   </w:num>
   <w:num w:numId="2" w16cid:durableId="1077285924">
-    <w:abstractNumId w:val="5"/>
+    <w:abstractNumId w:val="6"/>
   </w:num>
   <w:num w:numId="3" w16cid:durableId="756291988">
     <w:abstractNumId w:val="3"/>
   </w:num>
   <w:num w:numId="4" w16cid:durableId="1821463091">
-    <w:abstractNumId w:val="4"/>
+    <w:abstractNumId w:val="5"/>
   </w:num>
   <w:num w:numId="5" w16cid:durableId="959337977">
     <w:abstractNumId w:val="1"/>
   </w:num>
   <w:num w:numId="6" w16cid:durableId="2035501572">
     <w:abstractNumId w:val="2"/>
+  </w:num>
+  <w:num w:numId="7" w16cid:durableId="926304486">
+    <w:abstractNumId w:val="4"/>
   </w:num>
 </w:numbering>
 </file>
@@ -4255,6 +6474,51 @@
       <w:shd w:val="clear" w:color="auto" w:fill="E1DFDD"/>
     </w:rPr>
   </w:style>
+  <w:style w:type="paragraph" w:styleId="TOC2">
+    <w:name w:val="toc 2"/>
+    <w:basedOn w:val="Normal"/>
+    <w:next w:val="Normal"/>
+    <w:autoRedefine/>
+    <w:uiPriority w:val="39"/>
+    <w:unhideWhenUsed/>
+    <w:rsid w:val="00867EE4"/>
+    <w:pPr>
+      <w:spacing w:after="100"/>
+      <w:ind w:left="240"/>
+    </w:pPr>
+  </w:style>
+  <w:style w:type="paragraph" w:styleId="TOC3">
+    <w:name w:val="toc 3"/>
+    <w:basedOn w:val="Normal"/>
+    <w:next w:val="Normal"/>
+    <w:autoRedefine/>
+    <w:uiPriority w:val="39"/>
+    <w:unhideWhenUsed/>
+    <w:rsid w:val="00867EE4"/>
+    <w:pPr>
+      <w:spacing w:after="100"/>
+      <w:ind w:left="480"/>
+    </w:pPr>
+  </w:style>
+  <w:style w:type="paragraph" w:styleId="Caption">
+    <w:name w:val="caption"/>
+    <w:basedOn w:val="Normal"/>
+    <w:next w:val="Normal"/>
+    <w:uiPriority w:val="35"/>
+    <w:unhideWhenUsed/>
+    <w:qFormat/>
+    <w:rsid w:val="00FB6D27"/>
+    <w:pPr>
+      <w:spacing w:after="200" w:line="240" w:lineRule="auto"/>
+    </w:pPr>
+    <w:rPr>
+      <w:i/>
+      <w:iCs/>
+      <w:color w:val="44546A" w:themeColor="text2"/>
+      <w:sz w:val="18"/>
+      <w:szCs w:val="18"/>
+    </w:rPr>
+  </w:style>
 </w:styles>
 </file>
 

</xml_diff>

<commit_message>
Added the initial version of the documentation, tweaked some more UI elements
</commit_message>
<xml_diff>
--- a/documents/User_Guide.docx
+++ b/documents/User_Guide.docx
@@ -435,7 +435,7 @@
                     </pic:cNvPicPr>
                   </pic:nvPicPr>
                   <pic:blipFill>
-                    <a:blip r:embed="rId6" cstate="print">
+                    <a:blip r:embed="rId8" cstate="print">
                       <a:extLst>
                         <a:ext uri="{28A0092B-C50C-407E-A947-70E740481C1C}">
                           <a14:useLocalDpi xmlns:a14="http://schemas.microsoft.com/office/drawing/2010/main" val="0"/>
@@ -529,7 +529,7 @@
           <w:r>
             <w:fldChar w:fldCharType="separate"/>
           </w:r>
-          <w:hyperlink w:anchor="_Toc209097671" w:history="1">
+          <w:hyperlink w:anchor="_Toc209184884" w:history="1">
             <w:r>
               <w:rPr>
                 <w:rStyle w:val="Hyperlink"/>
@@ -572,7 +572,7 @@
                 <w:noProof/>
                 <w:webHidden/>
               </w:rPr>
-              <w:instrText xml:space="preserve"> PAGEREF _Toc209097671 \h </w:instrText>
+              <w:instrText xml:space="preserve"> PAGEREF _Toc209184884 \h </w:instrText>
             </w:r>
             <w:r>
               <w:rPr>
@@ -615,7 +615,7 @@
               <w:noProof/>
             </w:rPr>
           </w:pPr>
-          <w:hyperlink w:anchor="_Toc209097672" w:history="1">
+          <w:hyperlink w:anchor="_Toc209184885" w:history="1">
             <w:r>
               <w:rPr>
                 <w:rStyle w:val="Hyperlink"/>
@@ -656,7 +656,7 @@
                 <w:noProof/>
                 <w:webHidden/>
               </w:rPr>
-              <w:instrText xml:space="preserve"> PAGEREF _Toc209097672 \h </w:instrText>
+              <w:instrText xml:space="preserve"> PAGEREF _Toc209184885 \h </w:instrText>
             </w:r>
             <w:r>
               <w:rPr>
@@ -695,10 +695,11 @@
               <w:tab w:val="right" w:leader="dot" w:pos="9062"/>
             </w:tabs>
             <w:rPr>
+              <w:rFonts w:eastAsiaTheme="minorEastAsia"/>
               <w:noProof/>
             </w:rPr>
           </w:pPr>
-          <w:hyperlink w:anchor="_Toc209097673" w:history="1">
+          <w:hyperlink w:anchor="_Toc209184886" w:history="1">
             <w:r>
               <w:rPr>
                 <w:rStyle w:val="Hyperlink"/>
@@ -708,6 +709,7 @@
             </w:r>
             <w:r>
               <w:rPr>
+                <w:rFonts w:eastAsiaTheme="minorEastAsia"/>
                 <w:noProof/>
               </w:rPr>
               <w:tab/>
@@ -738,7 +740,7 @@
                 <w:noProof/>
                 <w:webHidden/>
               </w:rPr>
-              <w:instrText xml:space="preserve"> PAGEREF _Toc209097673 \h </w:instrText>
+              <w:instrText xml:space="preserve"> PAGEREF _Toc209184886 \h </w:instrText>
             </w:r>
             <w:r>
               <w:rPr>
@@ -777,10 +779,11 @@
               <w:tab w:val="right" w:leader="dot" w:pos="9062"/>
             </w:tabs>
             <w:rPr>
+              <w:rFonts w:eastAsiaTheme="minorEastAsia"/>
               <w:noProof/>
             </w:rPr>
           </w:pPr>
-          <w:hyperlink w:anchor="_Toc209097674" w:history="1">
+          <w:hyperlink w:anchor="_Toc209184887" w:history="1">
             <w:r>
               <w:rPr>
                 <w:rStyle w:val="Hyperlink"/>
@@ -790,6 +793,7 @@
             </w:r>
             <w:r>
               <w:rPr>
+                <w:rFonts w:eastAsiaTheme="minorEastAsia"/>
                 <w:noProof/>
               </w:rPr>
               <w:tab/>
@@ -820,7 +824,7 @@
                 <w:noProof/>
                 <w:webHidden/>
               </w:rPr>
-              <w:instrText xml:space="preserve"> PAGEREF _Toc209097674 \h </w:instrText>
+              <w:instrText xml:space="preserve"> PAGEREF _Toc209184887 \h </w:instrText>
             </w:r>
             <w:r>
               <w:rPr>
@@ -863,7 +867,7 @@
               <w:noProof/>
             </w:rPr>
           </w:pPr>
-          <w:hyperlink w:anchor="_Toc209097675" w:history="1">
+          <w:hyperlink w:anchor="_Toc209184888" w:history="1">
             <w:r>
               <w:rPr>
                 <w:rStyle w:val="Hyperlink"/>
@@ -904,7 +908,7 @@
                 <w:noProof/>
                 <w:webHidden/>
               </w:rPr>
-              <w:instrText xml:space="preserve"> PAGEREF _Toc209097675 \h </w:instrText>
+              <w:instrText xml:space="preserve"> PAGEREF _Toc209184888 \h </w:instrText>
             </w:r>
             <w:r>
               <w:rPr>
@@ -943,10 +947,11 @@
               <w:tab w:val="right" w:leader="dot" w:pos="9062"/>
             </w:tabs>
             <w:rPr>
+              <w:rFonts w:eastAsiaTheme="minorEastAsia"/>
               <w:noProof/>
             </w:rPr>
           </w:pPr>
-          <w:hyperlink w:anchor="_Toc209097676" w:history="1">
+          <w:hyperlink w:anchor="_Toc209184889" w:history="1">
             <w:r>
               <w:rPr>
                 <w:rStyle w:val="Hyperlink"/>
@@ -956,6 +961,7 @@
             </w:r>
             <w:r>
               <w:rPr>
+                <w:rFonts w:eastAsiaTheme="minorEastAsia"/>
                 <w:noProof/>
               </w:rPr>
               <w:tab/>
@@ -986,7 +992,7 @@
                 <w:noProof/>
                 <w:webHidden/>
               </w:rPr>
-              <w:instrText xml:space="preserve"> PAGEREF _Toc209097676 \h </w:instrText>
+              <w:instrText xml:space="preserve"> PAGEREF _Toc209184889 \h </w:instrText>
             </w:r>
             <w:r>
               <w:rPr>
@@ -1025,10 +1031,11 @@
               <w:tab w:val="right" w:leader="dot" w:pos="9062"/>
             </w:tabs>
             <w:rPr>
+              <w:rFonts w:eastAsiaTheme="minorEastAsia"/>
               <w:noProof/>
             </w:rPr>
           </w:pPr>
-          <w:hyperlink w:anchor="_Toc209097677" w:history="1">
+          <w:hyperlink w:anchor="_Toc209184890" w:history="1">
             <w:r>
               <w:rPr>
                 <w:rStyle w:val="Hyperlink"/>
@@ -1038,6 +1045,7 @@
             </w:r>
             <w:r>
               <w:rPr>
+                <w:rFonts w:eastAsiaTheme="minorEastAsia"/>
                 <w:noProof/>
               </w:rPr>
               <w:tab/>
@@ -1068,7 +1076,7 @@
                 <w:noProof/>
                 <w:webHidden/>
               </w:rPr>
-              <w:instrText xml:space="preserve"> PAGEREF _Toc209097677 \h </w:instrText>
+              <w:instrText xml:space="preserve"> PAGEREF _Toc209184890 \h </w:instrText>
             </w:r>
             <w:r>
               <w:rPr>
@@ -1107,19 +1115,21 @@
               <w:tab w:val="right" w:leader="dot" w:pos="9062"/>
             </w:tabs>
             <w:rPr>
+              <w:rFonts w:eastAsiaTheme="minorEastAsia"/>
               <w:noProof/>
             </w:rPr>
           </w:pPr>
-          <w:hyperlink w:anchor="_Toc209097678" w:history="1">
+          <w:hyperlink w:anchor="_Toc209184891" w:history="1">
             <w:r>
               <w:rPr>
                 <w:rStyle w:val="Hyperlink"/>
                 <w:noProof/>
               </w:rPr>
-              <w:t>1)</w:t>
-            </w:r>
-            <w:r>
-              <w:rPr>
+              <w:t>1-</w:t>
+            </w:r>
+            <w:r>
+              <w:rPr>
+                <w:rFonts w:eastAsiaTheme="minorEastAsia"/>
                 <w:noProof/>
               </w:rPr>
               <w:tab/>
@@ -1150,7 +1160,7 @@
                 <w:noProof/>
                 <w:webHidden/>
               </w:rPr>
-              <w:instrText xml:space="preserve"> PAGEREF _Toc209097678 \h </w:instrText>
+              <w:instrText xml:space="preserve"> PAGEREF _Toc209184891 \h </w:instrText>
             </w:r>
             <w:r>
               <w:rPr>
@@ -1189,19 +1199,21 @@
               <w:tab w:val="right" w:leader="dot" w:pos="9062"/>
             </w:tabs>
             <w:rPr>
+              <w:rFonts w:eastAsiaTheme="minorEastAsia"/>
               <w:noProof/>
             </w:rPr>
           </w:pPr>
-          <w:hyperlink w:anchor="_Toc209097679" w:history="1">
+          <w:hyperlink w:anchor="_Toc209184892" w:history="1">
             <w:r>
               <w:rPr>
                 <w:rStyle w:val="Hyperlink"/>
                 <w:noProof/>
               </w:rPr>
-              <w:t>2)</w:t>
-            </w:r>
-            <w:r>
-              <w:rPr>
+              <w:t>2-</w:t>
+            </w:r>
+            <w:r>
+              <w:rPr>
+                <w:rFonts w:eastAsiaTheme="minorEastAsia"/>
                 <w:noProof/>
               </w:rPr>
               <w:tab/>
@@ -1232,7 +1244,7 @@
                 <w:noProof/>
                 <w:webHidden/>
               </w:rPr>
-              <w:instrText xml:space="preserve"> PAGEREF _Toc209097679 \h </w:instrText>
+              <w:instrText xml:space="preserve"> PAGEREF _Toc209184892 \h </w:instrText>
             </w:r>
             <w:r>
               <w:rPr>
@@ -1271,19 +1283,21 @@
               <w:tab w:val="right" w:leader="dot" w:pos="9062"/>
             </w:tabs>
             <w:rPr>
+              <w:rFonts w:eastAsiaTheme="minorEastAsia"/>
               <w:noProof/>
             </w:rPr>
           </w:pPr>
-          <w:hyperlink w:anchor="_Toc209097680" w:history="1">
+          <w:hyperlink w:anchor="_Toc209184893" w:history="1">
             <w:r>
               <w:rPr>
                 <w:rStyle w:val="Hyperlink"/>
                 <w:noProof/>
               </w:rPr>
-              <w:t>3)</w:t>
-            </w:r>
-            <w:r>
-              <w:rPr>
+              <w:t>3-</w:t>
+            </w:r>
+            <w:r>
+              <w:rPr>
+                <w:rFonts w:eastAsiaTheme="minorEastAsia"/>
                 <w:noProof/>
               </w:rPr>
               <w:tab/>
@@ -1314,7 +1328,7 @@
                 <w:noProof/>
                 <w:webHidden/>
               </w:rPr>
-              <w:instrText xml:space="preserve"> PAGEREF _Toc209097680 \h </w:instrText>
+              <w:instrText xml:space="preserve"> PAGEREF _Toc209184893 \h </w:instrText>
             </w:r>
             <w:r>
               <w:rPr>
@@ -1353,19 +1367,21 @@
               <w:tab w:val="right" w:leader="dot" w:pos="9062"/>
             </w:tabs>
             <w:rPr>
+              <w:rFonts w:eastAsiaTheme="minorEastAsia"/>
               <w:noProof/>
             </w:rPr>
           </w:pPr>
-          <w:hyperlink w:anchor="_Toc209097681" w:history="1">
+          <w:hyperlink w:anchor="_Toc209184894" w:history="1">
             <w:r>
               <w:rPr>
                 <w:rStyle w:val="Hyperlink"/>
                 <w:noProof/>
               </w:rPr>
-              <w:t>4)</w:t>
-            </w:r>
-            <w:r>
-              <w:rPr>
+              <w:t>4-</w:t>
+            </w:r>
+            <w:r>
+              <w:rPr>
+                <w:rFonts w:eastAsiaTheme="minorEastAsia"/>
                 <w:noProof/>
               </w:rPr>
               <w:tab/>
@@ -1396,7 +1412,7 @@
                 <w:noProof/>
                 <w:webHidden/>
               </w:rPr>
-              <w:instrText xml:space="preserve"> PAGEREF _Toc209097681 \h </w:instrText>
+              <w:instrText xml:space="preserve"> PAGEREF _Toc209184894 \h </w:instrText>
             </w:r>
             <w:r>
               <w:rPr>
@@ -1435,19 +1451,21 @@
               <w:tab w:val="right" w:leader="dot" w:pos="9062"/>
             </w:tabs>
             <w:rPr>
+              <w:rFonts w:eastAsiaTheme="minorEastAsia"/>
               <w:noProof/>
             </w:rPr>
           </w:pPr>
-          <w:hyperlink w:anchor="_Toc209097682" w:history="1">
+          <w:hyperlink w:anchor="_Toc209184895" w:history="1">
             <w:r>
               <w:rPr>
                 <w:rStyle w:val="Hyperlink"/>
                 <w:noProof/>
               </w:rPr>
-              <w:t>5)</w:t>
-            </w:r>
-            <w:r>
-              <w:rPr>
+              <w:t>5-</w:t>
+            </w:r>
+            <w:r>
+              <w:rPr>
+                <w:rFonts w:eastAsiaTheme="minorEastAsia"/>
                 <w:noProof/>
               </w:rPr>
               <w:tab/>
@@ -1478,7 +1496,7 @@
                 <w:noProof/>
                 <w:webHidden/>
               </w:rPr>
-              <w:instrText xml:space="preserve"> PAGEREF _Toc209097682 \h </w:instrText>
+              <w:instrText xml:space="preserve"> PAGEREF _Toc209184895 \h </w:instrText>
             </w:r>
             <w:r>
               <w:rPr>
@@ -1517,19 +1535,21 @@
               <w:tab w:val="right" w:leader="dot" w:pos="9062"/>
             </w:tabs>
             <w:rPr>
+              <w:rFonts w:eastAsiaTheme="minorEastAsia"/>
               <w:noProof/>
             </w:rPr>
           </w:pPr>
-          <w:hyperlink w:anchor="_Toc209097683" w:history="1">
+          <w:hyperlink w:anchor="_Toc209184896" w:history="1">
             <w:r>
               <w:rPr>
                 <w:rStyle w:val="Hyperlink"/>
                 <w:noProof/>
               </w:rPr>
-              <w:t>6)</w:t>
-            </w:r>
-            <w:r>
-              <w:rPr>
+              <w:t>6-</w:t>
+            </w:r>
+            <w:r>
+              <w:rPr>
+                <w:rFonts w:eastAsiaTheme="minorEastAsia"/>
                 <w:noProof/>
               </w:rPr>
               <w:tab/>
@@ -1560,7 +1580,7 @@
                 <w:noProof/>
                 <w:webHidden/>
               </w:rPr>
-              <w:instrText xml:space="preserve"> PAGEREF _Toc209097683 \h </w:instrText>
+              <w:instrText xml:space="preserve"> PAGEREF _Toc209184896 \h </w:instrText>
             </w:r>
             <w:r>
               <w:rPr>
@@ -1599,10 +1619,11 @@
               <w:tab w:val="right" w:leader="dot" w:pos="9062"/>
             </w:tabs>
             <w:rPr>
+              <w:rFonts w:eastAsiaTheme="minorEastAsia"/>
               <w:noProof/>
             </w:rPr>
           </w:pPr>
-          <w:hyperlink w:anchor="_Toc209097684" w:history="1">
+          <w:hyperlink w:anchor="_Toc209184897" w:history="1">
             <w:r>
               <w:rPr>
                 <w:rStyle w:val="Hyperlink"/>
@@ -1612,6 +1633,7 @@
             </w:r>
             <w:r>
               <w:rPr>
+                <w:rFonts w:eastAsiaTheme="minorEastAsia"/>
                 <w:noProof/>
               </w:rPr>
               <w:tab/>
@@ -1642,7 +1664,7 @@
                 <w:noProof/>
                 <w:webHidden/>
               </w:rPr>
-              <w:instrText xml:space="preserve"> PAGEREF _Toc209097684 \h </w:instrText>
+              <w:instrText xml:space="preserve"> PAGEREF _Toc209184897 \h </w:instrText>
             </w:r>
             <w:r>
               <w:rPr>
@@ -1677,18 +1699,34 @@
           <w:pPr>
             <w:pStyle w:val="TOC3"/>
             <w:tabs>
+              <w:tab w:val="left" w:pos="960"/>
               <w:tab w:val="right" w:leader="dot" w:pos="9062"/>
             </w:tabs>
             <w:rPr>
+              <w:rFonts w:eastAsiaTheme="minorEastAsia"/>
               <w:noProof/>
             </w:rPr>
           </w:pPr>
-          <w:hyperlink w:anchor="_Toc209097685" w:history="1">
+          <w:hyperlink w:anchor="_Toc209184898" w:history="1">
             <w:r>
               <w:rPr>
                 <w:rStyle w:val="Hyperlink"/>
                 <w:noProof/>
               </w:rPr>
+              <w:t>1-</w:t>
+            </w:r>
+            <w:r>
+              <w:rPr>
+                <w:rFonts w:eastAsiaTheme="minorEastAsia"/>
+                <w:noProof/>
+              </w:rPr>
+              <w:tab/>
+            </w:r>
+            <w:r>
+              <w:rPr>
+                <w:rStyle w:val="Hyperlink"/>
+                <w:noProof/>
+              </w:rPr>
               <w:t>Project Structure</w:t>
             </w:r>
             <w:r>
@@ -1710,7 +1748,7 @@
                 <w:noProof/>
                 <w:webHidden/>
               </w:rPr>
-              <w:instrText xml:space="preserve"> PAGEREF _Toc209097685 \h </w:instrText>
+              <w:instrText xml:space="preserve"> PAGEREF _Toc209184898 \h </w:instrText>
             </w:r>
             <w:r>
               <w:rPr>
@@ -1745,29 +1783,45 @@
           <w:pPr>
             <w:pStyle w:val="TOC3"/>
             <w:tabs>
+              <w:tab w:val="left" w:pos="960"/>
               <w:tab w:val="right" w:leader="dot" w:pos="9062"/>
             </w:tabs>
             <w:rPr>
+              <w:rFonts w:eastAsiaTheme="minorEastAsia"/>
               <w:noProof/>
             </w:rPr>
           </w:pPr>
-          <w:hyperlink w:anchor="_Toc209097686" w:history="1">
+          <w:hyperlink w:anchor="_Toc209184899" w:history="1">
             <w:r>
               <w:rPr>
                 <w:rStyle w:val="Hyperlink"/>
                 <w:noProof/>
               </w:rPr>
-              <w:t>1. Generating a Mat file</w:t>
-            </w:r>
-            <w:r>
-              <w:rPr>
-                <w:noProof/>
-                <w:webHidden/>
+              <w:t>2-</w:t>
+            </w:r>
+            <w:r>
+              <w:rPr>
+                <w:rFonts w:eastAsiaTheme="minorEastAsia"/>
+                <w:noProof/>
               </w:rPr>
               <w:tab/>
             </w:r>
             <w:r>
               <w:rPr>
+                <w:rStyle w:val="Hyperlink"/>
+                <w:noProof/>
+              </w:rPr>
+              <w:t>Generating a Mat file</w:t>
+            </w:r>
+            <w:r>
+              <w:rPr>
+                <w:noProof/>
+                <w:webHidden/>
+              </w:rPr>
+              <w:tab/>
+            </w:r>
+            <w:r>
+              <w:rPr>
                 <w:noProof/>
                 <w:webHidden/>
               </w:rPr>
@@ -1778,7 +1832,7 @@
                 <w:noProof/>
                 <w:webHidden/>
               </w:rPr>
-              <w:instrText xml:space="preserve"> PAGEREF _Toc209097686 \h </w:instrText>
+              <w:instrText xml:space="preserve"> PAGEREF _Toc209184899 \h </w:instrText>
             </w:r>
             <w:r>
               <w:rPr>
@@ -1799,6 +1853,426 @@
                 <w:webHidden/>
               </w:rPr>
               <w:t>7</w:t>
+            </w:r>
+            <w:r>
+              <w:rPr>
+                <w:noProof/>
+                <w:webHidden/>
+              </w:rPr>
+              <w:fldChar w:fldCharType="end"/>
+            </w:r>
+          </w:hyperlink>
+        </w:p>
+        <w:p>
+          <w:pPr>
+            <w:pStyle w:val="TOC3"/>
+            <w:tabs>
+              <w:tab w:val="left" w:pos="960"/>
+              <w:tab w:val="right" w:leader="dot" w:pos="9062"/>
+            </w:tabs>
+            <w:rPr>
+              <w:rFonts w:eastAsiaTheme="minorEastAsia"/>
+              <w:noProof/>
+            </w:rPr>
+          </w:pPr>
+          <w:hyperlink w:anchor="_Toc209184900" w:history="1">
+            <w:r>
+              <w:rPr>
+                <w:rStyle w:val="Hyperlink"/>
+                <w:noProof/>
+              </w:rPr>
+              <w:t>3-</w:t>
+            </w:r>
+            <w:r>
+              <w:rPr>
+                <w:rFonts w:eastAsiaTheme="minorEastAsia"/>
+                <w:noProof/>
+              </w:rPr>
+              <w:tab/>
+            </w:r>
+            <w:r>
+              <w:rPr>
+                <w:rStyle w:val="Hyperlink"/>
+                <w:noProof/>
+              </w:rPr>
+              <w:t>Processing Panel</w:t>
+            </w:r>
+            <w:r>
+              <w:rPr>
+                <w:noProof/>
+                <w:webHidden/>
+              </w:rPr>
+              <w:tab/>
+            </w:r>
+            <w:r>
+              <w:rPr>
+                <w:noProof/>
+                <w:webHidden/>
+              </w:rPr>
+              <w:fldChar w:fldCharType="begin"/>
+            </w:r>
+            <w:r>
+              <w:rPr>
+                <w:noProof/>
+                <w:webHidden/>
+              </w:rPr>
+              <w:instrText xml:space="preserve"> PAGEREF _Toc209184900 \h </w:instrText>
+            </w:r>
+            <w:r>
+              <w:rPr>
+                <w:noProof/>
+                <w:webHidden/>
+              </w:rPr>
+            </w:r>
+            <w:r>
+              <w:rPr>
+                <w:noProof/>
+                <w:webHidden/>
+              </w:rPr>
+              <w:fldChar w:fldCharType="separate"/>
+            </w:r>
+            <w:r>
+              <w:rPr>
+                <w:noProof/>
+                <w:webHidden/>
+              </w:rPr>
+              <w:t>9</w:t>
+            </w:r>
+            <w:r>
+              <w:rPr>
+                <w:noProof/>
+                <w:webHidden/>
+              </w:rPr>
+              <w:fldChar w:fldCharType="end"/>
+            </w:r>
+          </w:hyperlink>
+        </w:p>
+        <w:p>
+          <w:pPr>
+            <w:pStyle w:val="TOC3"/>
+            <w:tabs>
+              <w:tab w:val="left" w:pos="960"/>
+              <w:tab w:val="right" w:leader="dot" w:pos="9062"/>
+            </w:tabs>
+            <w:rPr>
+              <w:rFonts w:eastAsiaTheme="minorEastAsia"/>
+              <w:noProof/>
+            </w:rPr>
+          </w:pPr>
+          <w:hyperlink w:anchor="_Toc209184901" w:history="1">
+            <w:r>
+              <w:rPr>
+                <w:rStyle w:val="Hyperlink"/>
+                <w:noProof/>
+              </w:rPr>
+              <w:t>4-</w:t>
+            </w:r>
+            <w:r>
+              <w:rPr>
+                <w:rFonts w:eastAsiaTheme="minorEastAsia"/>
+                <w:noProof/>
+              </w:rPr>
+              <w:tab/>
+            </w:r>
+            <w:r>
+              <w:rPr>
+                <w:rStyle w:val="Hyperlink"/>
+                <w:noProof/>
+              </w:rPr>
+              <w:t>Post-Processing Panel</w:t>
+            </w:r>
+            <w:r>
+              <w:rPr>
+                <w:noProof/>
+                <w:webHidden/>
+              </w:rPr>
+              <w:tab/>
+            </w:r>
+            <w:r>
+              <w:rPr>
+                <w:noProof/>
+                <w:webHidden/>
+              </w:rPr>
+              <w:fldChar w:fldCharType="begin"/>
+            </w:r>
+            <w:r>
+              <w:rPr>
+                <w:noProof/>
+                <w:webHidden/>
+              </w:rPr>
+              <w:instrText xml:space="preserve"> PAGEREF _Toc209184901 \h </w:instrText>
+            </w:r>
+            <w:r>
+              <w:rPr>
+                <w:noProof/>
+                <w:webHidden/>
+              </w:rPr>
+            </w:r>
+            <w:r>
+              <w:rPr>
+                <w:noProof/>
+                <w:webHidden/>
+              </w:rPr>
+              <w:fldChar w:fldCharType="separate"/>
+            </w:r>
+            <w:r>
+              <w:rPr>
+                <w:noProof/>
+                <w:webHidden/>
+              </w:rPr>
+              <w:t>9</w:t>
+            </w:r>
+            <w:r>
+              <w:rPr>
+                <w:noProof/>
+                <w:webHidden/>
+              </w:rPr>
+              <w:fldChar w:fldCharType="end"/>
+            </w:r>
+          </w:hyperlink>
+        </w:p>
+        <w:p>
+          <w:pPr>
+            <w:pStyle w:val="TOC3"/>
+            <w:tabs>
+              <w:tab w:val="left" w:pos="960"/>
+              <w:tab w:val="right" w:leader="dot" w:pos="9062"/>
+            </w:tabs>
+            <w:rPr>
+              <w:rFonts w:eastAsiaTheme="minorEastAsia"/>
+              <w:noProof/>
+            </w:rPr>
+          </w:pPr>
+          <w:hyperlink w:anchor="_Toc209184902" w:history="1">
+            <w:r>
+              <w:rPr>
+                <w:rStyle w:val="Hyperlink"/>
+                <w:noProof/>
+              </w:rPr>
+              <w:t>5-</w:t>
+            </w:r>
+            <w:r>
+              <w:rPr>
+                <w:rFonts w:eastAsiaTheme="minorEastAsia"/>
+                <w:noProof/>
+              </w:rPr>
+              <w:tab/>
+            </w:r>
+            <w:r>
+              <w:rPr>
+                <w:rStyle w:val="Hyperlink"/>
+                <w:noProof/>
+              </w:rPr>
+              <w:t>Display From External Data Panel</w:t>
+            </w:r>
+            <w:r>
+              <w:rPr>
+                <w:noProof/>
+                <w:webHidden/>
+              </w:rPr>
+              <w:tab/>
+            </w:r>
+            <w:r>
+              <w:rPr>
+                <w:noProof/>
+                <w:webHidden/>
+              </w:rPr>
+              <w:fldChar w:fldCharType="begin"/>
+            </w:r>
+            <w:r>
+              <w:rPr>
+                <w:noProof/>
+                <w:webHidden/>
+              </w:rPr>
+              <w:instrText xml:space="preserve"> PAGEREF _Toc209184902 \h </w:instrText>
+            </w:r>
+            <w:r>
+              <w:rPr>
+                <w:noProof/>
+                <w:webHidden/>
+              </w:rPr>
+            </w:r>
+            <w:r>
+              <w:rPr>
+                <w:noProof/>
+                <w:webHidden/>
+              </w:rPr>
+              <w:fldChar w:fldCharType="separate"/>
+            </w:r>
+            <w:r>
+              <w:rPr>
+                <w:noProof/>
+                <w:webHidden/>
+              </w:rPr>
+              <w:t>10</w:t>
+            </w:r>
+            <w:r>
+              <w:rPr>
+                <w:noProof/>
+                <w:webHidden/>
+              </w:rPr>
+              <w:fldChar w:fldCharType="end"/>
+            </w:r>
+          </w:hyperlink>
+        </w:p>
+        <w:p>
+          <w:pPr>
+            <w:pStyle w:val="TOC3"/>
+            <w:tabs>
+              <w:tab w:val="left" w:pos="960"/>
+              <w:tab w:val="right" w:leader="dot" w:pos="9062"/>
+            </w:tabs>
+            <w:rPr>
+              <w:rFonts w:eastAsiaTheme="minorEastAsia"/>
+              <w:noProof/>
+            </w:rPr>
+          </w:pPr>
+          <w:hyperlink w:anchor="_Toc209184903" w:history="1">
+            <w:r>
+              <w:rPr>
+                <w:rStyle w:val="Hyperlink"/>
+                <w:noProof/>
+              </w:rPr>
+              <w:t>6-</w:t>
+            </w:r>
+            <w:r>
+              <w:rPr>
+                <w:rFonts w:eastAsiaTheme="minorEastAsia"/>
+                <w:noProof/>
+              </w:rPr>
+              <w:tab/>
+            </w:r>
+            <w:r>
+              <w:rPr>
+                <w:rStyle w:val="Hyperlink"/>
+                <w:noProof/>
+              </w:rPr>
+              <w:t>Data Extraction Panel</w:t>
+            </w:r>
+            <w:r>
+              <w:rPr>
+                <w:noProof/>
+                <w:webHidden/>
+              </w:rPr>
+              <w:tab/>
+            </w:r>
+            <w:r>
+              <w:rPr>
+                <w:noProof/>
+                <w:webHidden/>
+              </w:rPr>
+              <w:fldChar w:fldCharType="begin"/>
+            </w:r>
+            <w:r>
+              <w:rPr>
+                <w:noProof/>
+                <w:webHidden/>
+              </w:rPr>
+              <w:instrText xml:space="preserve"> PAGEREF _Toc209184903 \h </w:instrText>
+            </w:r>
+            <w:r>
+              <w:rPr>
+                <w:noProof/>
+                <w:webHidden/>
+              </w:rPr>
+            </w:r>
+            <w:r>
+              <w:rPr>
+                <w:noProof/>
+                <w:webHidden/>
+              </w:rPr>
+              <w:fldChar w:fldCharType="separate"/>
+            </w:r>
+            <w:r>
+              <w:rPr>
+                <w:noProof/>
+                <w:webHidden/>
+              </w:rPr>
+              <w:t>10</w:t>
+            </w:r>
+            <w:r>
+              <w:rPr>
+                <w:noProof/>
+                <w:webHidden/>
+              </w:rPr>
+              <w:fldChar w:fldCharType="end"/>
+            </w:r>
+          </w:hyperlink>
+        </w:p>
+        <w:p>
+          <w:pPr>
+            <w:pStyle w:val="TOC1"/>
+            <w:tabs>
+              <w:tab w:val="left" w:pos="480"/>
+              <w:tab w:val="right" w:leader="dot" w:pos="9062"/>
+            </w:tabs>
+            <w:rPr>
+              <w:rFonts w:eastAsiaTheme="minorEastAsia"/>
+              <w:noProof/>
+            </w:rPr>
+          </w:pPr>
+          <w:hyperlink w:anchor="_Toc209184904" w:history="1">
+            <w:r>
+              <w:rPr>
+                <w:rStyle w:val="Hyperlink"/>
+                <w:noProof/>
+              </w:rPr>
+              <w:t>IV.</w:t>
+            </w:r>
+            <w:r>
+              <w:rPr>
+                <w:rFonts w:eastAsiaTheme="minorEastAsia"/>
+                <w:noProof/>
+              </w:rPr>
+              <w:tab/>
+            </w:r>
+            <w:r>
+              <w:rPr>
+                <w:rStyle w:val="Hyperlink"/>
+                <w:noProof/>
+              </w:rPr>
+              <w:t>Contributions</w:t>
+            </w:r>
+            <w:r>
+              <w:rPr>
+                <w:noProof/>
+                <w:webHidden/>
+              </w:rPr>
+              <w:tab/>
+            </w:r>
+            <w:r>
+              <w:rPr>
+                <w:noProof/>
+                <w:webHidden/>
+              </w:rPr>
+              <w:fldChar w:fldCharType="begin"/>
+            </w:r>
+            <w:r>
+              <w:rPr>
+                <w:noProof/>
+                <w:webHidden/>
+              </w:rPr>
+              <w:instrText xml:space="preserve"> PAGEREF _Toc209184904 \h </w:instrText>
+            </w:r>
+            <w:r>
+              <w:rPr>
+                <w:noProof/>
+                <w:webHidden/>
+              </w:rPr>
+            </w:r>
+            <w:r>
+              <w:rPr>
+                <w:noProof/>
+                <w:webHidden/>
+              </w:rPr>
+              <w:fldChar w:fldCharType="separate"/>
+            </w:r>
+            <w:r>
+              <w:rPr>
+                <w:noProof/>
+                <w:webHidden/>
+              </w:rPr>
+              <w:t>10</w:t>
             </w:r>
             <w:r>
               <w:rPr>
@@ -1838,7 +2312,7 @@
           <w:lang w:val="fr-FR"/>
         </w:rPr>
       </w:pPr>
-      <w:bookmarkStart w:id="0" w:name="_Toc209097671"/>
+      <w:bookmarkStart w:id="0" w:name="_Toc209184884"/>
       <w:r>
         <w:rPr>
           <w:lang w:val="fr-FR"/>
@@ -1886,7 +2360,7 @@
         </w:numPr>
         <w:outlineLvl w:val="0"/>
       </w:pPr>
-      <w:bookmarkStart w:id="1" w:name="_Toc209097672"/>
+      <w:bookmarkStart w:id="1" w:name="_Toc209184885"/>
       <w:r>
         <w:t>Features</w:t>
       </w:r>
@@ -1901,7 +2375,7 @@
         </w:numPr>
         <w:outlineLvl w:val="1"/>
       </w:pPr>
-      <w:bookmarkStart w:id="2" w:name="_Toc209097673"/>
+      <w:bookmarkStart w:id="2" w:name="_Toc209184886"/>
       <w:r>
         <w:t>Data Acquisition</w:t>
       </w:r>
@@ -2002,7 +2476,7 @@
         </w:numPr>
         <w:outlineLvl w:val="1"/>
       </w:pPr>
-      <w:bookmarkStart w:id="3" w:name="_Toc209097674"/>
+      <w:bookmarkStart w:id="3" w:name="_Toc209184887"/>
       <w:r>
         <w:t>Data Processing</w:t>
       </w:r>
@@ -2082,7 +2556,7 @@
         </w:numPr>
         <w:outlineLvl w:val="0"/>
       </w:pPr>
-      <w:bookmarkStart w:id="4" w:name="_Toc209097675"/>
+      <w:bookmarkStart w:id="4" w:name="_Toc209184888"/>
       <w:r>
         <w:t>How to use</w:t>
       </w:r>
@@ -2097,11 +2571,15 @@
         </w:numPr>
         <w:outlineLvl w:val="1"/>
       </w:pPr>
-      <w:bookmarkStart w:id="5" w:name="_Toc209097676"/>
+      <w:bookmarkStart w:id="5" w:name="_Toc209184889"/>
+      <w:bookmarkStart w:id="6" w:name="_Ref209190477"/>
+      <w:bookmarkStart w:id="7" w:name="_Ref209190482"/>
       <w:r>
         <w:t>Prerequisites</w:t>
       </w:r>
       <w:bookmarkEnd w:id="5"/>
+      <w:bookmarkEnd w:id="6"/>
+      <w:bookmarkEnd w:id="7"/>
     </w:p>
     <w:p>
       <w:pPr>
@@ -2156,7 +2634,7 @@
         <w:t xml:space="preserve">. </w:t>
       </w:r>
       <w:r>
-        <w:t xml:space="preserve"> </w:t>
+        <w:t>Note that all Python dependencies can be run outside STORM-MSI’s framework through any Python IDE.</w:t>
       </w:r>
     </w:p>
     <w:p>
@@ -2397,7 +2875,7 @@
       <w:r>
         <w:t xml:space="preserve">he </w:t>
       </w:r>
-      <w:hyperlink r:id="rId7" w:history="1">
+      <w:hyperlink r:id="rId9" w:history="1">
         <w:r>
           <w:rPr>
             <w:rStyle w:val="Hyperlink"/>
@@ -2437,11 +2915,11 @@
         <w:jc w:val="both"/>
         <w:outlineLvl w:val="1"/>
       </w:pPr>
-      <w:bookmarkStart w:id="6" w:name="_Toc209097677"/>
+      <w:bookmarkStart w:id="8" w:name="_Toc209184890"/>
       <w:r>
         <w:t>Data Acquisition</w:t>
       </w:r>
-      <w:bookmarkEnd w:id="6"/>
+      <w:bookmarkEnd w:id="8"/>
     </w:p>
     <w:p>
       <w:pPr>
@@ -2479,16 +2957,16 @@
         <w:pStyle w:val="ListParagraph"/>
         <w:numPr>
           <w:ilvl w:val="0"/>
-          <w:numId w:val="3"/>
+          <w:numId w:val="11"/>
         </w:numPr>
         <w:jc w:val="both"/>
         <w:outlineLvl w:val="2"/>
       </w:pPr>
-      <w:bookmarkStart w:id="7" w:name="_Toc209097678"/>
+      <w:bookmarkStart w:id="9" w:name="_Toc209184891"/>
       <w:r>
         <w:t>Mapping Mode panel</w:t>
       </w:r>
-      <w:bookmarkEnd w:id="7"/>
+      <w:bookmarkEnd w:id="9"/>
     </w:p>
     <w:p>
       <w:pPr>
@@ -2614,19 +3092,19 @@
         <w:pStyle w:val="ListParagraph"/>
         <w:numPr>
           <w:ilvl w:val="0"/>
-          <w:numId w:val="3"/>
+          <w:numId w:val="11"/>
         </w:numPr>
         <w:jc w:val="both"/>
         <w:outlineLvl w:val="2"/>
       </w:pPr>
-      <w:bookmarkStart w:id="8" w:name="_Toc209097679"/>
+      <w:bookmarkStart w:id="10" w:name="_Toc209184892"/>
       <w:r>
         <w:t>Properties</w:t>
       </w:r>
       <w:r>
         <w:t xml:space="preserve"> panel</w:t>
       </w:r>
-      <w:bookmarkEnd w:id="8"/>
+      <w:bookmarkEnd w:id="10"/>
     </w:p>
     <w:p>
       <w:pPr>
@@ -2774,12 +3252,12 @@
         <w:pStyle w:val="ListParagraph"/>
         <w:numPr>
           <w:ilvl w:val="0"/>
-          <w:numId w:val="3"/>
+          <w:numId w:val="11"/>
         </w:numPr>
         <w:jc w:val="both"/>
         <w:outlineLvl w:val="2"/>
       </w:pPr>
-      <w:bookmarkStart w:id="9" w:name="_Toc209097680"/>
+      <w:bookmarkStart w:id="11" w:name="_Toc209184893"/>
       <w:r>
         <w:t>Robot</w:t>
       </w:r>
@@ -2789,7 +3267,7 @@
       <w:r>
         <w:t>panel</w:t>
       </w:r>
-      <w:bookmarkEnd w:id="9"/>
+      <w:bookmarkEnd w:id="11"/>
       <w:r>
         <w:t xml:space="preserve"> </w:t>
       </w:r>
@@ -2845,17 +3323,17 @@
         <w:pStyle w:val="ListParagraph"/>
         <w:numPr>
           <w:ilvl w:val="0"/>
-          <w:numId w:val="3"/>
+          <w:numId w:val="11"/>
         </w:numPr>
         <w:jc w:val="both"/>
         <w:outlineLvl w:val="2"/>
       </w:pPr>
-      <w:bookmarkStart w:id="10" w:name="_Toc209097681"/>
+      <w:bookmarkStart w:id="12" w:name="_Toc209184894"/>
       <w:r>
         <w:lastRenderedPageBreak/>
         <w:t>Sensor panel</w:t>
       </w:r>
-      <w:bookmarkEnd w:id="10"/>
+      <w:bookmarkEnd w:id="12"/>
     </w:p>
     <w:p>
       <w:pPr>
@@ -2871,16 +3349,16 @@
         <w:pStyle w:val="ListParagraph"/>
         <w:numPr>
           <w:ilvl w:val="0"/>
-          <w:numId w:val="3"/>
+          <w:numId w:val="11"/>
         </w:numPr>
         <w:jc w:val="both"/>
         <w:outlineLvl w:val="2"/>
       </w:pPr>
-      <w:bookmarkStart w:id="11" w:name="_Toc209097682"/>
+      <w:bookmarkStart w:id="13" w:name="_Toc209184895"/>
       <w:r>
         <w:t>Source panel</w:t>
       </w:r>
-      <w:bookmarkEnd w:id="11"/>
+      <w:bookmarkEnd w:id="13"/>
       <w:r>
         <w:t xml:space="preserve"> </w:t>
       </w:r>
@@ -3160,19 +3638,19 @@
         <w:pStyle w:val="ListParagraph"/>
         <w:numPr>
           <w:ilvl w:val="0"/>
-          <w:numId w:val="3"/>
+          <w:numId w:val="11"/>
         </w:numPr>
         <w:jc w:val="both"/>
         <w:outlineLvl w:val="2"/>
       </w:pPr>
-      <w:bookmarkStart w:id="12" w:name="_Toc209097683"/>
+      <w:bookmarkStart w:id="14" w:name="_Toc209184896"/>
       <w:r>
         <w:t>Mass Spectrometer</w:t>
       </w:r>
       <w:r>
         <w:t xml:space="preserve"> panel</w:t>
       </w:r>
-      <w:bookmarkEnd w:id="12"/>
+      <w:bookmarkEnd w:id="14"/>
     </w:p>
     <w:p>
       <w:pPr>
@@ -3220,7 +3698,7 @@
         <w:pStyle w:val="ListParagraph"/>
         <w:numPr>
           <w:ilvl w:val="0"/>
-          <w:numId w:val="3"/>
+          <w:numId w:val="11"/>
         </w:numPr>
         <w:jc w:val="both"/>
       </w:pPr>
@@ -3406,11 +3884,11 @@
         <w:jc w:val="both"/>
         <w:outlineLvl w:val="1"/>
       </w:pPr>
-      <w:bookmarkStart w:id="13" w:name="_Toc209097684"/>
+      <w:bookmarkStart w:id="15" w:name="_Toc209184897"/>
       <w:r>
         <w:t>Data Processing</w:t>
       </w:r>
-      <w:bookmarkEnd w:id="13"/>
+      <w:bookmarkEnd w:id="15"/>
       <w:r>
         <w:t xml:space="preserve"> </w:t>
       </w:r>
@@ -3511,70 +3989,88 @@
           <w:bCs/>
         </w:rPr>
         <w:t>Both a Map and Mat file must be loaded into STORM-MSI to fully use the processing interface.</w:t>
-      </w:r>
-    </w:p>
-    <w:p>
-      <w:pPr>
-        <w:pStyle w:val="Heading3"/>
-        <w:ind w:left="720" w:firstLine="720"/>
-      </w:pPr>
-      <w:bookmarkStart w:id="14" w:name="_Toc209097685"/>
-      <w:r>
-        <w:t>Project Structure</w:t>
-      </w:r>
-      <w:bookmarkEnd w:id="14"/>
-    </w:p>
-    <w:p>
-      <w:pPr>
-        <w:ind w:firstLine="720"/>
-      </w:pPr>
-      <w:r>
-        <w:t xml:space="preserve">Once an acquisition is performed, the map file is stored in a project folder named after itself. Projects can be found in the </w:t>
-      </w:r>
-      <w:r>
-        <w:rPr>
-          <w:b/>
-          <w:bCs/>
-        </w:rPr>
-        <w:t>./</w:t>
-      </w:r>
-      <w:r>
-        <w:rPr>
-          <w:b/>
-          <w:bCs/>
-        </w:rPr>
-        <w:t>files</w:t>
-      </w:r>
-      <w:r>
-        <w:rPr>
-          <w:b/>
-          <w:bCs/>
-        </w:rPr>
-        <w:t>/</w:t>
-      </w:r>
-      <w:r>
-        <w:t xml:space="preserve"> </w:t>
-      </w:r>
-      <w:r>
-        <w:t>folder, and contain subfolders</w:t>
       </w:r>
     </w:p>
     <w:p>
       <w:pPr>
         <w:pStyle w:val="Heading3"/>
         <w:numPr>
-          <w:ilvl w:val="2"/>
-          <w:numId w:val="1"/>
+          <w:ilvl w:val="0"/>
+          <w:numId w:val="10"/>
         </w:numPr>
       </w:pPr>
-      <w:bookmarkStart w:id="15" w:name="_Toc209097686"/>
       <w:r>
         <w:t xml:space="preserve"> </w:t>
       </w:r>
+      <w:bookmarkStart w:id="16" w:name="_Toc209184898"/>
+      <w:r>
+        <w:t>Project Structure</w:t>
+      </w:r>
+      <w:bookmarkEnd w:id="16"/>
+    </w:p>
+    <w:p>
+      <w:pPr>
+        <w:ind w:firstLine="720"/>
+      </w:pPr>
+      <w:r>
+        <w:t xml:space="preserve">Once an acquisition is performed, the map file is stored in a project folder named after itself. Projects can be found in </w:t>
+      </w:r>
+      <w:proofErr w:type="gramStart"/>
+      <w:r>
+        <w:t xml:space="preserve">the </w:t>
+      </w:r>
+      <w:r>
+        <w:rPr>
+          <w:b/>
+          <w:bCs/>
+        </w:rPr>
+        <w:t>.</w:t>
+      </w:r>
+      <w:proofErr w:type="gramEnd"/>
+      <w:r>
+        <w:rPr>
+          <w:b/>
+          <w:bCs/>
+        </w:rPr>
+        <w:t>/</w:t>
+      </w:r>
+      <w:r>
+        <w:rPr>
+          <w:b/>
+          <w:bCs/>
+        </w:rPr>
+        <w:t>files</w:t>
+      </w:r>
+      <w:r>
+        <w:rPr>
+          <w:b/>
+          <w:bCs/>
+        </w:rPr>
+        <w:t>/</w:t>
+      </w:r>
+      <w:r>
+        <w:t xml:space="preserve"> </w:t>
+      </w:r>
+      <w:r>
+        <w:t>folder, and contain subfolders</w:t>
+      </w:r>
+    </w:p>
+    <w:p>
+      <w:pPr>
+        <w:pStyle w:val="Heading3"/>
+        <w:numPr>
+          <w:ilvl w:val="0"/>
+          <w:numId w:val="10"/>
+        </w:numPr>
+      </w:pPr>
+      <w:r>
+        <w:t xml:space="preserve"> </w:t>
+      </w:r>
+      <w:bookmarkStart w:id="17" w:name="_Toc209184899"/>
       <w:r>
         <w:t>Generating a Mat file</w:t>
       </w:r>
-      <w:bookmarkEnd w:id="15"/>
+      <w:bookmarkEnd w:id="17"/>
     </w:p>
     <w:p>
       <w:pPr>
@@ -3959,7 +4455,7 @@
                           </pic:cNvPicPr>
                         </pic:nvPicPr>
                         <pic:blipFill>
-                          <a:blip r:embed="rId8" cstate="print">
+                          <a:blip r:embed="rId10" cstate="print">
                             <a:extLst>
                               <a:ext uri="{28A0092B-C50C-407E-A947-70E740481C1C}">
                                 <a14:useLocalDpi xmlns:a14="http://schemas.microsoft.com/office/drawing/2010/main" val="0"/>
@@ -4065,7 +4561,7 @@
                   <o:lock v:ext="edit" aspectratio="t"/>
                 </v:shapetype>
                 <v:shape id="Picture 5" o:spid="_x0000_s1030" type="#_x0000_t75" style="position:absolute;width:29546;height:34461;visibility:visible;mso-wrap-style:square" o:gfxdata="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">
-                  <v:imagedata r:id="rId9" o:title=""/>
+                  <v:imagedata r:id="rId11" o:title=""/>
                 </v:shape>
                 <v:shape id="Text Box 1" o:spid="_x0000_s1031" type="#_x0000_t202" style="position:absolute;left:2227;top:34465;width:27318;height:4058;visibility:visible;mso-wrap-style:square;v-text-anchor:top" o:gfxdata="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" stroked="f">
                   <v:textbox style="mso-fit-shape-to-text:t" inset="0,0,0,0">
@@ -4223,12 +4719,21 @@
       <w:r>
         <w:t xml:space="preserve">If the scan selection is of suitable quality, the last step is pushing the </w:t>
       </w:r>
-      <w:r>
-        <w:rPr>
-          <w:b/>
-          <w:bCs/>
-        </w:rPr>
-        <w:t xml:space="preserve">Generate .mat File </w:t>
+      <w:proofErr w:type="gramStart"/>
+      <w:r>
+        <w:rPr>
+          <w:b/>
+          <w:bCs/>
+        </w:rPr>
+        <w:t>Generate .mat</w:t>
+      </w:r>
+      <w:proofErr w:type="gramEnd"/>
+      <w:r>
+        <w:rPr>
+          <w:b/>
+          <w:bCs/>
+        </w:rPr>
+        <w:t xml:space="preserve"> File </w:t>
       </w:r>
       <w:r>
         <w:t>button after specifying the size of the binning window.</w:t>
@@ -4247,14 +4752,17 @@
       <w:pPr>
         <w:pStyle w:val="ListParagraph"/>
         <w:numPr>
-          <w:ilvl w:val="2"/>
-          <w:numId w:val="1"/>
+          <w:ilvl w:val="0"/>
+          <w:numId w:val="10"/>
         </w:numPr>
         <w:jc w:val="both"/>
-      </w:pPr>
+        <w:outlineLvl w:val="2"/>
+      </w:pPr>
+      <w:bookmarkStart w:id="18" w:name="_Toc209184900"/>
       <w:r>
         <w:t>Processing Panel</w:t>
       </w:r>
+      <w:bookmarkEnd w:id="18"/>
     </w:p>
     <w:p>
       <w:pPr>
@@ -4481,14 +4989,17 @@
       <w:pPr>
         <w:pStyle w:val="ListParagraph"/>
         <w:numPr>
-          <w:ilvl w:val="2"/>
-          <w:numId w:val="1"/>
+          <w:ilvl w:val="0"/>
+          <w:numId w:val="10"/>
         </w:numPr>
         <w:jc w:val="both"/>
-      </w:pPr>
+        <w:outlineLvl w:val="2"/>
+      </w:pPr>
+      <w:bookmarkStart w:id="19" w:name="_Toc209184901"/>
       <w:r>
         <w:t>Post-Processing Panel</w:t>
       </w:r>
+      <w:bookmarkEnd w:id="19"/>
     </w:p>
     <w:p>
       <w:pPr>
@@ -4713,35 +5224,47 @@
       <w:pPr>
         <w:pStyle w:val="ListParagraph"/>
         <w:numPr>
-          <w:ilvl w:val="2"/>
-          <w:numId w:val="1"/>
+          <w:ilvl w:val="0"/>
+          <w:numId w:val="10"/>
         </w:numPr>
         <w:jc w:val="both"/>
-      </w:pPr>
+        <w:outlineLvl w:val="2"/>
+      </w:pPr>
+      <w:bookmarkStart w:id="20" w:name="_Toc209184902"/>
       <w:r>
         <w:t>Display From External Data Panel</w:t>
       </w:r>
-    </w:p>
-    <w:p>
-      <w:pPr>
-        <w:jc w:val="both"/>
-      </w:pPr>
-      <w:r>
-        <w:t xml:space="preserve">TODO: Check what format is expected for the data </w:t>
+      <w:bookmarkEnd w:id="20"/>
+    </w:p>
+    <w:p>
+      <w:pPr>
+        <w:jc w:val="both"/>
+      </w:pPr>
+      <w:r>
+        <w:rPr>
+          <w:highlight w:val="yellow"/>
+        </w:rPr>
+        <w:t>TODO: Check what format is expected for the data</w:t>
+      </w:r>
+      <w:r>
+        <w:t xml:space="preserve"> </w:t>
       </w:r>
     </w:p>
     <w:p>
       <w:pPr>
         <w:pStyle w:val="ListParagraph"/>
         <w:numPr>
-          <w:ilvl w:val="2"/>
-          <w:numId w:val="1"/>
+          <w:ilvl w:val="0"/>
+          <w:numId w:val="10"/>
         </w:numPr>
         <w:jc w:val="both"/>
-      </w:pPr>
+        <w:outlineLvl w:val="2"/>
+      </w:pPr>
+      <w:bookmarkStart w:id="21" w:name="_Toc209184903"/>
       <w:r>
         <w:t>Data Extraction Panel</w:t>
       </w:r>
+      <w:bookmarkEnd w:id="21"/>
       <w:r>
         <w:t xml:space="preserve"> </w:t>
       </w:r>
@@ -4756,11 +5279,323 @@
       </w:r>
       <w:proofErr w:type="spellStart"/>
       <w:r>
+        <w:t>m</w:t>
+      </w:r>
+      <w:r>
+        <w:t>z</w:t>
+      </w:r>
+      <w:r>
+        <w:t>ML</w:t>
+      </w:r>
+      <w:proofErr w:type="spellEnd"/>
+      <w:r>
+        <w:t xml:space="preserve"> </w:t>
+      </w:r>
+      <w:r>
+        <w:t xml:space="preserve">() </w:t>
+      </w:r>
+      <w:r>
+        <w:t xml:space="preserve">and CSV, as well as several tools to process CSV files. </w:t>
+      </w:r>
+      <w:r>
+        <w:t xml:space="preserve">This subsection will dive into those capabilities. </w:t>
+      </w:r>
+    </w:p>
+    <w:p>
+      <w:pPr>
+        <w:ind w:firstLine="360"/>
+        <w:jc w:val="both"/>
+      </w:pPr>
+      <w:r>
+        <w:rPr>
+          <w:i/>
+          <w:iCs/>
+        </w:rPr>
+        <w:t xml:space="preserve">Export to </w:t>
+      </w:r>
+      <w:proofErr w:type="spellStart"/>
+      <w:r>
+        <w:rPr>
+          <w:i/>
+          <w:iCs/>
+        </w:rPr>
+        <w:t>m</w:t>
+      </w:r>
+      <w:r>
+        <w:rPr>
+          <w:i/>
+          <w:iCs/>
+        </w:rPr>
+        <w:t>z</w:t>
+      </w:r>
+      <w:r>
+        <w:rPr>
+          <w:i/>
+          <w:iCs/>
+        </w:rPr>
+        <w:t>ML</w:t>
+      </w:r>
+      <w:proofErr w:type="spellEnd"/>
+      <w:r>
+        <w:rPr>
+          <w:i/>
+          <w:iCs/>
+        </w:rPr>
+        <w:t xml:space="preserve"> - </w:t>
+      </w:r>
+      <w:r>
+        <w:t xml:space="preserve">Automatically extracts scans selected for the Mat file by calling </w:t>
+      </w:r>
+      <w:hyperlink r:id="rId12" w:history="1">
+        <w:proofErr w:type="spellStart"/>
+        <w:r>
+          <w:rPr>
+            <w:rStyle w:val="Hyperlink"/>
+          </w:rPr>
+          <w:t>ProteoWizard</w:t>
+        </w:r>
+        <w:proofErr w:type="spellEnd"/>
+      </w:hyperlink>
+      <w:r>
+        <w:t>, which must be installed on the system beforehand.</w:t>
+      </w:r>
+      <w:r>
+        <w:t xml:space="preserve"> Currently only supports Waters RAW files, but</w:t>
+      </w:r>
+      <w:r>
+        <w:t xml:space="preserve"> other file formats are already supported within the framework of </w:t>
+      </w:r>
+      <w:proofErr w:type="spellStart"/>
+      <w:r>
+        <w:t>ProteoWizard</w:t>
+      </w:r>
+      <w:proofErr w:type="spellEnd"/>
+      <w:r>
+        <w:t xml:space="preserve"> and could thus easily be added to the STORM-MSI in the future. </w:t>
+      </w:r>
+      <w:r>
+        <w:t xml:space="preserve"> </w:t>
+      </w:r>
+      <w:r>
+        <w:t xml:space="preserve">Note that we recommend using the </w:t>
+      </w:r>
+      <w:proofErr w:type="spellStart"/>
+      <w:r>
+        <w:t>mzML</w:t>
+      </w:r>
+      <w:proofErr w:type="spellEnd"/>
+      <w:r>
+        <w:t xml:space="preserve"> format to generate an </w:t>
+      </w:r>
+      <w:proofErr w:type="spellStart"/>
+      <w:r>
         <w:t>imZML</w:t>
       </w:r>
       <w:proofErr w:type="spellEnd"/>
       <w:r>
-        <w:t xml:space="preserve"> and CSV, as well as several tools to process CSV files. </w:t>
+        <w:t xml:space="preserve"> file through </w:t>
+      </w:r>
+      <w:hyperlink r:id="rId13" w:history="1">
+        <w:r>
+          <w:rPr>
+            <w:rStyle w:val="Hyperlink"/>
+          </w:rPr>
+          <w:t xml:space="preserve">Alan Race’s </w:t>
+        </w:r>
+        <w:proofErr w:type="spellStart"/>
+        <w:r>
+          <w:rPr>
+            <w:rStyle w:val="Hyperlink"/>
+          </w:rPr>
+          <w:t>imZML</w:t>
+        </w:r>
+        <w:proofErr w:type="spellEnd"/>
+        <w:r>
+          <w:rPr>
+            <w:rStyle w:val="Hyperlink"/>
+          </w:rPr>
+          <w:t xml:space="preserve"> Converter</w:t>
+        </w:r>
+      </w:hyperlink>
+      <w:r>
+        <w:t>.</w:t>
+      </w:r>
+    </w:p>
+    <w:p>
+      <w:pPr>
+        <w:pStyle w:val="ListParagraph"/>
+        <w:numPr>
+          <w:ilvl w:val="0"/>
+          <w:numId w:val="2"/>
+        </w:numPr>
+        <w:jc w:val="both"/>
+      </w:pPr>
+      <w:r>
+        <w:rPr>
+          <w:b/>
+          <w:bCs/>
+        </w:rPr>
+        <w:t>Input Waters RAW file:</w:t>
+      </w:r>
+      <w:r>
+        <w:t xml:space="preserve"> </w:t>
+      </w:r>
+      <w:r>
+        <w:t>N</w:t>
+      </w:r>
+      <w:r>
+        <w:t xml:space="preserve">ame of the RAW file of interest, which must be stored </w:t>
+      </w:r>
+      <w:proofErr w:type="gramStart"/>
+      <w:r>
+        <w:t xml:space="preserve">in </w:t>
+      </w:r>
+      <w:r>
+        <w:rPr>
+          <w:i/>
+          <w:iCs/>
+        </w:rPr>
+        <w:t>.</w:t>
+      </w:r>
+      <w:proofErr w:type="gramEnd"/>
+      <w:r>
+        <w:rPr>
+          <w:i/>
+          <w:iCs/>
+        </w:rPr>
+        <w:t>/files/*</w:t>
+      </w:r>
+      <w:proofErr w:type="spellStart"/>
+      <w:r>
+        <w:rPr>
+          <w:i/>
+          <w:iCs/>
+        </w:rPr>
+        <w:t>Project_Name</w:t>
+      </w:r>
+      <w:proofErr w:type="spellEnd"/>
+      <w:r>
+        <w:rPr>
+          <w:i/>
+          <w:iCs/>
+        </w:rPr>
+        <w:t>*/</w:t>
+      </w:r>
+      <w:proofErr w:type="spellStart"/>
+      <w:r>
+        <w:rPr>
+          <w:i/>
+          <w:iCs/>
+        </w:rPr>
+        <w:t>raw_files</w:t>
+      </w:r>
+      <w:proofErr w:type="spellEnd"/>
+      <w:r>
+        <w:rPr>
+          <w:i/>
+          <w:iCs/>
+        </w:rPr>
+        <w:t>/</w:t>
+      </w:r>
+    </w:p>
+    <w:p>
+      <w:pPr>
+        <w:pStyle w:val="ListParagraph"/>
+        <w:numPr>
+          <w:ilvl w:val="0"/>
+          <w:numId w:val="2"/>
+        </w:numPr>
+        <w:jc w:val="both"/>
+      </w:pPr>
+      <w:r>
+        <w:rPr>
+          <w:b/>
+          <w:bCs/>
+        </w:rPr>
+        <w:t>Neighbour Fusion</w:t>
+      </w:r>
+      <w:r>
+        <w:rPr>
+          <w:b/>
+          <w:bCs/>
+        </w:rPr>
+        <w:t xml:space="preserve">: </w:t>
+      </w:r>
+      <w:r>
+        <w:t xml:space="preserve">If turned off, all pixels are exported to a single </w:t>
+      </w:r>
+      <w:proofErr w:type="spellStart"/>
+      <w:r>
+        <w:t>mzML</w:t>
+      </w:r>
+      <w:proofErr w:type="spellEnd"/>
+      <w:r>
+        <w:t xml:space="preserve"> file</w:t>
+      </w:r>
+      <w:r>
+        <w:t xml:space="preserve">. This can cause shifting </w:t>
+      </w:r>
+      <w:r>
+        <w:t xml:space="preserve">in the eventual </w:t>
+      </w:r>
+      <w:proofErr w:type="spellStart"/>
+      <w:r>
+        <w:t>imZML</w:t>
+      </w:r>
+      <w:proofErr w:type="spellEnd"/>
+      <w:r>
+        <w:t xml:space="preserve"> file </w:t>
+      </w:r>
+      <w:r>
+        <w:t xml:space="preserve">when </w:t>
+      </w:r>
+      <w:r>
+        <w:t>a</w:t>
+      </w:r>
+      <w:r>
+        <w:t xml:space="preserve"> scan </w:t>
+      </w:r>
+      <w:r>
+        <w:t>is assigned to several pixels</w:t>
+      </w:r>
+      <w:r>
+        <w:t xml:space="preserve">. Turning this option on instead outputs one </w:t>
+      </w:r>
+      <w:proofErr w:type="spellStart"/>
+      <w:r>
+        <w:t>mzML</w:t>
+      </w:r>
+      <w:proofErr w:type="spellEnd"/>
+      <w:r>
+        <w:t xml:space="preserve"> file per pixel, circumventing conversion issues. </w:t>
+      </w:r>
+    </w:p>
+    <w:p>
+      <w:pPr>
+        <w:pStyle w:val="ListParagraph"/>
+        <w:numPr>
+          <w:ilvl w:val="0"/>
+          <w:numId w:val="2"/>
+        </w:numPr>
+        <w:jc w:val="both"/>
+      </w:pPr>
+      <w:r>
+        <w:rPr>
+          <w:b/>
+          <w:bCs/>
+        </w:rPr>
+        <w:t xml:space="preserve">Launch Extraction: </w:t>
+      </w:r>
+      <w:r>
+        <w:t xml:space="preserve">Starts the export to the </w:t>
+      </w:r>
+      <w:proofErr w:type="spellStart"/>
+      <w:r>
+        <w:t>mzML</w:t>
+      </w:r>
+      <w:proofErr w:type="spellEnd"/>
+      <w:r>
+        <w:t xml:space="preserve"> format </w:t>
       </w:r>
     </w:p>
     <w:p>
@@ -4768,6 +5603,19 @@
         <w:ind w:firstLine="360"/>
         <w:jc w:val="both"/>
       </w:pPr>
+      <w:r>
+        <w:rPr>
+          <w:i/>
+          <w:iCs/>
+        </w:rPr>
+        <w:t>Export to CSV (Spectrum) –</w:t>
+      </w:r>
+      <w:r>
+        <w:t xml:space="preserve"> Similar </w:t>
+      </w:r>
+      <w:r>
+        <w:t>set of functions to the those mentioned in the processing panel, that record the spectrum created in a CSV file.</w:t>
+      </w:r>
     </w:p>
     <w:p>
       <w:pPr>
@@ -4775,14 +5623,498 @@
         <w:jc w:val="both"/>
       </w:pPr>
       <w:r>
+        <w:rPr>
+          <w:i/>
+          <w:iCs/>
+        </w:rPr>
+        <w:t>Export to CSV (Full Experiment) –</w:t>
+      </w:r>
+      <w:r>
+        <w:t xml:space="preserve"> Exports the whole dataset in a CSV file for reading or analysis.</w:t>
+      </w:r>
+      <w:r>
+        <w:t xml:space="preserve"> </w:t>
+      </w:r>
+      <w:r>
+        <w:t>Some of t</w:t>
+      </w:r>
+      <w:r>
+        <w:t xml:space="preserve">hose functions </w:t>
+      </w:r>
+      <w:r>
+        <w:t xml:space="preserve">(namely, normalization-related buttons) </w:t>
+      </w:r>
+      <w:r>
+        <w:t xml:space="preserve">require Python to be </w:t>
+      </w:r>
+      <w:r>
+        <w:t xml:space="preserve">properly detected by the </w:t>
+      </w:r>
+      <w:proofErr w:type="spellStart"/>
+      <w:r>
+        <w:t>MatLab</w:t>
+      </w:r>
+      <w:proofErr w:type="spellEnd"/>
+      <w:r>
+        <w:t xml:space="preserve"> Runtime.</w:t>
+      </w:r>
+    </w:p>
+    <w:p>
+      <w:pPr>
+        <w:pStyle w:val="ListParagraph"/>
+        <w:numPr>
+          <w:ilvl w:val="0"/>
+          <w:numId w:val="2"/>
+        </w:numPr>
+        <w:jc w:val="both"/>
+      </w:pPr>
+      <w:r>
+        <w:rPr>
+          <w:b/>
+          <w:bCs/>
+        </w:rPr>
+        <w:t>Export to CSV:</w:t>
+      </w:r>
+      <w:r>
+        <w:t xml:space="preserve"> Exports all relevant data, as specified by the </w:t>
+      </w:r>
+      <w:r>
+        <w:rPr>
+          <w:b/>
+          <w:bCs/>
+        </w:rPr>
+        <w:t>minimum and maximum m/Z text fields</w:t>
+      </w:r>
+      <w:r>
+        <w:t xml:space="preserve">, </w:t>
+      </w:r>
+      <w:r>
+        <w:t xml:space="preserve">at the binning specified in the corresponding text field, </w:t>
+      </w:r>
+      <w:r>
+        <w:t xml:space="preserve">as a CSV table. </w:t>
+      </w:r>
+    </w:p>
+    <w:p>
+      <w:pPr>
+        <w:pStyle w:val="ListParagraph"/>
+        <w:numPr>
+          <w:ilvl w:val="0"/>
+          <w:numId w:val="2"/>
+        </w:numPr>
+        <w:jc w:val="both"/>
+      </w:pPr>
+      <w:r>
+        <w:rPr>
+          <w:b/>
+          <w:bCs/>
+        </w:rPr>
+        <w:lastRenderedPageBreak/>
+        <w:t xml:space="preserve">Normalize CSV: </w:t>
+      </w:r>
+      <w:r>
+        <w:t xml:space="preserve">The CSV file exported through the aforementioned button is not normalized. This button thus performs the normalization selected through the above drop-down menu while retaining a copy of the original file. </w:t>
+      </w:r>
+    </w:p>
+    <w:p>
+      <w:pPr>
+        <w:ind w:firstLine="360"/>
+        <w:jc w:val="both"/>
+        <w:rPr>
+          <w:b/>
+          <w:bCs/>
+        </w:rPr>
+      </w:pPr>
+      <w:r>
+        <w:rPr>
+          <w:i/>
+          <w:iCs/>
+        </w:rPr>
+        <w:t>Export to 3D file (PLY)</w:t>
+      </w:r>
+      <w:r>
+        <w:rPr>
+          <w:i/>
+          <w:iCs/>
+        </w:rPr>
+        <w:t xml:space="preserve"> from CSV</w:t>
+      </w:r>
+      <w:r>
+        <w:rPr>
+          <w:i/>
+          <w:iCs/>
+        </w:rPr>
+        <w:t xml:space="preserve"> –</w:t>
+      </w:r>
+      <w:r>
+        <w:rPr>
+          <w:b/>
+          <w:bCs/>
+        </w:rPr>
+        <w:t xml:space="preserve"> </w:t>
+      </w:r>
+      <w:r>
+        <w:t xml:space="preserve">Those last buttons call </w:t>
+      </w:r>
+      <w:r>
+        <w:t xml:space="preserve">Python interfaces to create PLY files that store 2D or 3D MSI data extracted from the CSV file. Those files, which are in essence standard 3D objects, can then be used with a variety of </w:t>
+      </w:r>
+      <w:r>
+        <w:t xml:space="preserve">tools, such as </w:t>
+      </w:r>
+      <w:hyperlink r:id="rId14" w:history="1">
+        <w:r>
+          <w:rPr>
+            <w:rStyle w:val="Hyperlink"/>
+          </w:rPr>
+          <w:t>Unity</w:t>
+        </w:r>
+      </w:hyperlink>
+      <w:r>
+        <w:t xml:space="preserve">, </w:t>
+      </w:r>
+      <w:hyperlink r:id="rId15" w:history="1">
+        <w:r>
+          <w:rPr>
+            <w:rStyle w:val="Hyperlink"/>
+          </w:rPr>
+          <w:t>Blender</w:t>
+        </w:r>
+      </w:hyperlink>
+      <w:r>
+        <w:t xml:space="preserve"> or </w:t>
+      </w:r>
+      <w:hyperlink r:id="rId16" w:history="1">
+        <w:r>
+          <w:rPr>
+            <w:rStyle w:val="Hyperlink"/>
+          </w:rPr>
+          <w:t>MeshLab</w:t>
+        </w:r>
+      </w:hyperlink>
+      <w:r>
+        <w:t xml:space="preserve"> for rendering. </w:t>
+      </w:r>
+      <w:r>
+        <w:rPr>
+          <w:b/>
+          <w:bCs/>
+        </w:rPr>
         <w:tab/>
       </w:r>
+    </w:p>
+    <w:p>
+      <w:pPr>
+        <w:pStyle w:val="ListParagraph"/>
+        <w:numPr>
+          <w:ilvl w:val="0"/>
+          <w:numId w:val="2"/>
+        </w:numPr>
+        <w:jc w:val="both"/>
+      </w:pPr>
+      <w:r>
+        <w:rPr>
+          <w:b/>
+          <w:bCs/>
+        </w:rPr>
+        <w:t>Export from CSV:</w:t>
+      </w:r>
+      <w:r>
+        <w:t xml:space="preserve"> Allows t</w:t>
+      </w:r>
+      <w:r>
+        <w:t>he user to load a file, select the data of interest within it, interpolate it and finally export it as a PLY file.</w:t>
+      </w:r>
+    </w:p>
+    <w:p>
+      <w:pPr>
+        <w:pStyle w:val="ListParagraph"/>
+        <w:numPr>
+          <w:ilvl w:val="1"/>
+          <w:numId w:val="2"/>
+        </w:numPr>
+        <w:jc w:val="both"/>
+      </w:pPr>
+      <w:r>
+        <w:rPr>
+          <w:b/>
+          <w:bCs/>
+        </w:rPr>
+        <w:t xml:space="preserve">Load a CSV: </w:t>
+      </w:r>
+      <w:r>
+        <w:t>Opens a menu to select the CSV file of interest</w:t>
+      </w:r>
+    </w:p>
+    <w:p>
+      <w:pPr>
+        <w:pStyle w:val="ListParagraph"/>
+        <w:numPr>
+          <w:ilvl w:val="1"/>
+          <w:numId w:val="2"/>
+        </w:numPr>
+        <w:jc w:val="both"/>
+      </w:pPr>
+      <w:r>
+        <w:rPr>
+          <w:b/>
+          <w:bCs/>
+        </w:rPr>
+        <w:t xml:space="preserve">Data: </w:t>
+      </w:r>
+      <w:r>
+        <w:t>Drop-down menu that lists every data type available in the file</w:t>
+      </w:r>
+    </w:p>
+    <w:p>
+      <w:pPr>
+        <w:pStyle w:val="ListParagraph"/>
+        <w:numPr>
+          <w:ilvl w:val="1"/>
+          <w:numId w:val="2"/>
+        </w:numPr>
+        <w:jc w:val="both"/>
+      </w:pPr>
+      <w:r>
+        <w:rPr>
+          <w:b/>
+          <w:bCs/>
+        </w:rPr>
+        <w:t>m/Z +/-</w:t>
+      </w:r>
+      <w:r>
+        <w:t>: Mass tolerance, sums</w:t>
+      </w:r>
+      <w:r>
+        <w:t xml:space="preserve"> columns that are within the tolerance window</w:t>
+      </w:r>
+    </w:p>
+    <w:p>
+      <w:pPr>
+        <w:pStyle w:val="ListParagraph"/>
+        <w:numPr>
+          <w:ilvl w:val="1"/>
+          <w:numId w:val="2"/>
+        </w:numPr>
+        <w:jc w:val="both"/>
+      </w:pPr>
+      <w:r>
+        <w:rPr>
+          <w:b/>
+          <w:bCs/>
+        </w:rPr>
+        <w:t xml:space="preserve">Colour Gradient: </w:t>
+      </w:r>
+      <w:r>
+        <w:t>Data is displayed as colour on the files. This drop-down menu allows the choice between several colour scales</w:t>
+      </w:r>
+    </w:p>
+    <w:p>
+      <w:pPr>
+        <w:pStyle w:val="ListParagraph"/>
+        <w:numPr>
+          <w:ilvl w:val="1"/>
+          <w:numId w:val="2"/>
+        </w:numPr>
+        <w:jc w:val="both"/>
+      </w:pPr>
+      <w:r>
+        <w:rPr>
+          <w:b/>
+          <w:bCs/>
+        </w:rPr>
+        <w:t>Min. and Max. Percentile Clip:</w:t>
+      </w:r>
+      <w:r>
+        <w:t xml:space="preserve"> Intensities between respectively under and over those relative intensity thresholds will be clipped to make differences in the mid-range more easily visible.</w:t>
+      </w:r>
+    </w:p>
+    <w:p>
+      <w:pPr>
+        <w:pStyle w:val="ListParagraph"/>
+        <w:numPr>
+          <w:ilvl w:val="1"/>
+          <w:numId w:val="2"/>
+        </w:numPr>
+        <w:jc w:val="both"/>
+      </w:pPr>
+      <w:r>
+        <w:rPr>
+          <w:b/>
+          <w:bCs/>
+        </w:rPr>
+        <w:t xml:space="preserve">Interpolation: </w:t>
+      </w:r>
+      <w:r>
+        <w:t>The drop-down menu determines the type of interpolation that will be used, while the slider determines how many points are added between each pair of point in the file.</w:t>
+      </w:r>
+    </w:p>
+    <w:p>
+      <w:pPr>
+        <w:pStyle w:val="ListParagraph"/>
+        <w:numPr>
+          <w:ilvl w:val="1"/>
+          <w:numId w:val="2"/>
+        </w:numPr>
+        <w:jc w:val="both"/>
+      </w:pPr>
+      <w:r>
+        <w:rPr>
+          <w:b/>
+          <w:bCs/>
+        </w:rPr>
+        <w:t>Image:</w:t>
+      </w:r>
+      <w:r>
+        <w:t xml:space="preserve"> Overrides the colouring computation, replacing it with precomputed values in the form of an image. Useful for data coregistration.</w:t>
+      </w:r>
+    </w:p>
+    <w:p>
+      <w:pPr>
+        <w:pStyle w:val="ListParagraph"/>
+        <w:numPr>
+          <w:ilvl w:val="1"/>
+          <w:numId w:val="2"/>
+        </w:numPr>
+        <w:jc w:val="both"/>
+      </w:pPr>
+      <w:r>
+        <w:rPr>
+          <w:b/>
+          <w:bCs/>
+        </w:rPr>
+        <w:t>Segme</w:t>
+      </w:r>
+      <w:r>
+        <w:rPr>
+          <w:b/>
+          <w:bCs/>
+        </w:rPr>
+        <w:t>n</w:t>
+      </w:r>
+      <w:r>
+        <w:rPr>
+          <w:b/>
+          <w:bCs/>
+        </w:rPr>
+        <w:t xml:space="preserve">tation: </w:t>
+      </w:r>
+      <w:r>
+        <w:t xml:space="preserve">If the checkbox is ticked, only the points’ locations are interpolated. Molecular data is added to those points through </w:t>
+      </w:r>
+      <w:r>
+        <w:t xml:space="preserve">a </w:t>
+      </w:r>
+      <w:r>
+        <w:t>nearest neighbour computation</w:t>
+      </w:r>
+      <w:r>
+        <w:t xml:space="preserve"> irrespective of the selected interpolation mode</w:t>
+      </w:r>
+      <w:r>
+        <w:t>. This is particularly useful for segmentation data, where interpolating classes would make little sense.</w:t>
+      </w:r>
+    </w:p>
+    <w:p>
+      <w:pPr>
+        <w:pStyle w:val="ListParagraph"/>
+        <w:numPr>
+          <w:ilvl w:val="1"/>
+          <w:numId w:val="2"/>
+        </w:numPr>
+        <w:jc w:val="both"/>
+      </w:pPr>
+      <w:r>
+        <w:rPr>
+          <w:b/>
+          <w:bCs/>
+        </w:rPr>
+        <w:t xml:space="preserve">Proceed: </w:t>
+      </w:r>
+      <w:r>
+        <w:t>Starts the conversion process</w:t>
+      </w:r>
+    </w:p>
+    <w:p>
+      <w:pPr>
+        <w:pStyle w:val="ListParagraph"/>
+        <w:numPr>
+          <w:ilvl w:val="0"/>
+          <w:numId w:val="2"/>
+        </w:numPr>
+        <w:jc w:val="both"/>
+      </w:pPr>
+      <w:r>
+        <w:rPr>
+          <w:b/>
+          <w:bCs/>
+        </w:rPr>
+        <w:t xml:space="preserve">Export and Coregister from CSV: </w:t>
+      </w:r>
+      <w:r>
+        <w:t xml:space="preserve">A </w:t>
+      </w:r>
+      <w:r>
+        <w:t>complete workflow</w:t>
+      </w:r>
+      <w:r>
+        <w:t xml:space="preserve"> </w:t>
+      </w:r>
+      <w:r>
+        <w:t>for data co-registration</w:t>
+      </w:r>
+      <w:r>
+        <w:t>, where a picture of the sample is superimposed on the data to ease interpretation.</w:t>
+      </w:r>
+      <w:r>
+        <w:t xml:space="preserve"> This button operates in three steps: a simplified version of the CSV to PLY converter described above is used to export the molecular data as a PNG file. A manual coregistration tool is then opened, in which the user must select both the molecular PNG and the picture of the sample, and set the blending alpha. After selecting four corresponding points in each picture, an image is returned which can be loaded in the CSV to PLY converter to create a </w:t>
+      </w:r>
+      <w:proofErr w:type="spellStart"/>
+      <w:r>
+        <w:t>coregistered</w:t>
+      </w:r>
+      <w:proofErr w:type="spellEnd"/>
+      <w:r>
+        <w:t xml:space="preserve"> PLY file. </w:t>
+      </w:r>
+    </w:p>
+    <w:p>
+      <w:pPr>
+        <w:pStyle w:val="ListParagraph"/>
+        <w:numPr>
+          <w:ilvl w:val="1"/>
+          <w:numId w:val="2"/>
+        </w:numPr>
+        <w:jc w:val="both"/>
+        <w:rPr>
+          <w:i/>
+          <w:iCs/>
+        </w:rPr>
+      </w:pPr>
+      <w:r>
+        <w:rPr>
+          <w:i/>
+          <w:iCs/>
+        </w:rPr>
+        <w:t>Note: An automated co-registration script will eventually be made public</w:t>
+      </w:r>
+    </w:p>
+    <w:p>
+      <w:pPr>
+        <w:ind w:firstLine="360"/>
+        <w:jc w:val="both"/>
+      </w:pPr>
       <w:r>
         <w:tab/>
       </w:r>
       <w:r>
         <w:tab/>
       </w:r>
+      <w:r>
+        <w:tab/>
+      </w:r>
+    </w:p>
+    <w:p>
       <w:r>
         <w:tab/>
       </w:r>
@@ -4795,10 +6127,14 @@
           <w:numId w:val="1"/>
         </w:numPr>
         <w:jc w:val="both"/>
-      </w:pPr>
-      <w:r>
+        <w:outlineLvl w:val="0"/>
+      </w:pPr>
+      <w:bookmarkStart w:id="22" w:name="_Toc209184904"/>
+      <w:r>
+        <w:lastRenderedPageBreak/>
         <w:t>Contributions</w:t>
       </w:r>
+      <w:bookmarkEnd w:id="22"/>
     </w:p>
     <w:p>
       <w:pPr>
@@ -4806,10 +6142,43 @@
         <w:jc w:val="both"/>
       </w:pPr>
       <w:r>
-        <w:t xml:space="preserve">STORM-MSI is distributed as an Open-Source software on GitHub page of the PRISM laboratory. </w:t>
-      </w:r>
-      <w:r>
-        <w:t xml:space="preserve">Contributions of </w:t>
+        <w:t xml:space="preserve">STORM-MSI is distributed as an Open-Source software on </w:t>
+      </w:r>
+      <w:r>
+        <w:t xml:space="preserve">the </w:t>
+      </w:r>
+      <w:r>
+        <w:t>GitHub page of the PRISM laboratory</w:t>
+      </w:r>
+      <w:r>
+        <w:t xml:space="preserve"> </w:t>
+      </w:r>
+      <w:r>
+        <w:rPr>
+          <w:highlight w:val="yellow"/>
+        </w:rPr>
+        <w:t xml:space="preserve">(Add </w:t>
+      </w:r>
+      <w:r>
+        <w:rPr>
+          <w:highlight w:val="yellow"/>
+        </w:rPr>
+        <w:t>hyper</w:t>
+      </w:r>
+      <w:r>
+        <w:rPr>
+          <w:highlight w:val="yellow"/>
+        </w:rPr>
+        <w:t>link here)</w:t>
+      </w:r>
+      <w:r>
+        <w:t xml:space="preserve">. </w:t>
+      </w:r>
+      <w:r>
+        <w:t>General suggestions, c</w:t>
+      </w:r>
+      <w:r>
+        <w:t xml:space="preserve">ontributions of </w:t>
       </w:r>
       <w:r>
         <w:t>additional scripts for enhanced hardware support, as well a</w:t>
@@ -4819,6 +6188,7 @@
       </w:r>
     </w:p>
     <w:sectPr>
+      <w:footerReference w:type="default" r:id="rId17"/>
       <w:pgSz w:w="11906" w:h="16838"/>
       <w:pgMar w:top="1417" w:right="1417" w:bottom="1417" w:left="1417" w:header="708" w:footer="708" w:gutter="0"/>
       <w:cols w:space="708"/>
@@ -4828,9 +6198,202 @@
 </w:document>
 </file>
 
+<file path=word/endnotes.xml><?xml version="1.0" encoding="utf-8"?>
+<w:endnotes xmlns:wpc="http://schemas.microsoft.com/office/word/2010/wordprocessingCanvas" xmlns:cx="http://schemas.microsoft.com/office/drawing/2014/chartex" xmlns:cx1="http://schemas.microsoft.com/office/drawing/2015/9/8/chartex" xmlns:cx2="http://schemas.microsoft.com/office/drawing/2015/10/21/chartex" xmlns:cx3="http://schemas.microsoft.com/office/drawing/2016/5/9/chartex" xmlns:cx4="http://schemas.microsoft.com/office/drawing/2016/5/10/chartex" xmlns:cx5="http://schemas.microsoft.com/office/drawing/2016/5/11/chartex" xmlns:cx6="http://schemas.microsoft.com/office/drawing/2016/5/12/chartex" xmlns:cx7="http://schemas.microsoft.com/office/drawing/2016/5/13/chartex" xmlns:cx8="http://schemas.microsoft.com/office/drawing/2016/5/14/chartex" xmlns:mc="http://schemas.openxmlformats.org/markup-compatibility/2006" xmlns:aink="http://schemas.microsoft.com/office/drawing/2016/ink" xmlns:am3d="http://schemas.microsoft.com/office/drawing/2017/model3d" xmlns:o="urn:schemas-microsoft-com:office:office" xmlns:oel="http://schemas.microsoft.com/office/2019/extlst" xmlns:r="http://schemas.openxmlformats.org/officeDocument/2006/relationships" xmlns:m="http://schemas.openxmlformats.org/officeDocument/2006/math" xmlns:v="urn:schemas-microsoft-com:vml" xmlns:wp14="http://schemas.microsoft.com/office/word/2010/wordprocessingDrawing" xmlns:wp="http://schemas.openxmlformats.org/drawingml/2006/wordprocessingDrawing" xmlns:w10="urn:schemas-microsoft-com:office:word" xmlns:w="http://schemas.openxmlformats.org/wordprocessingml/2006/main" xmlns:w14="http://schemas.microsoft.com/office/word/2010/wordml" xmlns:w15="http://schemas.microsoft.com/office/word/2012/wordml" xmlns:w16cex="http://schemas.microsoft.com/office/word/2018/wordml/cex" xmlns:w16cid="http://schemas.microsoft.com/office/word/2016/wordml/cid" xmlns:w16="http://schemas.microsoft.com/office/word/2018/wordml" xmlns:w16du="http://schemas.microsoft.com/office/word/2023/wordml/word16du" xmlns:w16sdtdh="http://schemas.microsoft.com/office/word/2020/wordml/sdtdatahash" xmlns:w16sdtfl="http://schemas.microsoft.com/office/word/2024/wordml/sdtformatlock" xmlns:w16se="http://schemas.microsoft.com/office/word/2015/wordml/symex" xmlns:wpg="http://schemas.microsoft.com/office/word/2010/wordprocessingGroup" xmlns:wpi="http://schemas.microsoft.com/office/word/2010/wordprocessingInk" xmlns:wne="http://schemas.microsoft.com/office/word/2006/wordml" xmlns:wps="http://schemas.microsoft.com/office/word/2010/wordprocessingShape" mc:Ignorable="w14 w15 w16se w16cid w16 w16cex w16sdtdh w16sdtfl w16du wp14">
+  <w:endnote w:type="separator" w:id="-1">
+    <w:p>
+      <w:pPr>
+        <w:spacing w:after="0" w:line="240" w:lineRule="auto"/>
+      </w:pPr>
+      <w:r>
+        <w:separator/>
+      </w:r>
+    </w:p>
+  </w:endnote>
+  <w:endnote w:type="continuationSeparator" w:id="0">
+    <w:p>
+      <w:pPr>
+        <w:spacing w:after="0" w:line="240" w:lineRule="auto"/>
+      </w:pPr>
+      <w:r>
+        <w:continuationSeparator/>
+      </w:r>
+    </w:p>
+  </w:endnote>
+</w:endnotes>
+</file>
+
+<file path=word/footer1.xml><?xml version="1.0" encoding="utf-8"?>
+<w:ftr xmlns:wpc="http://schemas.microsoft.com/office/word/2010/wordprocessingCanvas" xmlns:cx="http://schemas.microsoft.com/office/drawing/2014/chartex" xmlns:cx1="http://schemas.microsoft.com/office/drawing/2015/9/8/chartex" xmlns:cx2="http://schemas.microsoft.com/office/drawing/2015/10/21/chartex" xmlns:cx3="http://schemas.microsoft.com/office/drawing/2016/5/9/chartex" xmlns:cx4="http://schemas.microsoft.com/office/drawing/2016/5/10/chartex" xmlns:cx5="http://schemas.microsoft.com/office/drawing/2016/5/11/chartex" xmlns:cx6="http://schemas.microsoft.com/office/drawing/2016/5/12/chartex" xmlns:cx7="http://schemas.microsoft.com/office/drawing/2016/5/13/chartex" xmlns:cx8="http://schemas.microsoft.com/office/drawing/2016/5/14/chartex" xmlns:mc="http://schemas.openxmlformats.org/markup-compatibility/2006" xmlns:aink="http://schemas.microsoft.com/office/drawing/2016/ink" xmlns:am3d="http://schemas.microsoft.com/office/drawing/2017/model3d" xmlns:o="urn:schemas-microsoft-com:office:office" xmlns:oel="http://schemas.microsoft.com/office/2019/extlst" xmlns:r="http://schemas.openxmlformats.org/officeDocument/2006/relationships" xmlns:m="http://schemas.openxmlformats.org/officeDocument/2006/math" xmlns:v="urn:schemas-microsoft-com:vml" xmlns:wp14="http://schemas.microsoft.com/office/word/2010/wordprocessingDrawing" xmlns:wp="http://schemas.openxmlformats.org/drawingml/2006/wordprocessingDrawing" xmlns:w10="urn:schemas-microsoft-com:office:word" xmlns:w="http://schemas.openxmlformats.org/wordprocessingml/2006/main" xmlns:w14="http://schemas.microsoft.com/office/word/2010/wordml" xmlns:w15="http://schemas.microsoft.com/office/word/2012/wordml" xmlns:w16cex="http://schemas.microsoft.com/office/word/2018/wordml/cex" xmlns:w16cid="http://schemas.microsoft.com/office/word/2016/wordml/cid" xmlns:w16="http://schemas.microsoft.com/office/word/2018/wordml" xmlns:w16du="http://schemas.microsoft.com/office/word/2023/wordml/word16du" xmlns:w16sdtdh="http://schemas.microsoft.com/office/word/2020/wordml/sdtdatahash" xmlns:w16sdtfl="http://schemas.microsoft.com/office/word/2024/wordml/sdtformatlock" xmlns:w16se="http://schemas.microsoft.com/office/word/2015/wordml/symex" xmlns:wpg="http://schemas.microsoft.com/office/word/2010/wordprocessingGroup" xmlns:wpi="http://schemas.microsoft.com/office/word/2010/wordprocessingInk" xmlns:wne="http://schemas.microsoft.com/office/word/2006/wordml" xmlns:wps="http://schemas.microsoft.com/office/word/2010/wordprocessingShape" mc:Ignorable="w14 w15 w16se w16cid w16 w16cex w16sdtdh w16sdtfl w16du wp14">
+  <w:sdt>
+    <w:sdtPr>
+      <w:id w:val="674616122"/>
+      <w:docPartObj>
+        <w:docPartGallery w:val="Page Numbers (Bottom of Page)"/>
+        <w:docPartUnique/>
+      </w:docPartObj>
+    </w:sdtPr>
+    <w:sdtContent>
+      <w:p>
+        <w:pPr>
+          <w:pStyle w:val="Footer"/>
+          <w:jc w:val="right"/>
+        </w:pPr>
+        <w:r>
+          <w:t xml:space="preserve">Page | </w:t>
+        </w:r>
+        <w:r>
+          <w:fldChar w:fldCharType="begin"/>
+        </w:r>
+        <w:r>
+          <w:instrText xml:space="preserve"> PAGE   \* MERGEFORMAT </w:instrText>
+        </w:r>
+        <w:r>
+          <w:fldChar w:fldCharType="separate"/>
+        </w:r>
+        <w:r>
+          <w:rPr>
+            <w:noProof/>
+          </w:rPr>
+          <w:t>2</w:t>
+        </w:r>
+        <w:r>
+          <w:rPr>
+            <w:noProof/>
+          </w:rPr>
+          <w:fldChar w:fldCharType="end"/>
+        </w:r>
+        <w:r>
+          <w:t xml:space="preserve"> </w:t>
+        </w:r>
+      </w:p>
+    </w:sdtContent>
+  </w:sdt>
+  <w:p>
+    <w:pPr>
+      <w:pStyle w:val="Footer"/>
+    </w:pPr>
+  </w:p>
+</w:ftr>
+</file>
+
+<file path=word/footnotes.xml><?xml version="1.0" encoding="utf-8"?>
+<w:footnotes xmlns:wpc="http://schemas.microsoft.com/office/word/2010/wordprocessingCanvas" xmlns:cx="http://schemas.microsoft.com/office/drawing/2014/chartex" xmlns:cx1="http://schemas.microsoft.com/office/drawing/2015/9/8/chartex" xmlns:cx2="http://schemas.microsoft.com/office/drawing/2015/10/21/chartex" xmlns:cx3="http://schemas.microsoft.com/office/drawing/2016/5/9/chartex" xmlns:cx4="http://schemas.microsoft.com/office/drawing/2016/5/10/chartex" xmlns:cx5="http://schemas.microsoft.com/office/drawing/2016/5/11/chartex" xmlns:cx6="http://schemas.microsoft.com/office/drawing/2016/5/12/chartex" xmlns:cx7="http://schemas.microsoft.com/office/drawing/2016/5/13/chartex" xmlns:cx8="http://schemas.microsoft.com/office/drawing/2016/5/14/chartex" xmlns:mc="http://schemas.openxmlformats.org/markup-compatibility/2006" xmlns:aink="http://schemas.microsoft.com/office/drawing/2016/ink" xmlns:am3d="http://schemas.microsoft.com/office/drawing/2017/model3d" xmlns:o="urn:schemas-microsoft-com:office:office" xmlns:oel="http://schemas.microsoft.com/office/2019/extlst" xmlns:r="http://schemas.openxmlformats.org/officeDocument/2006/relationships" xmlns:m="http://schemas.openxmlformats.org/officeDocument/2006/math" xmlns:v="urn:schemas-microsoft-com:vml" xmlns:wp14="http://schemas.microsoft.com/office/word/2010/wordprocessingDrawing" xmlns:wp="http://schemas.openxmlformats.org/drawingml/2006/wordprocessingDrawing" xmlns:w10="urn:schemas-microsoft-com:office:word" xmlns:w="http://schemas.openxmlformats.org/wordprocessingml/2006/main" xmlns:w14="http://schemas.microsoft.com/office/word/2010/wordml" xmlns:w15="http://schemas.microsoft.com/office/word/2012/wordml" xmlns:w16cex="http://schemas.microsoft.com/office/word/2018/wordml/cex" xmlns:w16cid="http://schemas.microsoft.com/office/word/2016/wordml/cid" xmlns:w16="http://schemas.microsoft.com/office/word/2018/wordml" xmlns:w16du="http://schemas.microsoft.com/office/word/2023/wordml/word16du" xmlns:w16sdtdh="http://schemas.microsoft.com/office/word/2020/wordml/sdtdatahash" xmlns:w16sdtfl="http://schemas.microsoft.com/office/word/2024/wordml/sdtformatlock" xmlns:w16se="http://schemas.microsoft.com/office/word/2015/wordml/symex" xmlns:wpg="http://schemas.microsoft.com/office/word/2010/wordprocessingGroup" xmlns:wpi="http://schemas.microsoft.com/office/word/2010/wordprocessingInk" xmlns:wne="http://schemas.microsoft.com/office/word/2006/wordml" xmlns:wps="http://schemas.microsoft.com/office/word/2010/wordprocessingShape" mc:Ignorable="w14 w15 w16se w16cid w16 w16cex w16sdtdh w16sdtfl w16du wp14">
+  <w:footnote w:type="separator" w:id="-1">
+    <w:p>
+      <w:pPr>
+        <w:spacing w:after="0" w:line="240" w:lineRule="auto"/>
+      </w:pPr>
+      <w:r>
+        <w:separator/>
+      </w:r>
+    </w:p>
+  </w:footnote>
+  <w:footnote w:type="continuationSeparator" w:id="0">
+    <w:p>
+      <w:pPr>
+        <w:spacing w:after="0" w:line="240" w:lineRule="auto"/>
+      </w:pPr>
+      <w:r>
+        <w:continuationSeparator/>
+      </w:r>
+    </w:p>
+  </w:footnote>
+</w:footnotes>
+</file>
+
 <file path=word/numbering.xml><?xml version="1.0" encoding="utf-8"?>
 <w:numbering xmlns:wpc="http://schemas.microsoft.com/office/word/2010/wordprocessingCanvas" xmlns:cx="http://schemas.microsoft.com/office/drawing/2014/chartex" xmlns:cx1="http://schemas.microsoft.com/office/drawing/2015/9/8/chartex" xmlns:cx2="http://schemas.microsoft.com/office/drawing/2015/10/21/chartex" xmlns:cx3="http://schemas.microsoft.com/office/drawing/2016/5/9/chartex" xmlns:cx4="http://schemas.microsoft.com/office/drawing/2016/5/10/chartex" xmlns:cx5="http://schemas.microsoft.com/office/drawing/2016/5/11/chartex" xmlns:cx6="http://schemas.microsoft.com/office/drawing/2016/5/12/chartex" xmlns:cx7="http://schemas.microsoft.com/office/drawing/2016/5/13/chartex" xmlns:cx8="http://schemas.microsoft.com/office/drawing/2016/5/14/chartex" xmlns:mc="http://schemas.openxmlformats.org/markup-compatibility/2006" xmlns:aink="http://schemas.microsoft.com/office/drawing/2016/ink" xmlns:am3d="http://schemas.microsoft.com/office/drawing/2017/model3d" xmlns:o="urn:schemas-microsoft-com:office:office" xmlns:oel="http://schemas.microsoft.com/office/2019/extlst" xmlns:r="http://schemas.openxmlformats.org/officeDocument/2006/relationships" xmlns:m="http://schemas.openxmlformats.org/officeDocument/2006/math" xmlns:v="urn:schemas-microsoft-com:vml" xmlns:wp14="http://schemas.microsoft.com/office/word/2010/wordprocessingDrawing" xmlns:wp="http://schemas.openxmlformats.org/drawingml/2006/wordprocessingDrawing" xmlns:w10="urn:schemas-microsoft-com:office:word" xmlns:w="http://schemas.openxmlformats.org/wordprocessingml/2006/main" xmlns:w14="http://schemas.microsoft.com/office/word/2010/wordml" xmlns:w15="http://schemas.microsoft.com/office/word/2012/wordml" xmlns:w16cex="http://schemas.microsoft.com/office/word/2018/wordml/cex" xmlns:w16cid="http://schemas.microsoft.com/office/word/2016/wordml/cid" xmlns:w16="http://schemas.microsoft.com/office/word/2018/wordml" xmlns:w16du="http://schemas.microsoft.com/office/word/2023/wordml/word16du" xmlns:w16sdtdh="http://schemas.microsoft.com/office/word/2020/wordml/sdtdatahash" xmlns:w16sdtfl="http://schemas.microsoft.com/office/word/2024/wordml/sdtformatlock" xmlns:w16se="http://schemas.microsoft.com/office/word/2015/wordml/symex" xmlns:wpg="http://schemas.microsoft.com/office/word/2010/wordprocessingGroup" xmlns:wpi="http://schemas.microsoft.com/office/word/2010/wordprocessingInk" xmlns:wne="http://schemas.microsoft.com/office/word/2006/wordml" xmlns:wps="http://schemas.microsoft.com/office/word/2010/wordprocessingShape" mc:Ignorable="w14 w15 w16se w16cid w16 w16cex w16sdtdh w16sdtfl w16du wp14">
   <w:abstractNum w:abstractNumId="0" w15:restartNumberingAfterBreak="0">
+    <w:nsid w:val="1A9F7669"/>
+    <w:multiLevelType w:val="hybridMultilevel"/>
+    <w:tmpl w:val="59DE096C"/>
+    <w:lvl w:ilvl="0" w:tplc="B04E4B5C">
+      <w:start w:val="1"/>
+      <w:numFmt w:val="decimal"/>
+      <w:lvlText w:val="%1-"/>
+      <w:lvlJc w:val="left"/>
+      <w:pPr>
+        <w:ind w:left="1800" w:hanging="360"/>
+      </w:pPr>
+      <w:rPr>
+        <w:rFonts w:hint="default"/>
+      </w:rPr>
+    </w:lvl>
+    <w:lvl w:ilvl="1" w:tplc="04090019" w:tentative="1">
+      <w:start w:val="1"/>
+      <w:numFmt w:val="lowerLetter"/>
+      <w:lvlText w:val="%2."/>
+      <w:lvlJc w:val="left"/>
+      <w:pPr>
+        <w:ind w:left="2520" w:hanging="360"/>
+      </w:pPr>
+    </w:lvl>
+    <w:lvl w:ilvl="2" w:tplc="0409001B" w:tentative="1">
+      <w:start w:val="1"/>
+      <w:numFmt w:val="lowerRoman"/>
+      <w:lvlText w:val="%3."/>
+      <w:lvlJc w:val="right"/>
+      <w:pPr>
+        <w:ind w:left="3240" w:hanging="180"/>
+      </w:pPr>
+    </w:lvl>
+    <w:lvl w:ilvl="3" w:tplc="0409000F" w:tentative="1">
+      <w:start w:val="1"/>
+      <w:numFmt w:val="decimal"/>
+      <w:lvlText w:val="%4."/>
+      <w:lvlJc w:val="left"/>
+      <w:pPr>
+        <w:ind w:left="3960" w:hanging="360"/>
+      </w:pPr>
+    </w:lvl>
+    <w:lvl w:ilvl="4" w:tplc="04090019" w:tentative="1">
+      <w:start w:val="1"/>
+      <w:numFmt w:val="lowerLetter"/>
+      <w:lvlText w:val="%5."/>
+      <w:lvlJc w:val="left"/>
+      <w:pPr>
+        <w:ind w:left="4680" w:hanging="360"/>
+      </w:pPr>
+    </w:lvl>
+    <w:lvl w:ilvl="5" w:tplc="0409001B" w:tentative="1">
+      <w:start w:val="1"/>
+      <w:numFmt w:val="lowerRoman"/>
+      <w:lvlText w:val="%6."/>
+      <w:lvlJc w:val="right"/>
+      <w:pPr>
+        <w:ind w:left="5400" w:hanging="180"/>
+      </w:pPr>
+    </w:lvl>
+    <w:lvl w:ilvl="6" w:tplc="0409000F" w:tentative="1">
+      <w:start w:val="1"/>
+      <w:numFmt w:val="decimal"/>
+      <w:lvlText w:val="%7."/>
+      <w:lvlJc w:val="left"/>
+      <w:pPr>
+        <w:ind w:left="6120" w:hanging="360"/>
+      </w:pPr>
+    </w:lvl>
+    <w:lvl w:ilvl="7" w:tplc="04090019" w:tentative="1">
+      <w:start w:val="1"/>
+      <w:numFmt w:val="lowerLetter"/>
+      <w:lvlText w:val="%8."/>
+      <w:lvlJc w:val="left"/>
+      <w:pPr>
+        <w:ind w:left="6840" w:hanging="360"/>
+      </w:pPr>
+    </w:lvl>
+    <w:lvl w:ilvl="8" w:tplc="0409001B" w:tentative="1">
+      <w:start w:val="1"/>
+      <w:numFmt w:val="lowerRoman"/>
+      <w:lvlText w:val="%9."/>
+      <w:lvlJc w:val="right"/>
+      <w:pPr>
+        <w:ind w:left="7560" w:hanging="180"/>
+      </w:pPr>
+    </w:lvl>
+  </w:abstractNum>
+  <w:abstractNum w:abstractNumId="1" w15:restartNumberingAfterBreak="0">
     <w:nsid w:val="2389681D"/>
     <w:multiLevelType w:val="hybridMultilevel"/>
     <w:tmpl w:val="6A107952"/>
@@ -4922,7 +6485,7 @@
       </w:pPr>
     </w:lvl>
   </w:abstractNum>
-  <w:abstractNum w:abstractNumId="1" w15:restartNumberingAfterBreak="0">
+  <w:abstractNum w:abstractNumId="2" w15:restartNumberingAfterBreak="0">
     <w:nsid w:val="23AF3485"/>
     <w:multiLevelType w:val="hybridMultilevel"/>
     <w:tmpl w:val="B31A9BA2"/>
@@ -5011,7 +6574,7 @@
       </w:pPr>
     </w:lvl>
   </w:abstractNum>
-  <w:abstractNum w:abstractNumId="2" w15:restartNumberingAfterBreak="0">
+  <w:abstractNum w:abstractNumId="3" w15:restartNumberingAfterBreak="0">
     <w:nsid w:val="36FA606A"/>
     <w:multiLevelType w:val="hybridMultilevel"/>
     <w:tmpl w:val="36E0B5FE"/>
@@ -5100,7 +6663,7 @@
       </w:pPr>
     </w:lvl>
   </w:abstractNum>
-  <w:abstractNum w:abstractNumId="3" w15:restartNumberingAfterBreak="0">
+  <w:abstractNum w:abstractNumId="4" w15:restartNumberingAfterBreak="0">
     <w:nsid w:val="4BDB49DB"/>
     <w:multiLevelType w:val="hybridMultilevel"/>
     <w:tmpl w:val="7A160A20"/>
@@ -5189,7 +6752,7 @@
       </w:pPr>
     </w:lvl>
   </w:abstractNum>
-  <w:abstractNum w:abstractNumId="4" w15:restartNumberingAfterBreak="0">
+  <w:abstractNum w:abstractNumId="5" w15:restartNumberingAfterBreak="0">
     <w:nsid w:val="5C503B3F"/>
     <w:multiLevelType w:val="hybridMultilevel"/>
     <w:tmpl w:val="140EBFD0"/>
@@ -5278,7 +6841,96 @@
       </w:pPr>
     </w:lvl>
   </w:abstractNum>
-  <w:abstractNum w:abstractNumId="5" w15:restartNumberingAfterBreak="0">
+  <w:abstractNum w:abstractNumId="6" w15:restartNumberingAfterBreak="0">
+    <w:nsid w:val="62B87EED"/>
+    <w:multiLevelType w:val="hybridMultilevel"/>
+    <w:tmpl w:val="AC52332E"/>
+    <w:lvl w:ilvl="0" w:tplc="086A2BE8">
+      <w:start w:val="1"/>
+      <w:numFmt w:val="decimal"/>
+      <w:lvlText w:val="%1-"/>
+      <w:lvlJc w:val="left"/>
+      <w:pPr>
+        <w:ind w:left="1800" w:hanging="360"/>
+      </w:pPr>
+      <w:rPr>
+        <w:rFonts w:hint="default"/>
+      </w:rPr>
+    </w:lvl>
+    <w:lvl w:ilvl="1" w:tplc="04090019" w:tentative="1">
+      <w:start w:val="1"/>
+      <w:numFmt w:val="lowerLetter"/>
+      <w:lvlText w:val="%2."/>
+      <w:lvlJc w:val="left"/>
+      <w:pPr>
+        <w:ind w:left="2520" w:hanging="360"/>
+      </w:pPr>
+    </w:lvl>
+    <w:lvl w:ilvl="2" w:tplc="0409001B" w:tentative="1">
+      <w:start w:val="1"/>
+      <w:numFmt w:val="lowerRoman"/>
+      <w:lvlText w:val="%3."/>
+      <w:lvlJc w:val="right"/>
+      <w:pPr>
+        <w:ind w:left="3240" w:hanging="180"/>
+      </w:pPr>
+    </w:lvl>
+    <w:lvl w:ilvl="3" w:tplc="0409000F" w:tentative="1">
+      <w:start w:val="1"/>
+      <w:numFmt w:val="decimal"/>
+      <w:lvlText w:val="%4."/>
+      <w:lvlJc w:val="left"/>
+      <w:pPr>
+        <w:ind w:left="3960" w:hanging="360"/>
+      </w:pPr>
+    </w:lvl>
+    <w:lvl w:ilvl="4" w:tplc="04090019" w:tentative="1">
+      <w:start w:val="1"/>
+      <w:numFmt w:val="lowerLetter"/>
+      <w:lvlText w:val="%5."/>
+      <w:lvlJc w:val="left"/>
+      <w:pPr>
+        <w:ind w:left="4680" w:hanging="360"/>
+      </w:pPr>
+    </w:lvl>
+    <w:lvl w:ilvl="5" w:tplc="0409001B" w:tentative="1">
+      <w:start w:val="1"/>
+      <w:numFmt w:val="lowerRoman"/>
+      <w:lvlText w:val="%6."/>
+      <w:lvlJc w:val="right"/>
+      <w:pPr>
+        <w:ind w:left="5400" w:hanging="180"/>
+      </w:pPr>
+    </w:lvl>
+    <w:lvl w:ilvl="6" w:tplc="0409000F" w:tentative="1">
+      <w:start w:val="1"/>
+      <w:numFmt w:val="decimal"/>
+      <w:lvlText w:val="%7."/>
+      <w:lvlJc w:val="left"/>
+      <w:pPr>
+        <w:ind w:left="6120" w:hanging="360"/>
+      </w:pPr>
+    </w:lvl>
+    <w:lvl w:ilvl="7" w:tplc="04090019" w:tentative="1">
+      <w:start w:val="1"/>
+      <w:numFmt w:val="lowerLetter"/>
+      <w:lvlText w:val="%8."/>
+      <w:lvlJc w:val="left"/>
+      <w:pPr>
+        <w:ind w:left="6840" w:hanging="360"/>
+      </w:pPr>
+    </w:lvl>
+    <w:lvl w:ilvl="8" w:tplc="0409001B" w:tentative="1">
+      <w:start w:val="1"/>
+      <w:numFmt w:val="lowerRoman"/>
+      <w:lvlText w:val="%9."/>
+      <w:lvlJc w:val="right"/>
+      <w:pPr>
+        <w:ind w:left="7560" w:hanging="180"/>
+      </w:pPr>
+    </w:lvl>
+  </w:abstractNum>
+  <w:abstractNum w:abstractNumId="7" w15:restartNumberingAfterBreak="0">
     <w:nsid w:val="7654400F"/>
     <w:multiLevelType w:val="hybridMultilevel"/>
     <w:tmpl w:val="4748F1C0"/>
@@ -5367,7 +7019,95 @@
       </w:pPr>
     </w:lvl>
   </w:abstractNum>
-  <w:abstractNum w:abstractNumId="6" w15:restartNumberingAfterBreak="0">
+  <w:abstractNum w:abstractNumId="8" w15:restartNumberingAfterBreak="0">
+    <w:nsid w:val="770B26B5"/>
+    <w:multiLevelType w:val="hybridMultilevel"/>
+    <w:tmpl w:val="4A063EF4"/>
+    <w:lvl w:ilvl="0" w:tplc="16F62DDA">
+      <w:numFmt w:val="decimal"/>
+      <w:lvlText w:val="%1-"/>
+      <w:lvlJc w:val="left"/>
+      <w:pPr>
+        <w:ind w:left="1800" w:hanging="360"/>
+      </w:pPr>
+      <w:rPr>
+        <w:rFonts w:hint="default"/>
+      </w:rPr>
+    </w:lvl>
+    <w:lvl w:ilvl="1" w:tplc="04090019" w:tentative="1">
+      <w:start w:val="1"/>
+      <w:numFmt w:val="lowerLetter"/>
+      <w:lvlText w:val="%2."/>
+      <w:lvlJc w:val="left"/>
+      <w:pPr>
+        <w:ind w:left="2520" w:hanging="360"/>
+      </w:pPr>
+    </w:lvl>
+    <w:lvl w:ilvl="2" w:tplc="0409001B" w:tentative="1">
+      <w:start w:val="1"/>
+      <w:numFmt w:val="lowerRoman"/>
+      <w:lvlText w:val="%3."/>
+      <w:lvlJc w:val="right"/>
+      <w:pPr>
+        <w:ind w:left="3240" w:hanging="180"/>
+      </w:pPr>
+    </w:lvl>
+    <w:lvl w:ilvl="3" w:tplc="0409000F" w:tentative="1">
+      <w:start w:val="1"/>
+      <w:numFmt w:val="decimal"/>
+      <w:lvlText w:val="%4."/>
+      <w:lvlJc w:val="left"/>
+      <w:pPr>
+        <w:ind w:left="3960" w:hanging="360"/>
+      </w:pPr>
+    </w:lvl>
+    <w:lvl w:ilvl="4" w:tplc="04090019" w:tentative="1">
+      <w:start w:val="1"/>
+      <w:numFmt w:val="lowerLetter"/>
+      <w:lvlText w:val="%5."/>
+      <w:lvlJc w:val="left"/>
+      <w:pPr>
+        <w:ind w:left="4680" w:hanging="360"/>
+      </w:pPr>
+    </w:lvl>
+    <w:lvl w:ilvl="5" w:tplc="0409001B" w:tentative="1">
+      <w:start w:val="1"/>
+      <w:numFmt w:val="lowerRoman"/>
+      <w:lvlText w:val="%6."/>
+      <w:lvlJc w:val="right"/>
+      <w:pPr>
+        <w:ind w:left="5400" w:hanging="180"/>
+      </w:pPr>
+    </w:lvl>
+    <w:lvl w:ilvl="6" w:tplc="0409000F" w:tentative="1">
+      <w:start w:val="1"/>
+      <w:numFmt w:val="decimal"/>
+      <w:lvlText w:val="%7."/>
+      <w:lvlJc w:val="left"/>
+      <w:pPr>
+        <w:ind w:left="6120" w:hanging="360"/>
+      </w:pPr>
+    </w:lvl>
+    <w:lvl w:ilvl="7" w:tplc="04090019" w:tentative="1">
+      <w:start w:val="1"/>
+      <w:numFmt w:val="lowerLetter"/>
+      <w:lvlText w:val="%8."/>
+      <w:lvlJc w:val="left"/>
+      <w:pPr>
+        <w:ind w:left="6840" w:hanging="360"/>
+      </w:pPr>
+    </w:lvl>
+    <w:lvl w:ilvl="8" w:tplc="0409001B" w:tentative="1">
+      <w:start w:val="1"/>
+      <w:numFmt w:val="lowerRoman"/>
+      <w:lvlText w:val="%9."/>
+      <w:lvlJc w:val="right"/>
+      <w:pPr>
+        <w:ind w:left="7560" w:hanging="180"/>
+      </w:pPr>
+    </w:lvl>
+  </w:abstractNum>
+  <w:abstractNum w:abstractNumId="9" w15:restartNumberingAfterBreak="0">
     <w:nsid w:val="77C505ED"/>
     <w:multiLevelType w:val="hybridMultilevel"/>
     <w:tmpl w:val="9D847BBC"/>
@@ -5479,26 +7219,127 @@
       </w:rPr>
     </w:lvl>
   </w:abstractNum>
+  <w:abstractNum w:abstractNumId="10" w15:restartNumberingAfterBreak="0">
+    <w:nsid w:val="7DAB4B0D"/>
+    <w:multiLevelType w:val="hybridMultilevel"/>
+    <w:tmpl w:val="6CB0FEDE"/>
+    <w:lvl w:ilvl="0" w:tplc="C6148D70">
+      <w:start w:val="1"/>
+      <w:numFmt w:val="decimal"/>
+      <w:lvlText w:val="%1-"/>
+      <w:lvlJc w:val="left"/>
+      <w:pPr>
+        <w:ind w:left="1800" w:hanging="360"/>
+      </w:pPr>
+      <w:rPr>
+        <w:rFonts w:hint="default"/>
+      </w:rPr>
+    </w:lvl>
+    <w:lvl w:ilvl="1" w:tplc="04090019">
+      <w:start w:val="1"/>
+      <w:numFmt w:val="lowerLetter"/>
+      <w:lvlText w:val="%2."/>
+      <w:lvlJc w:val="left"/>
+      <w:pPr>
+        <w:ind w:left="2520" w:hanging="360"/>
+      </w:pPr>
+    </w:lvl>
+    <w:lvl w:ilvl="2" w:tplc="0409001B" w:tentative="1">
+      <w:start w:val="1"/>
+      <w:numFmt w:val="lowerRoman"/>
+      <w:lvlText w:val="%3."/>
+      <w:lvlJc w:val="right"/>
+      <w:pPr>
+        <w:ind w:left="3240" w:hanging="180"/>
+      </w:pPr>
+    </w:lvl>
+    <w:lvl w:ilvl="3" w:tplc="0409000F" w:tentative="1">
+      <w:start w:val="1"/>
+      <w:numFmt w:val="decimal"/>
+      <w:lvlText w:val="%4."/>
+      <w:lvlJc w:val="left"/>
+      <w:pPr>
+        <w:ind w:left="3960" w:hanging="360"/>
+      </w:pPr>
+    </w:lvl>
+    <w:lvl w:ilvl="4" w:tplc="04090019" w:tentative="1">
+      <w:start w:val="1"/>
+      <w:numFmt w:val="lowerLetter"/>
+      <w:lvlText w:val="%5."/>
+      <w:lvlJc w:val="left"/>
+      <w:pPr>
+        <w:ind w:left="4680" w:hanging="360"/>
+      </w:pPr>
+    </w:lvl>
+    <w:lvl w:ilvl="5" w:tplc="0409001B" w:tentative="1">
+      <w:start w:val="1"/>
+      <w:numFmt w:val="lowerRoman"/>
+      <w:lvlText w:val="%6."/>
+      <w:lvlJc w:val="right"/>
+      <w:pPr>
+        <w:ind w:left="5400" w:hanging="180"/>
+      </w:pPr>
+    </w:lvl>
+    <w:lvl w:ilvl="6" w:tplc="0409000F" w:tentative="1">
+      <w:start w:val="1"/>
+      <w:numFmt w:val="decimal"/>
+      <w:lvlText w:val="%7."/>
+      <w:lvlJc w:val="left"/>
+      <w:pPr>
+        <w:ind w:left="6120" w:hanging="360"/>
+      </w:pPr>
+    </w:lvl>
+    <w:lvl w:ilvl="7" w:tplc="04090019" w:tentative="1">
+      <w:start w:val="1"/>
+      <w:numFmt w:val="lowerLetter"/>
+      <w:lvlText w:val="%8."/>
+      <w:lvlJc w:val="left"/>
+      <w:pPr>
+        <w:ind w:left="6840" w:hanging="360"/>
+      </w:pPr>
+    </w:lvl>
+    <w:lvl w:ilvl="8" w:tplc="0409001B" w:tentative="1">
+      <w:start w:val="1"/>
+      <w:numFmt w:val="lowerRoman"/>
+      <w:lvlText w:val="%9."/>
+      <w:lvlJc w:val="right"/>
+      <w:pPr>
+        <w:ind w:left="7560" w:hanging="180"/>
+      </w:pPr>
+    </w:lvl>
+  </w:abstractNum>
   <w:num w:numId="1" w16cid:durableId="1678195520">
-    <w:abstractNumId w:val="0"/>
+    <w:abstractNumId w:val="1"/>
   </w:num>
   <w:num w:numId="2" w16cid:durableId="1077285924">
+    <w:abstractNumId w:val="9"/>
+  </w:num>
+  <w:num w:numId="3" w16cid:durableId="756291988">
+    <w:abstractNumId w:val="4"/>
+  </w:num>
+  <w:num w:numId="4" w16cid:durableId="1821463091">
+    <w:abstractNumId w:val="7"/>
+  </w:num>
+  <w:num w:numId="5" w16cid:durableId="959337977">
+    <w:abstractNumId w:val="2"/>
+  </w:num>
+  <w:num w:numId="6" w16cid:durableId="2035501572">
+    <w:abstractNumId w:val="3"/>
+  </w:num>
+  <w:num w:numId="7" w16cid:durableId="926304486">
+    <w:abstractNumId w:val="5"/>
+  </w:num>
+  <w:num w:numId="8" w16cid:durableId="1789278551">
     <w:abstractNumId w:val="6"/>
   </w:num>
-  <w:num w:numId="3" w16cid:durableId="756291988">
-    <w:abstractNumId w:val="3"/>
+  <w:num w:numId="9" w16cid:durableId="1622150951">
+    <w:abstractNumId w:val="8"/>
   </w:num>
-  <w:num w:numId="4" w16cid:durableId="1821463091">
-    <w:abstractNumId w:val="5"/>
+  <w:num w:numId="10" w16cid:durableId="1038706547">
+    <w:abstractNumId w:val="10"/>
   </w:num>
-  <w:num w:numId="5" w16cid:durableId="959337977">
-    <w:abstractNumId w:val="1"/>
-  </w:num>
-  <w:num w:numId="6" w16cid:durableId="2035501572">
-    <w:abstractNumId w:val="2"/>
-  </w:num>
-  <w:num w:numId="7" w16cid:durableId="926304486">
-    <w:abstractNumId w:val="4"/>
+  <w:num w:numId="11" w16cid:durableId="266891760">
+    <w:abstractNumId w:val="0"/>
   </w:num>
 </w:numbering>
 </file>
@@ -6519,6 +8360,50 @@
       <w:szCs w:val="18"/>
     </w:rPr>
   </w:style>
+  <w:style w:type="paragraph" w:styleId="Header">
+    <w:name w:val="header"/>
+    <w:basedOn w:val="Normal"/>
+    <w:link w:val="HeaderChar"/>
+    <w:uiPriority w:val="99"/>
+    <w:unhideWhenUsed/>
+    <w:rsid w:val="00786EDD"/>
+    <w:pPr>
+      <w:tabs>
+        <w:tab w:val="center" w:pos="4703"/>
+        <w:tab w:val="right" w:pos="9406"/>
+      </w:tabs>
+      <w:spacing w:after="0" w:line="240" w:lineRule="auto"/>
+    </w:pPr>
+  </w:style>
+  <w:style w:type="character" w:customStyle="1" w:styleId="HeaderChar">
+    <w:name w:val="Header Char"/>
+    <w:basedOn w:val="DefaultParagraphFont"/>
+    <w:link w:val="Header"/>
+    <w:uiPriority w:val="99"/>
+    <w:rsid w:val="00786EDD"/>
+  </w:style>
+  <w:style w:type="paragraph" w:styleId="Footer">
+    <w:name w:val="footer"/>
+    <w:basedOn w:val="Normal"/>
+    <w:link w:val="FooterChar"/>
+    <w:uiPriority w:val="99"/>
+    <w:unhideWhenUsed/>
+    <w:rsid w:val="00786EDD"/>
+    <w:pPr>
+      <w:tabs>
+        <w:tab w:val="center" w:pos="4703"/>
+        <w:tab w:val="right" w:pos="9406"/>
+      </w:tabs>
+      <w:spacing w:after="0" w:line="240" w:lineRule="auto"/>
+    </w:pPr>
+  </w:style>
+  <w:style w:type="character" w:customStyle="1" w:styleId="FooterChar">
+    <w:name w:val="Footer Char"/>
+    <w:basedOn w:val="DefaultParagraphFont"/>
+    <w:link w:val="Footer"/>
+    <w:uiPriority w:val="99"/>
+    <w:rsid w:val="00786EDD"/>
+  </w:style>
 </w:styles>
 </file>
 

</xml_diff>